<commit_message>
nmv 10 07 2026
</commit_message>
<xml_diff>
--- a/TS Jatai Ghanam Project/TS 2.3/TS 2.3 Ghanam Malayalam Corrections.docx
+++ b/TS Jatai Ghanam Project/TS 2.3/TS 2.3 Ghanam Malayalam Corrections.docx
@@ -1,7 +1,2887 @@
 
 <file path=word/document.xml><?xml version="1.0" encoding="utf-8"?>
-<w:document xmlns:wpc="http://schemas.microsoft.com/office/word/2010/wordprocessingCanvas" xmlns:cx="http://schemas.microsoft.com/office/drawing/2014/chartex" xmlns:cx1="http://schemas.microsoft.com/office/drawing/2015/9/8/chartex" xmlns:cx2="http://schemas.microsoft.com/office/drawing/2015/10/21/chartex" xmlns:cx3="http://schemas.microsoft.com/office/drawing/2016/5/9/chartex" xmlns:cx4="http://schemas.microsoft.com/office/drawing/2016/5/10/chartex" xmlns:cx5="http://schemas.microsoft.com/office/drawing/2016/5/11/chartex" xmlns:cx6="http://schemas.microsoft.com/office/drawing/2016/5/12/chartex" xmlns:cx7="http://schemas.microsoft.com/office/drawing/2016/5/13/chartex" xmlns:cx8="http://schemas.microsoft.com/office/drawing/2016/5/14/chartex" xmlns:mc="http://schemas.openxmlformats.org/markup-compatibility/2006" xmlns:aink="http://schemas.microsoft.com/office/drawing/2016/ink" xmlns:am3d="http://schemas.microsoft.com/office/drawing/2017/model3d" xmlns:o="urn:schemas-microsoft-com:office:office" xmlns:oel="http://schemas.microsoft.com/office/2019/extlst" xmlns:r="http://schemas.openxmlformats.org/officeDocument/2006/relationships" xmlns:m="http://schemas.openxmlformats.org/officeDocument/2006/math" xmlns:v="urn:schemas-microsoft-com:vml" xmlns:wp14="http://schemas.microsoft.com/office/word/2010/wordprocessingDrawing" xmlns:wp="http://schemas.openxmlformats.org/drawingml/2006/wordprocessingDrawing" xmlns:w10="urn:schemas-microsoft-com:office:word" xmlns:w="http://schemas.openxmlformats.org/wordprocessingml/2006/main" xmlns:w14="http://schemas.microsoft.com/office/word/2010/wordml" xmlns:w15="http://schemas.microsoft.com/office/word/2012/wordml" xmlns:w16cex="http://schemas.microsoft.com/office/word/2018/wordml/cex" xmlns:w16cid="http://schemas.microsoft.com/office/word/2016/wordml/cid" xmlns:w16="http://schemas.microsoft.com/office/word/2018/wordml" xmlns:w16sdtdh="http://schemas.microsoft.com/office/word/2020/wordml/sdtdatahash" xmlns:w16se="http://schemas.microsoft.com/office/word/2015/wordml/symex" xmlns:wpg="http://schemas.microsoft.com/office/word/2010/wordprocessingGroup" xmlns:wpi="http://schemas.microsoft.com/office/word/2010/wordprocessingInk" xmlns:wne="http://schemas.microsoft.com/office/word/2006/wordml" xmlns:wps="http://schemas.microsoft.com/office/word/2010/wordprocessingShape" mc:Ignorable="w14 w15 w16se w16cid w16 w16cex w16sdtdh wp14">
+<w:document xmlns:wpc="http://schemas.microsoft.com/office/word/2010/wordprocessingCanvas" xmlns:cx="http://schemas.microsoft.com/office/drawing/2014/chartex" xmlns:cx1="http://schemas.microsoft.com/office/drawing/2015/9/8/chartex" xmlns:cx2="http://schemas.microsoft.com/office/drawing/2015/10/21/chartex" xmlns:cx3="http://schemas.microsoft.com/office/drawing/2016/5/9/chartex" xmlns:cx4="http://schemas.microsoft.com/office/drawing/2016/5/10/chartex" xmlns:cx5="http://schemas.microsoft.com/office/drawing/2016/5/11/chartex" xmlns:cx6="http://schemas.microsoft.com/office/drawing/2016/5/12/chartex" xmlns:cx7="http://schemas.microsoft.com/office/drawing/2016/5/13/chartex" xmlns:cx8="http://schemas.microsoft.com/office/drawing/2016/5/14/chartex" xmlns:mc="http://schemas.openxmlformats.org/markup-compatibility/2006" xmlns:aink="http://schemas.microsoft.com/office/drawing/2016/ink" xmlns:am3d="http://schemas.microsoft.com/office/drawing/2017/model3d" xmlns:o="urn:schemas-microsoft-com:office:office" xmlns:oel="http://schemas.microsoft.com/office/2019/extlst" xmlns:r="http://schemas.openxmlformats.org/officeDocument/2006/relationships" xmlns:m="http://schemas.openxmlformats.org/officeDocument/2006/math" xmlns:v="urn:schemas-microsoft-com:vml" xmlns:wp14="http://schemas.microsoft.com/office/word/2010/wordprocessingDrawing" xmlns:wp="http://schemas.openxmlformats.org/drawingml/2006/wordprocessingDrawing" xmlns:w10="urn:schemas-microsoft-com:office:word" xmlns:w="http://schemas.openxmlformats.org/wordprocessingml/2006/main" xmlns:w14="http://schemas.microsoft.com/office/word/2010/wordml" xmlns:w15="http://schemas.microsoft.com/office/word/2012/wordml" xmlns:w16cex="http://schemas.microsoft.com/office/word/2018/wordml/cex" xmlns:w16cid="http://schemas.microsoft.com/office/word/2016/wordml/cid" xmlns:w16="http://schemas.microsoft.com/office/word/2018/wordml" xmlns:w16du="http://schemas.microsoft.com/office/word/2023/wordml/word16du" xmlns:w16sdtdh="http://schemas.microsoft.com/office/word/2020/wordml/sdtdatahash" xmlns:w16sdtfl="http://schemas.microsoft.com/office/word/2024/wordml/sdtformatlock" xmlns:w16se="http://schemas.microsoft.com/office/word/2015/wordml/symex" xmlns:wpg="http://schemas.microsoft.com/office/word/2010/wordprocessingGroup" xmlns:wpi="http://schemas.microsoft.com/office/word/2010/wordprocessingInk" xmlns:wne="http://schemas.microsoft.com/office/word/2006/wordml" xmlns:wps="http://schemas.microsoft.com/office/word/2010/wordprocessingShape" mc:Ignorable="w14 w15 w16se w16cid w16 w16cex w16sdtdh w16sdtfl w16du wp14">
   <w:body>
+    <w:p>
+      <w:pPr>
+        <w:spacing w:before="0" w:line="240" w:lineRule="auto"/>
+        <w:jc w:val="center"/>
+        <w:rPr>
+          <w:b/>
+          <w:bCs/>
+          <w:sz w:val="32"/>
+          <w:szCs w:val="32"/>
+          <w:u w:val="single"/>
+        </w:rPr>
+      </w:pPr>
+      <w:r>
+        <w:rPr>
+          <w:b/>
+          <w:bCs/>
+          <w:sz w:val="32"/>
+          <w:szCs w:val="32"/>
+          <w:u w:val="single"/>
+        </w:rPr>
+        <w:t xml:space="preserve">TS </w:t>
+      </w:r>
+      <w:r>
+        <w:rPr>
+          <w:b/>
+          <w:bCs/>
+          <w:sz w:val="32"/>
+          <w:szCs w:val="32"/>
+          <w:u w:val="single"/>
+        </w:rPr>
+        <w:t>Ghanam</w:t>
+      </w:r>
+      <w:r>
+        <w:rPr>
+          <w:b/>
+          <w:bCs/>
+          <w:sz w:val="32"/>
+          <w:szCs w:val="32"/>
+          <w:u w:val="single"/>
+        </w:rPr>
+        <w:t xml:space="preserve"> </w:t>
+      </w:r>
+      <w:r>
+        <w:rPr>
+          <w:b/>
+          <w:bCs/>
+          <w:sz w:val="32"/>
+          <w:szCs w:val="32"/>
+          <w:u w:val="single"/>
+        </w:rPr>
+        <w:t xml:space="preserve">– TS 2.3 Malayalam Corrections – Observed </w:t>
+      </w:r>
+      <w:proofErr w:type="gramStart"/>
+      <w:r>
+        <w:rPr>
+          <w:b/>
+          <w:bCs/>
+          <w:sz w:val="32"/>
+          <w:szCs w:val="32"/>
+          <w:u w:val="single"/>
+        </w:rPr>
+        <w:t xml:space="preserve">till </w:t>
+      </w:r>
+      <w:r>
+        <w:rPr>
+          <w:b/>
+          <w:bCs/>
+          <w:sz w:val="32"/>
+          <w:szCs w:val="32"/>
+          <w:highlight w:val="red"/>
+          <w:u w:val="single"/>
+        </w:rPr>
+        <w:t>?????</w:t>
+      </w:r>
+      <w:proofErr w:type="gramEnd"/>
+    </w:p>
+    <w:p>
+      <w:pPr>
+        <w:spacing w:before="0" w:line="240" w:lineRule="auto"/>
+        <w:jc w:val="center"/>
+        <w:rPr>
+          <w:b/>
+          <w:bCs/>
+          <w:sz w:val="28"/>
+          <w:szCs w:val="32"/>
+        </w:rPr>
+      </w:pPr>
+      <w:r>
+        <w:rPr>
+          <w:b/>
+          <w:bCs/>
+          <w:sz w:val="28"/>
+          <w:szCs w:val="32"/>
+        </w:rPr>
+        <w:t>(ignore those which are already incorporated in your book’s version and date)</w:t>
+      </w:r>
+    </w:p>
+    <w:tbl>
+      <w:tblPr>
+        <w:tblW w:w="14537" w:type="dxa"/>
+        <w:tblInd w:w="-792" w:type="dxa"/>
+        <w:tblBorders>
+          <w:top w:val="single" w:sz="4" w:space="0" w:color="000000"/>
+          <w:left w:val="single" w:sz="4" w:space="0" w:color="000000"/>
+          <w:bottom w:val="single" w:sz="4" w:space="0" w:color="000000"/>
+          <w:right w:val="single" w:sz="4" w:space="0" w:color="000000"/>
+          <w:insideH w:val="single" w:sz="4" w:space="0" w:color="000000"/>
+          <w:insideV w:val="single" w:sz="4" w:space="0" w:color="000000"/>
+        </w:tblBorders>
+        <w:tblLook w:val="04A0" w:firstRow="1" w:lastRow="0" w:firstColumn="1" w:lastColumn="0" w:noHBand="0" w:noVBand="1"/>
+      </w:tblPr>
+      <w:tblGrid>
+        <w:gridCol w:w="7166"/>
+        <w:gridCol w:w="7371"/>
+      </w:tblGrid>
+      <w:tr>
+        <w:tc>
+          <w:tcPr>
+            <w:tcW w:w="7166" w:type="dxa"/>
+          </w:tcPr>
+          <w:p>
+            <w:pPr>
+              <w:spacing w:before="0" w:line="240" w:lineRule="auto"/>
+              <w:jc w:val="center"/>
+              <w:rPr>
+                <w:b/>
+                <w:sz w:val="32"/>
+                <w:szCs w:val="32"/>
+              </w:rPr>
+            </w:pPr>
+            <w:r>
+              <w:rPr>
+                <w:b/>
+                <w:sz w:val="32"/>
+                <w:szCs w:val="32"/>
+              </w:rPr>
+              <w:t>As Printed</w:t>
+            </w:r>
+          </w:p>
+        </w:tc>
+        <w:tc>
+          <w:tcPr>
+            <w:tcW w:w="7371" w:type="dxa"/>
+          </w:tcPr>
+          <w:p>
+            <w:pPr>
+              <w:spacing w:before="0" w:line="240" w:lineRule="auto"/>
+              <w:ind w:right="-18"/>
+              <w:jc w:val="center"/>
+              <w:rPr>
+                <w:b/>
+                <w:sz w:val="32"/>
+                <w:szCs w:val="32"/>
+              </w:rPr>
+            </w:pPr>
+            <w:r>
+              <w:rPr>
+                <w:b/>
+                <w:sz w:val="32"/>
+                <w:szCs w:val="32"/>
+              </w:rPr>
+              <w:t>To be read as or corrected as</w:t>
+            </w:r>
+            <w:r>
+              <w:rPr>
+                <w:b/>
+                <w:sz w:val="32"/>
+                <w:szCs w:val="32"/>
+              </w:rPr>
+              <w:t xml:space="preserve"> </w:t>
+            </w:r>
+          </w:p>
+        </w:tc>
+      </w:tr>
+      <w:tr>
+        <w:trPr>
+          <w:trHeight w:val="4017"/>
+        </w:trPr>
+        <w:tc>
+          <w:tcPr>
+            <w:tcW w:w="7166" w:type="dxa"/>
+          </w:tcPr>
+          <w:p>
+            <w:pPr>
+              <w:widowControl w:val="0"/>
+              <w:autoSpaceDE w:val="0"/>
+              <w:autoSpaceDN w:val="0"/>
+              <w:adjustRightInd w:val="0"/>
+              <w:spacing w:before="0" w:line="240" w:lineRule="auto"/>
+              <w:rPr>
+                <w:rFonts w:ascii="BRH Malayalam Extra" w:hAnsi="BRH Malayalam Extra" w:cs="BRH Malayalam Extra"/>
+                <w:color w:val="000000"/>
+                <w:sz w:val="32"/>
+                <w:szCs w:val="40"/>
+              </w:rPr>
+            </w:pPr>
+            <w:r>
+              <w:rPr>
+                <w:rFonts w:cs="BRH Malayalam Extra"/>
+                <w:color w:val="000000"/>
+                <w:szCs w:val="40"/>
+              </w:rPr>
+              <w:t>64</w:t>
+            </w:r>
+            <w:r>
+              <w:rPr>
+                <w:rFonts w:ascii="BRH Malayalam Extra" w:hAnsi="BRH Malayalam Extra" w:cs="BRH Malayalam Extra"/>
+                <w:color w:val="000000"/>
+                <w:sz w:val="32"/>
+                <w:szCs w:val="40"/>
+              </w:rPr>
+              <w:t>)</w:t>
+            </w:r>
+            <w:r>
+              <w:rPr>
+                <w:rFonts w:ascii="BRH Malayalam Extra" w:hAnsi="BRH Malayalam Extra" w:cs="BRH Malayalam Extra"/>
+                <w:color w:val="000000"/>
+                <w:sz w:val="32"/>
+                <w:szCs w:val="40"/>
+              </w:rPr>
+              <w:tab/>
+            </w:r>
+            <w:r>
+              <w:rPr>
+                <w:rFonts w:cs="BRH Malayalam Extra"/>
+                <w:color w:val="000000"/>
+                <w:szCs w:val="40"/>
+              </w:rPr>
+              <w:t>2</w:t>
+            </w:r>
+            <w:r>
+              <w:rPr>
+                <w:rFonts w:ascii="BRH Malayalam Extra" w:hAnsi="BRH Malayalam Extra" w:cs="BRH Malayalam Extra"/>
+                <w:color w:val="000000"/>
+                <w:sz w:val="32"/>
+                <w:szCs w:val="40"/>
+              </w:rPr>
+              <w:t>.</w:t>
+            </w:r>
+            <w:r>
+              <w:rPr>
+                <w:rFonts w:cs="BRH Malayalam Extra"/>
+                <w:color w:val="000000"/>
+                <w:szCs w:val="40"/>
+              </w:rPr>
+              <w:t>3</w:t>
+            </w:r>
+            <w:r>
+              <w:rPr>
+                <w:rFonts w:ascii="BRH Malayalam Extra" w:hAnsi="BRH Malayalam Extra" w:cs="BRH Malayalam Extra"/>
+                <w:color w:val="000000"/>
+                <w:sz w:val="32"/>
+                <w:szCs w:val="40"/>
+              </w:rPr>
+              <w:t>.</w:t>
+            </w:r>
+            <w:r>
+              <w:rPr>
+                <w:rFonts w:cs="BRH Malayalam Extra"/>
+                <w:color w:val="000000"/>
+                <w:szCs w:val="40"/>
+              </w:rPr>
+              <w:t>12</w:t>
+            </w:r>
+            <w:r>
+              <w:rPr>
+                <w:rFonts w:ascii="BRH Malayalam Extra" w:hAnsi="BRH Malayalam Extra" w:cs="BRH Malayalam Extra"/>
+                <w:color w:val="000000"/>
+                <w:sz w:val="32"/>
+                <w:szCs w:val="40"/>
+              </w:rPr>
+              <w:t>.</w:t>
+            </w:r>
+            <w:r>
+              <w:rPr>
+                <w:rFonts w:cs="BRH Malayalam Extra"/>
+                <w:color w:val="000000"/>
+                <w:szCs w:val="40"/>
+              </w:rPr>
+              <w:t>2</w:t>
+            </w:r>
+            <w:r>
+              <w:rPr>
+                <w:rFonts w:ascii="BRH Malayalam Extra" w:hAnsi="BRH Malayalam Extra" w:cs="BRH Malayalam Extra"/>
+                <w:color w:val="000000"/>
+                <w:sz w:val="32"/>
+                <w:szCs w:val="40"/>
+              </w:rPr>
+              <w:t>(</w:t>
+            </w:r>
+            <w:r>
+              <w:rPr>
+                <w:rFonts w:cs="BRH Malayalam Extra"/>
+                <w:color w:val="000000"/>
+                <w:szCs w:val="40"/>
+              </w:rPr>
+              <w:t>50</w:t>
+            </w:r>
+            <w:r>
+              <w:rPr>
+                <w:rFonts w:ascii="BRH Malayalam Extra" w:hAnsi="BRH Malayalam Extra" w:cs="BRH Malayalam Extra"/>
+                <w:color w:val="000000"/>
+                <w:sz w:val="32"/>
+                <w:szCs w:val="40"/>
+              </w:rPr>
+              <w:t>)</w:t>
+            </w:r>
+            <w:proofErr w:type="gramStart"/>
+            <w:r>
+              <w:rPr>
+                <w:rFonts w:ascii="BRH Malayalam Extra" w:hAnsi="BRH Malayalam Extra" w:cs="BRH Malayalam Extra"/>
+                <w:color w:val="000000"/>
+                <w:sz w:val="32"/>
+                <w:szCs w:val="40"/>
+              </w:rPr>
+              <w:t>-  P</w:t>
+            </w:r>
+            <w:proofErr w:type="gramEnd"/>
+            <w:r>
+              <w:rPr>
+                <w:rFonts w:ascii="BRH Malayalam Extra" w:hAnsi="BRH Malayalam Extra" w:cs="BRH Malayalam Extra"/>
+                <w:color w:val="000000"/>
+                <w:sz w:val="26"/>
+                <w:szCs w:val="40"/>
+              </w:rPr>
+              <w:t>–</w:t>
+            </w:r>
+            <w:r>
+              <w:rPr>
+                <w:rFonts w:ascii="BRH Malayalam Extra" w:hAnsi="BRH Malayalam Extra" w:cs="BRH Malayalam Extra"/>
+                <w:color w:val="000000"/>
+                <w:sz w:val="32"/>
+                <w:szCs w:val="40"/>
+              </w:rPr>
+              <w:t>k¡I | e¡d—J | G</w:t>
+            </w:r>
+            <w:r>
+              <w:rPr>
+                <w:rFonts w:ascii="BRH Malayalam Extra" w:hAnsi="BRH Malayalam Extra" w:cs="BRH Malayalam Extra"/>
+                <w:color w:val="000000"/>
+                <w:sz w:val="32"/>
+                <w:szCs w:val="40"/>
+                <w:highlight w:val="yellow"/>
+              </w:rPr>
+              <w:t>¥Zõ</w:t>
+            </w:r>
+            <w:r>
+              <w:rPr>
+                <w:rFonts w:ascii="BRH Malayalam Extra" w:hAnsi="BRH Malayalam Extra" w:cs="BRH Malayalam Extra"/>
+                <w:color w:val="000000"/>
+                <w:sz w:val="32"/>
+                <w:szCs w:val="40"/>
+              </w:rPr>
+              <w:t>Zõ— |</w:t>
+            </w:r>
+          </w:p>
+          <w:p>
+            <w:pPr>
+              <w:widowControl w:val="0"/>
+              <w:autoSpaceDE w:val="0"/>
+              <w:autoSpaceDN w:val="0"/>
+              <w:adjustRightInd w:val="0"/>
+              <w:spacing w:before="0" w:line="240" w:lineRule="auto"/>
+              <w:rPr>
+                <w:rFonts w:ascii="BRH Malayalam Extra" w:hAnsi="BRH Malayalam Extra" w:cs="BRH Malayalam Extra"/>
+                <w:color w:val="000000"/>
+                <w:sz w:val="32"/>
+                <w:szCs w:val="40"/>
+              </w:rPr>
+            </w:pPr>
+            <w:r>
+              <w:rPr>
+                <w:rFonts w:ascii="BRH Malayalam Extra" w:hAnsi="BRH Malayalam Extra" w:cs="BRH Malayalam Extra"/>
+                <w:color w:val="000000"/>
+                <w:sz w:val="32"/>
+                <w:szCs w:val="40"/>
+              </w:rPr>
+              <w:t>P</w:t>
+            </w:r>
+            <w:r>
+              <w:rPr>
+                <w:rFonts w:ascii="BRH Malayalam Extra" w:hAnsi="BRH Malayalam Extra" w:cs="BRH Malayalam Extra"/>
+                <w:color w:val="000000"/>
+                <w:sz w:val="26"/>
+                <w:szCs w:val="40"/>
+              </w:rPr>
+              <w:t>–</w:t>
+            </w:r>
+            <w:r>
+              <w:rPr>
+                <w:rFonts w:ascii="BRH Malayalam Extra" w:hAnsi="BRH Malayalam Extra" w:cs="BRH Malayalam Extra"/>
+                <w:color w:val="000000"/>
+                <w:sz w:val="32"/>
+                <w:szCs w:val="40"/>
+              </w:rPr>
+              <w:t>k¡I e¡d</w:t>
+            </w:r>
+            <w:r>
+              <w:rPr>
+                <w:rFonts w:ascii="BRH Malayalam Extra" w:hAnsi="BRH Malayalam Extra" w:cs="BRH Malayalam Extra"/>
+                <w:color w:val="000000"/>
+                <w:sz w:val="26"/>
+                <w:szCs w:val="40"/>
+              </w:rPr>
+              <w:t>–</w:t>
+            </w:r>
+            <w:r>
+              <w:rPr>
+                <w:rFonts w:ascii="BRH Malayalam Extra" w:hAnsi="BRH Malayalam Extra" w:cs="BRH Malayalam Extra"/>
+                <w:color w:val="000000"/>
+                <w:sz w:val="32"/>
+                <w:szCs w:val="40"/>
+              </w:rPr>
+              <w:t>J e¡d—Ò</w:t>
+            </w:r>
+            <w:r>
+              <w:rPr>
+                <w:rFonts w:ascii="BRH Malayalam Extra" w:hAnsi="BRH Malayalam Extra" w:cs="BRH Malayalam Extra"/>
+                <w:color w:val="000000"/>
+                <w:sz w:val="26"/>
+                <w:szCs w:val="40"/>
+              </w:rPr>
+              <w:t>–</w:t>
+            </w:r>
+            <w:r>
+              <w:rPr>
+                <w:rFonts w:ascii="BRH Malayalam Extra" w:hAnsi="BRH Malayalam Extra" w:cs="BRH Malayalam Extra"/>
+                <w:color w:val="000000"/>
+                <w:sz w:val="32"/>
+                <w:szCs w:val="40"/>
+              </w:rPr>
+              <w:t>k¡I P</w:t>
+            </w:r>
+            <w:r>
+              <w:rPr>
+                <w:rFonts w:ascii="BRH Malayalam Extra" w:hAnsi="BRH Malayalam Extra" w:cs="BRH Malayalam Extra"/>
+                <w:color w:val="000000"/>
+                <w:sz w:val="26"/>
+                <w:szCs w:val="40"/>
+              </w:rPr>
+              <w:t>–</w:t>
+            </w:r>
+            <w:r>
+              <w:rPr>
+                <w:rFonts w:ascii="BRH Malayalam Extra" w:hAnsi="BRH Malayalam Extra" w:cs="BRH Malayalam Extra"/>
+                <w:color w:val="000000"/>
+                <w:sz w:val="32"/>
+                <w:szCs w:val="40"/>
+              </w:rPr>
+              <w:t>k¡I e¡d</w:t>
+            </w:r>
+            <w:r>
+              <w:rPr>
+                <w:rFonts w:ascii="BRH Malayalam Extra" w:hAnsi="BRH Malayalam Extra" w:cs="BRH Malayalam Extra"/>
+                <w:color w:val="000000"/>
+                <w:sz w:val="26"/>
+                <w:szCs w:val="40"/>
+              </w:rPr>
+              <w:t>–</w:t>
+            </w:r>
+            <w:r>
+              <w:rPr>
+                <w:rFonts w:ascii="BRH Malayalam Extra" w:hAnsi="BRH Malayalam Extra" w:cs="BRH Malayalam Extra"/>
+                <w:color w:val="000000"/>
+                <w:sz w:val="32"/>
+                <w:szCs w:val="40"/>
+              </w:rPr>
+              <w:t xml:space="preserve"> ¥k¥Zõ </w:t>
+            </w:r>
+            <w:r>
+              <w:rPr>
+                <w:rFonts w:ascii="BRH Malayalam Extra" w:hAnsi="BRH Malayalam Extra" w:cs="BRH Malayalam Extra"/>
+                <w:color w:val="000000"/>
+                <w:sz w:val="32"/>
+                <w:szCs w:val="40"/>
+                <w:highlight w:val="yellow"/>
+              </w:rPr>
+              <w:t>¤¤Zõ¥Zõ</w:t>
+            </w:r>
+            <w:r>
+              <w:rPr>
+                <w:rFonts w:ascii="BRH Malayalam Extra" w:hAnsi="BRH Malayalam Extra" w:cs="BRH Malayalam Extra"/>
+                <w:color w:val="000000"/>
+                <w:sz w:val="32"/>
+                <w:szCs w:val="40"/>
+              </w:rPr>
+              <w:t>Zõ</w:t>
+            </w:r>
+            <w:r>
+              <w:rPr>
+                <w:rFonts w:ascii="BRH Malayalam Extra" w:hAnsi="BRH Malayalam Extra" w:cs="BRH Malayalam Extra"/>
+                <w:color w:val="000000"/>
+                <w:sz w:val="26"/>
+                <w:szCs w:val="40"/>
+              </w:rPr>
+              <w:t>–</w:t>
+            </w:r>
+            <w:r>
+              <w:rPr>
+                <w:rFonts w:ascii="BRH Malayalam Extra" w:hAnsi="BRH Malayalam Extra" w:cs="BRH Malayalam Extra"/>
+                <w:color w:val="000000"/>
+                <w:sz w:val="32"/>
+                <w:szCs w:val="40"/>
+              </w:rPr>
+              <w:t xml:space="preserve"> e¡d—Ò</w:t>
+            </w:r>
+            <w:r>
+              <w:rPr>
+                <w:rFonts w:ascii="BRH Malayalam Extra" w:hAnsi="BRH Malayalam Extra" w:cs="BRH Malayalam Extra"/>
+                <w:color w:val="000000"/>
+                <w:sz w:val="26"/>
+                <w:szCs w:val="40"/>
+              </w:rPr>
+              <w:t>–</w:t>
+            </w:r>
+            <w:r>
+              <w:rPr>
+                <w:rFonts w:ascii="BRH Malayalam Extra" w:hAnsi="BRH Malayalam Extra" w:cs="BRH Malayalam Extra"/>
+                <w:color w:val="000000"/>
+                <w:sz w:val="32"/>
+                <w:szCs w:val="40"/>
+              </w:rPr>
+              <w:t>k¡I P</w:t>
+            </w:r>
+            <w:r>
+              <w:rPr>
+                <w:rFonts w:ascii="BRH Malayalam Extra" w:hAnsi="BRH Malayalam Extra" w:cs="BRH Malayalam Extra"/>
+                <w:color w:val="000000"/>
+                <w:sz w:val="26"/>
+                <w:szCs w:val="40"/>
+              </w:rPr>
+              <w:t>–</w:t>
+            </w:r>
+            <w:r>
+              <w:rPr>
+                <w:rFonts w:ascii="BRH Malayalam Extra" w:hAnsi="BRH Malayalam Extra" w:cs="BRH Malayalam Extra"/>
+                <w:color w:val="000000"/>
+                <w:sz w:val="32"/>
+                <w:szCs w:val="40"/>
+              </w:rPr>
+              <w:t>k¡I e¡d</w:t>
+            </w:r>
+            <w:r>
+              <w:rPr>
+                <w:rFonts w:ascii="BRH Malayalam Extra" w:hAnsi="BRH Malayalam Extra" w:cs="BRH Malayalam Extra"/>
+                <w:color w:val="000000"/>
+                <w:sz w:val="26"/>
+                <w:szCs w:val="40"/>
+              </w:rPr>
+              <w:t>–</w:t>
+            </w:r>
+            <w:r>
+              <w:rPr>
+                <w:rFonts w:ascii="BRH Malayalam Extra" w:hAnsi="BRH Malayalam Extra" w:cs="BRH Malayalam Extra"/>
+                <w:color w:val="000000"/>
+                <w:sz w:val="32"/>
+                <w:szCs w:val="40"/>
+              </w:rPr>
+              <w:t xml:space="preserve"> ¥k</w:t>
+            </w:r>
+            <w:r>
+              <w:rPr>
+                <w:rFonts w:ascii="BRH Malayalam Extra" w:hAnsi="BRH Malayalam Extra" w:cs="BRH Malayalam Extra"/>
+                <w:color w:val="000000"/>
+                <w:sz w:val="32"/>
+                <w:szCs w:val="40"/>
+                <w:highlight w:val="yellow"/>
+              </w:rPr>
+              <w:t>¥Zõ</w:t>
+            </w:r>
+            <w:r>
+              <w:rPr>
+                <w:rFonts w:ascii="BRH Malayalam Extra" w:hAnsi="BRH Malayalam Extra" w:cs="BRH Malayalam Extra"/>
+                <w:color w:val="000000"/>
+                <w:sz w:val="32"/>
+                <w:szCs w:val="40"/>
+              </w:rPr>
+              <w:t xml:space="preserve">Zõ— | </w:t>
+            </w:r>
+          </w:p>
+          <w:p>
+            <w:pPr>
+              <w:widowControl w:val="0"/>
+              <w:autoSpaceDE w:val="0"/>
+              <w:autoSpaceDN w:val="0"/>
+              <w:adjustRightInd w:val="0"/>
+              <w:spacing w:before="0" w:line="240" w:lineRule="auto"/>
+              <w:rPr>
+                <w:rFonts w:ascii="BRH Malayalam Extra" w:hAnsi="BRH Malayalam Extra" w:cs="BRH Malayalam Extra"/>
+                <w:color w:val="000000"/>
+                <w:sz w:val="32"/>
+                <w:szCs w:val="40"/>
+              </w:rPr>
+            </w:pPr>
+            <w:r>
+              <w:rPr>
+                <w:rFonts w:cs="BRH Malayalam Extra"/>
+                <w:color w:val="000000"/>
+                <w:szCs w:val="40"/>
+              </w:rPr>
+              <w:t>65</w:t>
+            </w:r>
+            <w:r>
+              <w:rPr>
+                <w:rFonts w:ascii="BRH Malayalam Extra" w:hAnsi="BRH Malayalam Extra" w:cs="BRH Malayalam Extra"/>
+                <w:color w:val="000000"/>
+                <w:sz w:val="32"/>
+                <w:szCs w:val="40"/>
+              </w:rPr>
+              <w:t>)</w:t>
+            </w:r>
+            <w:r>
+              <w:rPr>
+                <w:rFonts w:ascii="BRH Malayalam Extra" w:hAnsi="BRH Malayalam Extra" w:cs="BRH Malayalam Extra"/>
+                <w:color w:val="000000"/>
+                <w:sz w:val="32"/>
+                <w:szCs w:val="40"/>
+              </w:rPr>
+              <w:tab/>
+            </w:r>
+            <w:r>
+              <w:rPr>
+                <w:rFonts w:cs="BRH Malayalam Extra"/>
+                <w:color w:val="000000"/>
+                <w:szCs w:val="40"/>
+              </w:rPr>
+              <w:t>2</w:t>
+            </w:r>
+            <w:r>
+              <w:rPr>
+                <w:rFonts w:ascii="BRH Malayalam Extra" w:hAnsi="BRH Malayalam Extra" w:cs="BRH Malayalam Extra"/>
+                <w:color w:val="000000"/>
+                <w:sz w:val="32"/>
+                <w:szCs w:val="40"/>
+              </w:rPr>
+              <w:t>.</w:t>
+            </w:r>
+            <w:r>
+              <w:rPr>
+                <w:rFonts w:cs="BRH Malayalam Extra"/>
+                <w:color w:val="000000"/>
+                <w:szCs w:val="40"/>
+              </w:rPr>
+              <w:t>3</w:t>
+            </w:r>
+            <w:r>
+              <w:rPr>
+                <w:rFonts w:ascii="BRH Malayalam Extra" w:hAnsi="BRH Malayalam Extra" w:cs="BRH Malayalam Extra"/>
+                <w:color w:val="000000"/>
+                <w:sz w:val="32"/>
+                <w:szCs w:val="40"/>
+              </w:rPr>
+              <w:t>.</w:t>
+            </w:r>
+            <w:r>
+              <w:rPr>
+                <w:rFonts w:cs="BRH Malayalam Extra"/>
+                <w:color w:val="000000"/>
+                <w:szCs w:val="40"/>
+              </w:rPr>
+              <w:t>12</w:t>
+            </w:r>
+            <w:r>
+              <w:rPr>
+                <w:rFonts w:ascii="BRH Malayalam Extra" w:hAnsi="BRH Malayalam Extra" w:cs="BRH Malayalam Extra"/>
+                <w:color w:val="000000"/>
+                <w:sz w:val="32"/>
+                <w:szCs w:val="40"/>
+              </w:rPr>
+              <w:t>.</w:t>
+            </w:r>
+            <w:r>
+              <w:rPr>
+                <w:rFonts w:cs="BRH Malayalam Extra"/>
+                <w:color w:val="000000"/>
+                <w:szCs w:val="40"/>
+              </w:rPr>
+              <w:t>2</w:t>
+            </w:r>
+            <w:r>
+              <w:rPr>
+                <w:rFonts w:ascii="BRH Malayalam Extra" w:hAnsi="BRH Malayalam Extra" w:cs="BRH Malayalam Extra"/>
+                <w:color w:val="000000"/>
+                <w:sz w:val="32"/>
+                <w:szCs w:val="40"/>
+              </w:rPr>
+              <w:t>(</w:t>
+            </w:r>
+            <w:r>
+              <w:rPr>
+                <w:rFonts w:cs="BRH Malayalam Extra"/>
+                <w:color w:val="000000"/>
+                <w:szCs w:val="40"/>
+              </w:rPr>
+              <w:t>51</w:t>
+            </w:r>
+            <w:r>
+              <w:rPr>
+                <w:rFonts w:ascii="BRH Malayalam Extra" w:hAnsi="BRH Malayalam Extra" w:cs="BRH Malayalam Extra"/>
+                <w:color w:val="000000"/>
+                <w:sz w:val="32"/>
+                <w:szCs w:val="40"/>
+              </w:rPr>
+              <w:t>)</w:t>
+            </w:r>
+            <w:proofErr w:type="gramStart"/>
+            <w:r>
+              <w:rPr>
+                <w:rFonts w:ascii="BRH Malayalam Extra" w:hAnsi="BRH Malayalam Extra" w:cs="BRH Malayalam Extra"/>
+                <w:color w:val="000000"/>
+                <w:sz w:val="32"/>
+                <w:szCs w:val="40"/>
+              </w:rPr>
+              <w:t>-  e</w:t>
+            </w:r>
+            <w:proofErr w:type="gramEnd"/>
+            <w:r>
+              <w:rPr>
+                <w:rFonts w:ascii="BRH Malayalam Extra" w:hAnsi="BRH Malayalam Extra" w:cs="BRH Malayalam Extra"/>
+                <w:color w:val="000000"/>
+                <w:sz w:val="32"/>
+                <w:szCs w:val="40"/>
+              </w:rPr>
+              <w:t>¡d—J | G</w:t>
+            </w:r>
+            <w:r>
+              <w:rPr>
+                <w:rFonts w:ascii="BRH Malayalam Extra" w:hAnsi="BRH Malayalam Extra" w:cs="BRH Malayalam Extra"/>
+                <w:color w:val="000000"/>
+                <w:sz w:val="32"/>
+                <w:szCs w:val="40"/>
+                <w:highlight w:val="yellow"/>
+              </w:rPr>
+              <w:t>¥Zõ</w:t>
+            </w:r>
+            <w:r>
+              <w:rPr>
+                <w:rFonts w:ascii="BRH Malayalam Extra" w:hAnsi="BRH Malayalam Extra" w:cs="BRH Malayalam Extra"/>
+                <w:color w:val="000000"/>
+                <w:sz w:val="32"/>
+                <w:szCs w:val="40"/>
+              </w:rPr>
+              <w:t>Zõ— | dyJ |</w:t>
+            </w:r>
+          </w:p>
+          <w:p>
+            <w:pPr>
+              <w:widowControl w:val="0"/>
+              <w:autoSpaceDE w:val="0"/>
+              <w:autoSpaceDN w:val="0"/>
+              <w:adjustRightInd w:val="0"/>
+              <w:spacing w:before="0" w:line="240" w:lineRule="auto"/>
+              <w:rPr>
+                <w:rFonts w:ascii="BRH Malayalam Extra" w:hAnsi="BRH Malayalam Extra" w:cs="BRH Malayalam Extra"/>
+                <w:color w:val="000000"/>
+                <w:sz w:val="32"/>
+                <w:szCs w:val="40"/>
+              </w:rPr>
+            </w:pPr>
+            <w:r>
+              <w:rPr>
+                <w:rFonts w:ascii="BRH Malayalam Extra" w:hAnsi="BRH Malayalam Extra" w:cs="BRH Malayalam Extra"/>
+                <w:color w:val="000000"/>
+                <w:sz w:val="32"/>
+                <w:szCs w:val="40"/>
+              </w:rPr>
+              <w:t>e¡d</w:t>
+            </w:r>
+            <w:r>
+              <w:rPr>
+                <w:rFonts w:ascii="BRH Malayalam Extra" w:hAnsi="BRH Malayalam Extra" w:cs="BRH Malayalam Extra"/>
+                <w:color w:val="000000"/>
+                <w:sz w:val="26"/>
+                <w:szCs w:val="40"/>
+              </w:rPr>
+              <w:t>–</w:t>
+            </w:r>
+            <w:r>
+              <w:rPr>
+                <w:rFonts w:ascii="BRH Malayalam Extra" w:hAnsi="BRH Malayalam Extra" w:cs="BRH Malayalam Extra"/>
+                <w:color w:val="000000"/>
+                <w:sz w:val="32"/>
+                <w:szCs w:val="40"/>
+              </w:rPr>
+              <w:t xml:space="preserve"> ¥k¥Zõ</w:t>
+            </w:r>
+            <w:r>
+              <w:rPr>
+                <w:rFonts w:ascii="BRH Malayalam Extra" w:hAnsi="BRH Malayalam Extra" w:cs="BRH Malayalam Extra"/>
+                <w:color w:val="000000"/>
+                <w:sz w:val="32"/>
+                <w:szCs w:val="40"/>
+                <w:highlight w:val="yellow"/>
+              </w:rPr>
+              <w:t>¤¤Zõ¥Zõ</w:t>
+            </w:r>
+            <w:r>
+              <w:rPr>
+                <w:rFonts w:ascii="BRH Malayalam Extra" w:hAnsi="BRH Malayalam Extra" w:cs="BRH Malayalam Extra"/>
+                <w:color w:val="000000"/>
+                <w:sz w:val="32"/>
+                <w:szCs w:val="40"/>
+              </w:rPr>
+              <w:t>Zõ</w:t>
+            </w:r>
+            <w:r>
+              <w:rPr>
+                <w:rFonts w:ascii="BRH Malayalam Extra" w:hAnsi="BRH Malayalam Extra" w:cs="BRH Malayalam Extra"/>
+                <w:color w:val="000000"/>
+                <w:sz w:val="26"/>
+                <w:szCs w:val="40"/>
+              </w:rPr>
+              <w:t>–</w:t>
+            </w:r>
+            <w:r>
+              <w:rPr>
+                <w:rFonts w:ascii="BRH Malayalam Extra" w:hAnsi="BRH Malayalam Extra" w:cs="BRH Malayalam Extra"/>
+                <w:color w:val="000000"/>
+                <w:sz w:val="32"/>
+                <w:szCs w:val="40"/>
+              </w:rPr>
+              <w:t xml:space="preserve"> e¡d</w:t>
+            </w:r>
+            <w:r>
+              <w:rPr>
+                <w:rFonts w:ascii="BRH Malayalam Extra" w:hAnsi="BRH Malayalam Extra" w:cs="BRH Malayalam Extra"/>
+                <w:color w:val="000000"/>
+                <w:sz w:val="26"/>
+                <w:szCs w:val="40"/>
+              </w:rPr>
+              <w:t>–</w:t>
+            </w:r>
+            <w:r>
+              <w:rPr>
+                <w:rFonts w:ascii="BRH Malayalam Extra" w:hAnsi="BRH Malayalam Extra" w:cs="BRH Malayalam Extra"/>
+                <w:color w:val="000000"/>
+                <w:sz w:val="32"/>
+                <w:szCs w:val="40"/>
+              </w:rPr>
+              <w:t>J e¡d</w:t>
+            </w:r>
+            <w:r>
+              <w:rPr>
+                <w:rFonts w:ascii="BRH Malayalam Extra" w:hAnsi="BRH Malayalam Extra" w:cs="BRH Malayalam Extra"/>
+                <w:color w:val="000000"/>
+                <w:sz w:val="26"/>
+                <w:szCs w:val="40"/>
+              </w:rPr>
+              <w:t>–</w:t>
+            </w:r>
+            <w:r>
+              <w:rPr>
+                <w:rFonts w:ascii="BRH Malayalam Extra" w:hAnsi="BRH Malayalam Extra" w:cs="BRH Malayalam Extra"/>
+                <w:color w:val="000000"/>
+                <w:sz w:val="32"/>
+                <w:szCs w:val="40"/>
+              </w:rPr>
+              <w:t xml:space="preserve"> ¥k</w:t>
+            </w:r>
+            <w:r>
+              <w:rPr>
+                <w:rFonts w:ascii="BRH Malayalam Extra" w:hAnsi="BRH Malayalam Extra" w:cs="BRH Malayalam Extra"/>
+                <w:color w:val="000000"/>
+                <w:sz w:val="32"/>
+                <w:szCs w:val="40"/>
+                <w:highlight w:val="yellow"/>
+              </w:rPr>
+              <w:t>¥Zõ</w:t>
+            </w:r>
+            <w:r>
+              <w:rPr>
+                <w:rFonts w:ascii="BRH Malayalam Extra" w:hAnsi="BRH Malayalam Extra" w:cs="BRH Malayalam Extra"/>
+                <w:color w:val="000000"/>
+                <w:sz w:val="32"/>
+                <w:szCs w:val="40"/>
+              </w:rPr>
+              <w:t>Zõ</w:t>
+            </w:r>
+            <w:r>
+              <w:rPr>
+                <w:rFonts w:ascii="BRH Malayalam Extra" w:hAnsi="BRH Malayalam Extra" w:cs="BRH Malayalam Extra"/>
+                <w:color w:val="000000"/>
+                <w:sz w:val="26"/>
+                <w:szCs w:val="40"/>
+              </w:rPr>
+              <w:t>–</w:t>
+            </w:r>
+            <w:r>
+              <w:rPr>
+                <w:rFonts w:ascii="BRH Malayalam Extra" w:hAnsi="BRH Malayalam Extra" w:cs="BRH Malayalam Extra"/>
+                <w:color w:val="000000"/>
+                <w:sz w:val="32"/>
+                <w:szCs w:val="40"/>
+              </w:rPr>
+              <w:t xml:space="preserve"> dyª Yy¥k</w:t>
+            </w:r>
+            <w:r>
+              <w:rPr>
+                <w:rFonts w:ascii="BRH Malayalam Extra" w:hAnsi="BRH Malayalam Extra" w:cs="BRH Malayalam Extra"/>
+                <w:color w:val="000000"/>
+                <w:sz w:val="32"/>
+                <w:szCs w:val="40"/>
+                <w:highlight w:val="yellow"/>
+              </w:rPr>
+              <w:t>¥Zõ</w:t>
+            </w:r>
+            <w:r>
+              <w:rPr>
+                <w:rFonts w:ascii="BRH Malayalam Extra" w:hAnsi="BRH Malayalam Extra" w:cs="BRH Malayalam Extra"/>
+                <w:color w:val="000000"/>
+                <w:sz w:val="32"/>
+                <w:szCs w:val="40"/>
+              </w:rPr>
+              <w:t>Zõ</w:t>
+            </w:r>
+            <w:r>
+              <w:rPr>
+                <w:rFonts w:ascii="BRH Malayalam Extra" w:hAnsi="BRH Malayalam Extra" w:cs="BRH Malayalam Extra"/>
+                <w:color w:val="000000"/>
+                <w:sz w:val="26"/>
+                <w:szCs w:val="40"/>
+              </w:rPr>
+              <w:t>–</w:t>
+            </w:r>
+            <w:r>
+              <w:rPr>
+                <w:rFonts w:ascii="BRH Malayalam Extra" w:hAnsi="BRH Malayalam Extra" w:cs="BRH Malayalam Extra"/>
+                <w:color w:val="000000"/>
+                <w:sz w:val="32"/>
+                <w:szCs w:val="40"/>
+              </w:rPr>
+              <w:t xml:space="preserve"> e¡d</w:t>
+            </w:r>
+            <w:r>
+              <w:rPr>
+                <w:rFonts w:ascii="BRH Malayalam Extra" w:hAnsi="BRH Malayalam Extra" w:cs="BRH Malayalam Extra"/>
+                <w:color w:val="000000"/>
+                <w:sz w:val="26"/>
+                <w:szCs w:val="40"/>
+              </w:rPr>
+              <w:t>–</w:t>
+            </w:r>
+            <w:r>
+              <w:rPr>
+                <w:rFonts w:ascii="BRH Malayalam Extra" w:hAnsi="BRH Malayalam Extra" w:cs="BRH Malayalam Extra"/>
+                <w:color w:val="000000"/>
+                <w:sz w:val="32"/>
+                <w:szCs w:val="40"/>
+              </w:rPr>
+              <w:t>J e¡d</w:t>
+            </w:r>
+            <w:r>
+              <w:rPr>
+                <w:rFonts w:ascii="BRH Malayalam Extra" w:hAnsi="BRH Malayalam Extra" w:cs="BRH Malayalam Extra"/>
+                <w:color w:val="000000"/>
+                <w:sz w:val="26"/>
+                <w:szCs w:val="40"/>
+              </w:rPr>
+              <w:t>–</w:t>
+            </w:r>
+            <w:r>
+              <w:rPr>
+                <w:rFonts w:ascii="BRH Malayalam Extra" w:hAnsi="BRH Malayalam Extra" w:cs="BRH Malayalam Extra"/>
+                <w:color w:val="000000"/>
+                <w:sz w:val="32"/>
+                <w:szCs w:val="40"/>
+              </w:rPr>
+              <w:t xml:space="preserve"> ¥k</w:t>
+            </w:r>
+            <w:r>
+              <w:rPr>
+                <w:rFonts w:ascii="BRH Malayalam Extra" w:hAnsi="BRH Malayalam Extra" w:cs="BRH Malayalam Extra"/>
+                <w:color w:val="000000"/>
+                <w:sz w:val="32"/>
+                <w:szCs w:val="40"/>
+                <w:highlight w:val="yellow"/>
+              </w:rPr>
+              <w:t>¥Zõ</w:t>
+            </w:r>
+            <w:r>
+              <w:rPr>
+                <w:rFonts w:ascii="BRH Malayalam Extra" w:hAnsi="BRH Malayalam Extra" w:cs="BRH Malayalam Extra"/>
+                <w:color w:val="000000"/>
+                <w:sz w:val="32"/>
+                <w:szCs w:val="40"/>
+              </w:rPr>
+              <w:t>Zõ</w:t>
+            </w:r>
+            <w:r>
+              <w:rPr>
+                <w:rFonts w:ascii="BRH Malayalam Extra" w:hAnsi="BRH Malayalam Extra" w:cs="BRH Malayalam Extra"/>
+                <w:color w:val="000000"/>
+                <w:sz w:val="26"/>
+                <w:szCs w:val="40"/>
+              </w:rPr>
+              <w:t>–</w:t>
+            </w:r>
+            <w:r>
+              <w:rPr>
+                <w:rFonts w:ascii="BRH Malayalam Extra" w:hAnsi="BRH Malayalam Extra" w:cs="BRH Malayalam Extra"/>
+                <w:color w:val="000000"/>
+                <w:sz w:val="32"/>
+                <w:szCs w:val="40"/>
+              </w:rPr>
+              <w:t xml:space="preserve"> dyJ | </w:t>
+            </w:r>
+          </w:p>
+          <w:p>
+            <w:pPr>
+              <w:widowControl w:val="0"/>
+              <w:autoSpaceDE w:val="0"/>
+              <w:autoSpaceDN w:val="0"/>
+              <w:adjustRightInd w:val="0"/>
+              <w:spacing w:before="0" w:line="240" w:lineRule="auto"/>
+              <w:rPr>
+                <w:rFonts w:ascii="BRH Malayalam Extra" w:hAnsi="BRH Malayalam Extra" w:cs="BRH Malayalam Extra"/>
+                <w:color w:val="000000"/>
+                <w:sz w:val="32"/>
+                <w:szCs w:val="40"/>
+              </w:rPr>
+            </w:pPr>
+            <w:r>
+              <w:rPr>
+                <w:rFonts w:cs="BRH Malayalam Extra"/>
+                <w:color w:val="000000"/>
+                <w:szCs w:val="40"/>
+              </w:rPr>
+              <w:t>66</w:t>
+            </w:r>
+            <w:r>
+              <w:rPr>
+                <w:rFonts w:ascii="BRH Malayalam Extra" w:hAnsi="BRH Malayalam Extra" w:cs="BRH Malayalam Extra"/>
+                <w:color w:val="000000"/>
+                <w:sz w:val="32"/>
+                <w:szCs w:val="40"/>
+              </w:rPr>
+              <w:t>)</w:t>
+            </w:r>
+            <w:r>
+              <w:rPr>
+                <w:rFonts w:ascii="BRH Malayalam Extra" w:hAnsi="BRH Malayalam Extra" w:cs="BRH Malayalam Extra"/>
+                <w:color w:val="000000"/>
+                <w:sz w:val="32"/>
+                <w:szCs w:val="40"/>
+              </w:rPr>
+              <w:tab/>
+            </w:r>
+            <w:r>
+              <w:rPr>
+                <w:rFonts w:cs="BRH Malayalam Extra"/>
+                <w:color w:val="000000"/>
+                <w:szCs w:val="40"/>
+              </w:rPr>
+              <w:t>2</w:t>
+            </w:r>
+            <w:r>
+              <w:rPr>
+                <w:rFonts w:ascii="BRH Malayalam Extra" w:hAnsi="BRH Malayalam Extra" w:cs="BRH Malayalam Extra"/>
+                <w:color w:val="000000"/>
+                <w:sz w:val="32"/>
+                <w:szCs w:val="40"/>
+              </w:rPr>
+              <w:t>.</w:t>
+            </w:r>
+            <w:r>
+              <w:rPr>
+                <w:rFonts w:cs="BRH Malayalam Extra"/>
+                <w:color w:val="000000"/>
+                <w:szCs w:val="40"/>
+              </w:rPr>
+              <w:t>3</w:t>
+            </w:r>
+            <w:r>
+              <w:rPr>
+                <w:rFonts w:ascii="BRH Malayalam Extra" w:hAnsi="BRH Malayalam Extra" w:cs="BRH Malayalam Extra"/>
+                <w:color w:val="000000"/>
+                <w:sz w:val="32"/>
+                <w:szCs w:val="40"/>
+              </w:rPr>
+              <w:t>.</w:t>
+            </w:r>
+            <w:r>
+              <w:rPr>
+                <w:rFonts w:cs="BRH Malayalam Extra"/>
+                <w:color w:val="000000"/>
+                <w:szCs w:val="40"/>
+              </w:rPr>
+              <w:t>12</w:t>
+            </w:r>
+            <w:r>
+              <w:rPr>
+                <w:rFonts w:ascii="BRH Malayalam Extra" w:hAnsi="BRH Malayalam Extra" w:cs="BRH Malayalam Extra"/>
+                <w:color w:val="000000"/>
+                <w:sz w:val="32"/>
+                <w:szCs w:val="40"/>
+              </w:rPr>
+              <w:t>.</w:t>
+            </w:r>
+            <w:r>
+              <w:rPr>
+                <w:rFonts w:cs="BRH Malayalam Extra"/>
+                <w:color w:val="000000"/>
+                <w:szCs w:val="40"/>
+              </w:rPr>
+              <w:t>2</w:t>
+            </w:r>
+            <w:r>
+              <w:rPr>
+                <w:rFonts w:ascii="BRH Malayalam Extra" w:hAnsi="BRH Malayalam Extra" w:cs="BRH Malayalam Extra"/>
+                <w:color w:val="000000"/>
+                <w:sz w:val="32"/>
+                <w:szCs w:val="40"/>
+              </w:rPr>
+              <w:t>(</w:t>
+            </w:r>
+            <w:r>
+              <w:rPr>
+                <w:rFonts w:cs="BRH Malayalam Extra"/>
+                <w:color w:val="000000"/>
+                <w:szCs w:val="40"/>
+              </w:rPr>
+              <w:t>52</w:t>
+            </w:r>
+            <w:r>
+              <w:rPr>
+                <w:rFonts w:ascii="BRH Malayalam Extra" w:hAnsi="BRH Malayalam Extra" w:cs="BRH Malayalam Extra"/>
+                <w:color w:val="000000"/>
+                <w:sz w:val="32"/>
+                <w:szCs w:val="40"/>
+              </w:rPr>
+              <w:t>)</w:t>
+            </w:r>
+            <w:proofErr w:type="gramStart"/>
+            <w:r>
+              <w:rPr>
+                <w:rFonts w:ascii="BRH Malayalam Extra" w:hAnsi="BRH Malayalam Extra" w:cs="BRH Malayalam Extra"/>
+                <w:color w:val="000000"/>
+                <w:sz w:val="32"/>
+                <w:szCs w:val="40"/>
+              </w:rPr>
+              <w:t>-  G</w:t>
+            </w:r>
+            <w:proofErr w:type="gramEnd"/>
+            <w:r>
+              <w:rPr>
+                <w:rFonts w:ascii="BRH Malayalam Extra" w:hAnsi="BRH Malayalam Extra" w:cs="BRH Malayalam Extra"/>
+                <w:color w:val="000000"/>
+                <w:sz w:val="32"/>
+                <w:szCs w:val="40"/>
+                <w:highlight w:val="yellow"/>
+              </w:rPr>
+              <w:t>¥Zõ</w:t>
+            </w:r>
+            <w:r>
+              <w:rPr>
+                <w:rFonts w:ascii="BRH Malayalam Extra" w:hAnsi="BRH Malayalam Extra" w:cs="BRH Malayalam Extra"/>
+                <w:color w:val="000000"/>
+                <w:sz w:val="32"/>
+                <w:szCs w:val="40"/>
+              </w:rPr>
+              <w:t>Zõ— | dyJ | p</w:t>
+            </w:r>
+            <w:r>
+              <w:rPr>
+                <w:rFonts w:ascii="BRH Malayalam Extra" w:hAnsi="BRH Malayalam Extra" w:cs="BRH Malayalam Extra"/>
+                <w:color w:val="000000"/>
+                <w:sz w:val="26"/>
+                <w:szCs w:val="40"/>
+              </w:rPr>
+              <w:t>–</w:t>
+            </w:r>
+            <w:r>
+              <w:rPr>
+                <w:rFonts w:ascii="BRH Malayalam Extra" w:hAnsi="BRH Malayalam Extra" w:cs="BRH Malayalam Extra"/>
+                <w:color w:val="000000"/>
+                <w:sz w:val="32"/>
+                <w:szCs w:val="40"/>
+              </w:rPr>
+              <w:t>¥e</w:t>
+            </w:r>
+            <w:r>
+              <w:rPr>
+                <w:rFonts w:ascii="BRH Malayalam Extra" w:hAnsi="BRH Malayalam Extra" w:cs="BRH Malayalam Extra"/>
+                <w:color w:val="000000"/>
+                <w:sz w:val="26"/>
+                <w:szCs w:val="40"/>
+              </w:rPr>
+              <w:t>–</w:t>
+            </w:r>
+            <w:r>
+              <w:rPr>
+                <w:rFonts w:ascii="BRH Malayalam Extra" w:hAnsi="BRH Malayalam Extra" w:cs="BRH Malayalam Extra"/>
+                <w:color w:val="000000"/>
+                <w:sz w:val="32"/>
+                <w:szCs w:val="40"/>
+              </w:rPr>
+              <w:t>Z§ |</w:t>
+            </w:r>
+          </w:p>
+          <w:p>
+            <w:pPr>
+              <w:widowControl w:val="0"/>
+              <w:autoSpaceDE w:val="0"/>
+              <w:autoSpaceDN w:val="0"/>
+              <w:adjustRightInd w:val="0"/>
+              <w:spacing w:before="0" w:line="240" w:lineRule="auto"/>
+              <w:rPr>
+                <w:rFonts w:ascii="BRH Malayalam Extra" w:hAnsi="BRH Malayalam Extra" w:cs="BRH Malayalam Extra"/>
+                <w:color w:val="000000"/>
+                <w:sz w:val="32"/>
+                <w:szCs w:val="40"/>
+              </w:rPr>
+            </w:pPr>
+            <w:r>
+              <w:rPr>
+                <w:rFonts w:ascii="BRH Malayalam Extra" w:hAnsi="BRH Malayalam Extra" w:cs="BRH Malayalam Extra"/>
+                <w:color w:val="000000"/>
+                <w:sz w:val="32"/>
+                <w:szCs w:val="40"/>
+              </w:rPr>
+              <w:t>G¥ZõZõ</w:t>
+            </w:r>
+            <w:r>
+              <w:rPr>
+                <w:rFonts w:ascii="BRH Malayalam Extra" w:hAnsi="BRH Malayalam Extra" w:cs="BRH Malayalam Extra"/>
+                <w:color w:val="000000"/>
+                <w:sz w:val="26"/>
+                <w:szCs w:val="40"/>
+              </w:rPr>
+              <w:t>–</w:t>
+            </w:r>
+            <w:r>
+              <w:rPr>
+                <w:rFonts w:ascii="BRH Malayalam Extra" w:hAnsi="BRH Malayalam Extra" w:cs="BRH Malayalam Extra"/>
+                <w:color w:val="000000"/>
+                <w:sz w:val="32"/>
+                <w:szCs w:val="40"/>
+              </w:rPr>
+              <w:t xml:space="preserve"> dyª Yy¥k¥Zõ </w:t>
+            </w:r>
+            <w:r>
+              <w:rPr>
+                <w:rFonts w:ascii="BRH Malayalam Extra" w:hAnsi="BRH Malayalam Extra" w:cs="BRH Malayalam Extra"/>
+                <w:color w:val="000000"/>
+                <w:sz w:val="32"/>
+                <w:szCs w:val="40"/>
+                <w:highlight w:val="yellow"/>
+              </w:rPr>
+              <w:t>¤¤Zõ¥Zõ</w:t>
+            </w:r>
+            <w:r>
+              <w:rPr>
+                <w:rFonts w:ascii="BRH Malayalam Extra" w:hAnsi="BRH Malayalam Extra" w:cs="BRH Malayalam Extra"/>
+                <w:color w:val="000000"/>
+                <w:sz w:val="32"/>
+                <w:szCs w:val="40"/>
+              </w:rPr>
+              <w:t>Zõ</w:t>
+            </w:r>
+            <w:r>
+              <w:rPr>
+                <w:rFonts w:ascii="BRH Malayalam Extra" w:hAnsi="BRH Malayalam Extra" w:cs="BRH Malayalam Extra"/>
+                <w:color w:val="000000"/>
+                <w:sz w:val="26"/>
+                <w:szCs w:val="40"/>
+              </w:rPr>
+              <w:t>–</w:t>
+            </w:r>
+            <w:r>
+              <w:rPr>
+                <w:rFonts w:ascii="BRH Malayalam Extra" w:hAnsi="BRH Malayalam Extra" w:cs="BRH Malayalam Extra"/>
+                <w:color w:val="000000"/>
+                <w:sz w:val="32"/>
+                <w:szCs w:val="40"/>
+              </w:rPr>
+              <w:t xml:space="preserve"> dyª p—¥eb§ p¥e</w:t>
+            </w:r>
+            <w:r>
+              <w:rPr>
+                <w:rFonts w:ascii="BRH Malayalam Extra" w:hAnsi="BRH Malayalam Extra" w:cs="BRH Malayalam Extra"/>
+                <w:color w:val="000000"/>
+                <w:sz w:val="26"/>
+                <w:szCs w:val="40"/>
+              </w:rPr>
+              <w:t>–</w:t>
+            </w:r>
+            <w:r>
+              <w:rPr>
+                <w:rFonts w:ascii="BRH Malayalam Extra" w:hAnsi="BRH Malayalam Extra" w:cs="BRH Malayalam Extra"/>
+                <w:color w:val="000000"/>
+                <w:sz w:val="32"/>
+                <w:szCs w:val="40"/>
+              </w:rPr>
+              <w:t xml:space="preserve">© dy¥k¥Zõ </w:t>
+            </w:r>
+            <w:r>
+              <w:rPr>
+                <w:rFonts w:ascii="BRH Malayalam Extra" w:hAnsi="BRH Malayalam Extra" w:cs="BRH Malayalam Extra"/>
+                <w:color w:val="000000"/>
+                <w:sz w:val="32"/>
+                <w:szCs w:val="40"/>
+                <w:highlight w:val="yellow"/>
+              </w:rPr>
+              <w:t>¤¤Zõ¥Zõ</w:t>
+            </w:r>
+            <w:r>
+              <w:rPr>
+                <w:rFonts w:ascii="BRH Malayalam Extra" w:hAnsi="BRH Malayalam Extra" w:cs="BRH Malayalam Extra"/>
+                <w:color w:val="000000"/>
+                <w:sz w:val="32"/>
+                <w:szCs w:val="40"/>
+              </w:rPr>
+              <w:t>Zõ</w:t>
+            </w:r>
+            <w:r>
+              <w:rPr>
+                <w:rFonts w:ascii="BRH Malayalam Extra" w:hAnsi="BRH Malayalam Extra" w:cs="BRH Malayalam Extra"/>
+                <w:color w:val="000000"/>
+                <w:sz w:val="26"/>
+                <w:szCs w:val="40"/>
+              </w:rPr>
+              <w:t>–</w:t>
+            </w:r>
+            <w:r>
+              <w:rPr>
+                <w:rFonts w:ascii="BRH Malayalam Extra" w:hAnsi="BRH Malayalam Extra" w:cs="BRH Malayalam Extra"/>
+                <w:color w:val="000000"/>
+                <w:sz w:val="32"/>
+                <w:szCs w:val="40"/>
+              </w:rPr>
+              <w:t xml:space="preserve"> dyª p—¥eZ§ | </w:t>
+            </w:r>
+          </w:p>
+          <w:p>
+            <w:pPr>
+              <w:widowControl w:val="0"/>
+              <w:autoSpaceDE w:val="0"/>
+              <w:autoSpaceDN w:val="0"/>
+              <w:adjustRightInd w:val="0"/>
+              <w:spacing w:before="0" w:line="240" w:lineRule="auto"/>
+              <w:rPr>
+                <w:rFonts w:ascii="BRH Malayalam Extra" w:hAnsi="BRH Malayalam Extra" w:cs="BRH Malayalam Extra"/>
+                <w:color w:val="000000"/>
+                <w:sz w:val="32"/>
+                <w:szCs w:val="40"/>
+              </w:rPr>
+            </w:pPr>
+            <w:r>
+              <w:rPr>
+                <w:rFonts w:cs="BRH Malayalam Extra"/>
+                <w:color w:val="000000"/>
+                <w:szCs w:val="40"/>
+              </w:rPr>
+              <w:t>67</w:t>
+            </w:r>
+            <w:r>
+              <w:rPr>
+                <w:rFonts w:ascii="BRH Malayalam Extra" w:hAnsi="BRH Malayalam Extra" w:cs="BRH Malayalam Extra"/>
+                <w:color w:val="000000"/>
+                <w:sz w:val="32"/>
+                <w:szCs w:val="40"/>
+              </w:rPr>
+              <w:t>)</w:t>
+            </w:r>
+            <w:r>
+              <w:rPr>
+                <w:rFonts w:ascii="BRH Malayalam Extra" w:hAnsi="BRH Malayalam Extra" w:cs="BRH Malayalam Extra"/>
+                <w:color w:val="000000"/>
+                <w:sz w:val="32"/>
+                <w:szCs w:val="40"/>
+              </w:rPr>
+              <w:tab/>
+            </w:r>
+            <w:r>
+              <w:rPr>
+                <w:rFonts w:cs="BRH Malayalam Extra"/>
+                <w:color w:val="000000"/>
+                <w:szCs w:val="40"/>
+              </w:rPr>
+              <w:t>2</w:t>
+            </w:r>
+            <w:r>
+              <w:rPr>
+                <w:rFonts w:ascii="BRH Malayalam Extra" w:hAnsi="BRH Malayalam Extra" w:cs="BRH Malayalam Extra"/>
+                <w:color w:val="000000"/>
+                <w:sz w:val="32"/>
+                <w:szCs w:val="40"/>
+              </w:rPr>
+              <w:t>.</w:t>
+            </w:r>
+            <w:r>
+              <w:rPr>
+                <w:rFonts w:cs="BRH Malayalam Extra"/>
+                <w:color w:val="000000"/>
+                <w:szCs w:val="40"/>
+              </w:rPr>
+              <w:t>3</w:t>
+            </w:r>
+            <w:r>
+              <w:rPr>
+                <w:rFonts w:ascii="BRH Malayalam Extra" w:hAnsi="BRH Malayalam Extra" w:cs="BRH Malayalam Extra"/>
+                <w:color w:val="000000"/>
+                <w:sz w:val="32"/>
+                <w:szCs w:val="40"/>
+              </w:rPr>
+              <w:t>.</w:t>
+            </w:r>
+            <w:r>
+              <w:rPr>
+                <w:rFonts w:cs="BRH Malayalam Extra"/>
+                <w:color w:val="000000"/>
+                <w:szCs w:val="40"/>
+              </w:rPr>
+              <w:t>12</w:t>
+            </w:r>
+            <w:r>
+              <w:rPr>
+                <w:rFonts w:ascii="BRH Malayalam Extra" w:hAnsi="BRH Malayalam Extra" w:cs="BRH Malayalam Extra"/>
+                <w:color w:val="000000"/>
+                <w:sz w:val="32"/>
+                <w:szCs w:val="40"/>
+              </w:rPr>
+              <w:t>.</w:t>
+            </w:r>
+            <w:r>
+              <w:rPr>
+                <w:rFonts w:cs="BRH Malayalam Extra"/>
+                <w:color w:val="000000"/>
+                <w:szCs w:val="40"/>
+              </w:rPr>
+              <w:t>2</w:t>
+            </w:r>
+            <w:r>
+              <w:rPr>
+                <w:rFonts w:ascii="BRH Malayalam Extra" w:hAnsi="BRH Malayalam Extra" w:cs="BRH Malayalam Extra"/>
+                <w:color w:val="000000"/>
+                <w:sz w:val="32"/>
+                <w:szCs w:val="40"/>
+              </w:rPr>
+              <w:t>(</w:t>
+            </w:r>
+            <w:r>
+              <w:rPr>
+                <w:rFonts w:cs="BRH Malayalam Extra"/>
+                <w:color w:val="000000"/>
+                <w:szCs w:val="40"/>
+              </w:rPr>
+              <w:t>52</w:t>
+            </w:r>
+            <w:r>
+              <w:rPr>
+                <w:rFonts w:ascii="BRH Malayalam Extra" w:hAnsi="BRH Malayalam Extra" w:cs="BRH Malayalam Extra"/>
+                <w:color w:val="000000"/>
+                <w:sz w:val="32"/>
+                <w:szCs w:val="40"/>
+              </w:rPr>
+              <w:t>)</w:t>
+            </w:r>
+            <w:proofErr w:type="gramStart"/>
+            <w:r>
+              <w:rPr>
+                <w:rFonts w:ascii="BRH Malayalam Extra" w:hAnsi="BRH Malayalam Extra" w:cs="BRH Malayalam Extra"/>
+                <w:color w:val="000000"/>
+                <w:sz w:val="32"/>
+                <w:szCs w:val="40"/>
+              </w:rPr>
+              <w:t>-  G</w:t>
+            </w:r>
+            <w:proofErr w:type="gramEnd"/>
+            <w:r>
+              <w:rPr>
+                <w:rFonts w:ascii="BRH Malayalam Extra" w:hAnsi="BRH Malayalam Extra" w:cs="BRH Malayalam Extra"/>
+                <w:color w:val="000000"/>
+                <w:sz w:val="32"/>
+                <w:szCs w:val="40"/>
+                <w:highlight w:val="yellow"/>
+              </w:rPr>
+              <w:t>¥Zõ</w:t>
+            </w:r>
+            <w:r>
+              <w:rPr>
+                <w:rFonts w:ascii="BRH Malayalam Extra" w:hAnsi="BRH Malayalam Extra" w:cs="BRH Malayalam Extra"/>
+                <w:color w:val="000000"/>
+                <w:sz w:val="32"/>
+                <w:szCs w:val="40"/>
+              </w:rPr>
+              <w:t>Zõ— |</w:t>
+            </w:r>
+          </w:p>
+          <w:p>
+            <w:pPr>
+              <w:widowControl w:val="0"/>
+              <w:autoSpaceDE w:val="0"/>
+              <w:autoSpaceDN w:val="0"/>
+              <w:adjustRightInd w:val="0"/>
+              <w:spacing w:before="0" w:line="240" w:lineRule="auto"/>
+              <w:rPr>
+                <w:rFonts w:ascii="BRH Malayalam Extra" w:hAnsi="BRH Malayalam Extra" w:cs="BRH Malayalam Extra"/>
+                <w:color w:val="000000"/>
+                <w:sz w:val="32"/>
+                <w:szCs w:val="40"/>
+              </w:rPr>
+            </w:pPr>
+            <w:r>
+              <w:rPr>
+                <w:rFonts w:ascii="BRH Malayalam Extra" w:hAnsi="BRH Malayalam Extra" w:cs="BRH Malayalam Extra"/>
+                <w:color w:val="000000"/>
+                <w:sz w:val="32"/>
+                <w:szCs w:val="40"/>
+              </w:rPr>
+              <w:t xml:space="preserve">G¥ZõZõx˜ - CZõ— | </w:t>
+            </w:r>
+          </w:p>
+          <w:p>
+            <w:pPr>
+              <w:widowControl w:val="0"/>
+              <w:autoSpaceDE w:val="0"/>
+              <w:autoSpaceDN w:val="0"/>
+              <w:adjustRightInd w:val="0"/>
+              <w:spacing w:before="0" w:line="240" w:lineRule="auto"/>
+              <w:rPr>
+                <w:rFonts w:cs="Latha"/>
+                <w:b/>
+                <w:bCs/>
+                <w:szCs w:val="24"/>
+                <w:cs/>
+                <w:lang w:bidi="ta-IN"/>
+              </w:rPr>
+            </w:pPr>
+          </w:p>
+        </w:tc>
+        <w:tc>
+          <w:tcPr>
+            <w:tcW w:w="7371" w:type="dxa"/>
+          </w:tcPr>
+          <w:p>
+            <w:pPr>
+              <w:widowControl w:val="0"/>
+              <w:autoSpaceDE w:val="0"/>
+              <w:autoSpaceDN w:val="0"/>
+              <w:adjustRightInd w:val="0"/>
+              <w:spacing w:before="0" w:line="240" w:lineRule="auto"/>
+              <w:rPr>
+                <w:rFonts w:ascii="BRH Malayalam Extra" w:hAnsi="BRH Malayalam Extra" w:cs="BRH Malayalam Extra"/>
+                <w:color w:val="000000"/>
+                <w:sz w:val="32"/>
+                <w:szCs w:val="40"/>
+                <w:lang w:val="it-IT"/>
+              </w:rPr>
+            </w:pPr>
+            <w:r>
+              <w:rPr>
+                <w:rFonts w:cs="BRH Malayalam Extra"/>
+                <w:color w:val="000000"/>
+                <w:szCs w:val="40"/>
+                <w:lang w:val="it-IT"/>
+              </w:rPr>
+              <w:t>64</w:t>
+            </w:r>
+            <w:r>
+              <w:rPr>
+                <w:rFonts w:ascii="BRH Malayalam Extra" w:hAnsi="BRH Malayalam Extra" w:cs="BRH Malayalam Extra"/>
+                <w:color w:val="000000"/>
+                <w:sz w:val="32"/>
+                <w:szCs w:val="40"/>
+                <w:lang w:val="it-IT"/>
+              </w:rPr>
+              <w:t>)</w:t>
+            </w:r>
+            <w:r>
+              <w:rPr>
+                <w:rFonts w:ascii="BRH Malayalam Extra" w:hAnsi="BRH Malayalam Extra" w:cs="BRH Malayalam Extra"/>
+                <w:color w:val="000000"/>
+                <w:sz w:val="32"/>
+                <w:szCs w:val="40"/>
+                <w:lang w:val="it-IT"/>
+              </w:rPr>
+              <w:tab/>
+            </w:r>
+            <w:r>
+              <w:rPr>
+                <w:rFonts w:cs="BRH Malayalam Extra"/>
+                <w:color w:val="000000"/>
+                <w:szCs w:val="40"/>
+                <w:lang w:val="it-IT"/>
+              </w:rPr>
+              <w:t>2</w:t>
+            </w:r>
+            <w:r>
+              <w:rPr>
+                <w:rFonts w:ascii="BRH Malayalam Extra" w:hAnsi="BRH Malayalam Extra" w:cs="BRH Malayalam Extra"/>
+                <w:color w:val="000000"/>
+                <w:sz w:val="32"/>
+                <w:szCs w:val="40"/>
+                <w:lang w:val="it-IT"/>
+              </w:rPr>
+              <w:t>.</w:t>
+            </w:r>
+            <w:r>
+              <w:rPr>
+                <w:rFonts w:cs="BRH Malayalam Extra"/>
+                <w:color w:val="000000"/>
+                <w:szCs w:val="40"/>
+                <w:lang w:val="it-IT"/>
+              </w:rPr>
+              <w:t>3</w:t>
+            </w:r>
+            <w:r>
+              <w:rPr>
+                <w:rFonts w:ascii="BRH Malayalam Extra" w:hAnsi="BRH Malayalam Extra" w:cs="BRH Malayalam Extra"/>
+                <w:color w:val="000000"/>
+                <w:sz w:val="32"/>
+                <w:szCs w:val="40"/>
+                <w:lang w:val="it-IT"/>
+              </w:rPr>
+              <w:t>.</w:t>
+            </w:r>
+            <w:r>
+              <w:rPr>
+                <w:rFonts w:cs="BRH Malayalam Extra"/>
+                <w:color w:val="000000"/>
+                <w:szCs w:val="40"/>
+                <w:lang w:val="it-IT"/>
+              </w:rPr>
+              <w:t>12</w:t>
+            </w:r>
+            <w:r>
+              <w:rPr>
+                <w:rFonts w:ascii="BRH Malayalam Extra" w:hAnsi="BRH Malayalam Extra" w:cs="BRH Malayalam Extra"/>
+                <w:color w:val="000000"/>
+                <w:sz w:val="32"/>
+                <w:szCs w:val="40"/>
+                <w:lang w:val="it-IT"/>
+              </w:rPr>
+              <w:t>.</w:t>
+            </w:r>
+            <w:r>
+              <w:rPr>
+                <w:rFonts w:cs="BRH Malayalam Extra"/>
+                <w:color w:val="000000"/>
+                <w:szCs w:val="40"/>
+                <w:lang w:val="it-IT"/>
+              </w:rPr>
+              <w:t>2</w:t>
+            </w:r>
+            <w:r>
+              <w:rPr>
+                <w:rFonts w:ascii="BRH Malayalam Extra" w:hAnsi="BRH Malayalam Extra" w:cs="BRH Malayalam Extra"/>
+                <w:color w:val="000000"/>
+                <w:sz w:val="32"/>
+                <w:szCs w:val="40"/>
+                <w:lang w:val="it-IT"/>
+              </w:rPr>
+              <w:t>(</w:t>
+            </w:r>
+            <w:r>
+              <w:rPr>
+                <w:rFonts w:cs="BRH Malayalam Extra"/>
+                <w:color w:val="000000"/>
+                <w:szCs w:val="40"/>
+                <w:lang w:val="it-IT"/>
+              </w:rPr>
+              <w:t>50</w:t>
+            </w:r>
+            <w:r>
+              <w:rPr>
+                <w:rFonts w:ascii="BRH Malayalam Extra" w:hAnsi="BRH Malayalam Extra" w:cs="BRH Malayalam Extra"/>
+                <w:color w:val="000000"/>
+                <w:sz w:val="32"/>
+                <w:szCs w:val="40"/>
+                <w:lang w:val="it-IT"/>
+              </w:rPr>
+              <w:t>)-  P</w:t>
+            </w:r>
+            <w:r>
+              <w:rPr>
+                <w:rFonts w:ascii="BRH Malayalam Extra" w:hAnsi="BRH Malayalam Extra" w:cs="BRH Malayalam Extra"/>
+                <w:color w:val="000000"/>
+                <w:sz w:val="26"/>
+                <w:szCs w:val="40"/>
+                <w:lang w:val="it-IT"/>
+              </w:rPr>
+              <w:t>–</w:t>
+            </w:r>
+            <w:r>
+              <w:rPr>
+                <w:rFonts w:ascii="BRH Malayalam Extra" w:hAnsi="BRH Malayalam Extra" w:cs="BRH Malayalam Extra"/>
+                <w:color w:val="000000"/>
+                <w:sz w:val="32"/>
+                <w:szCs w:val="40"/>
+                <w:lang w:val="it-IT"/>
+              </w:rPr>
+              <w:t>k¡I | e¡d—J | G</w:t>
+            </w:r>
+            <w:r>
+              <w:rPr>
+                <w:rFonts w:ascii="BRH Malayalam Extra" w:hAnsi="BRH Malayalam Extra" w:cs="BRH Malayalam Extra"/>
+                <w:color w:val="000000"/>
+                <w:sz w:val="32"/>
+                <w:szCs w:val="40"/>
+                <w:highlight w:val="green"/>
+                <w:lang w:val="it-IT"/>
+              </w:rPr>
+              <w:t>Zõ</w:t>
+            </w:r>
+            <w:r>
+              <w:rPr>
+                <w:rFonts w:ascii="BRH Malayalam Extra" w:hAnsi="BRH Malayalam Extra" w:cs="BRH Malayalam Extra"/>
+                <w:color w:val="000000"/>
+                <w:sz w:val="32"/>
+                <w:szCs w:val="40"/>
+                <w:lang w:val="it-IT"/>
+              </w:rPr>
+              <w:t>— |</w:t>
+            </w:r>
+          </w:p>
+          <w:p>
+            <w:pPr>
+              <w:widowControl w:val="0"/>
+              <w:autoSpaceDE w:val="0"/>
+              <w:autoSpaceDN w:val="0"/>
+              <w:adjustRightInd w:val="0"/>
+              <w:spacing w:before="0" w:line="240" w:lineRule="auto"/>
+              <w:rPr>
+                <w:rFonts w:ascii="BRH Malayalam Extra" w:hAnsi="BRH Malayalam Extra" w:cs="BRH Malayalam Extra"/>
+                <w:color w:val="000000"/>
+                <w:sz w:val="32"/>
+                <w:szCs w:val="40"/>
+                <w:lang w:val="it-IT"/>
+              </w:rPr>
+            </w:pPr>
+            <w:r>
+              <w:rPr>
+                <w:rFonts w:ascii="BRH Malayalam Extra" w:hAnsi="BRH Malayalam Extra" w:cs="BRH Malayalam Extra"/>
+                <w:color w:val="000000"/>
+                <w:sz w:val="32"/>
+                <w:szCs w:val="40"/>
+                <w:lang w:val="it-IT"/>
+              </w:rPr>
+              <w:t>P–k¡I e¡d–J e¡d— Ò–k¡I P–k¡I e¡d</w:t>
+            </w:r>
+            <w:r>
+              <w:rPr>
+                <w:rFonts w:ascii="BRH Malayalam Extra" w:hAnsi="BRH Malayalam Extra" w:cs="BRH Malayalam Extra"/>
+                <w:color w:val="000000"/>
+                <w:sz w:val="32"/>
+                <w:szCs w:val="40"/>
+                <w:lang w:val="it-IT"/>
+              </w:rPr>
+              <w:t xml:space="preserve"> </w:t>
+            </w:r>
+            <w:r>
+              <w:rPr>
+                <w:rFonts w:ascii="BRH Malayalam Extra" w:hAnsi="BRH Malayalam Extra" w:cs="BRH Malayalam Extra"/>
+                <w:color w:val="000000"/>
+                <w:sz w:val="32"/>
+                <w:szCs w:val="40"/>
+                <w:lang w:val="it-IT"/>
+              </w:rPr>
+              <w:t>–¥k</w:t>
+            </w:r>
+            <w:r>
+              <w:rPr>
+                <w:rFonts w:ascii="BRH Malayalam Extra" w:hAnsi="BRH Malayalam Extra" w:cs="BRH Malayalam Extra"/>
+                <w:color w:val="000000"/>
+                <w:sz w:val="32"/>
+                <w:szCs w:val="40"/>
+                <w:highlight w:val="green"/>
+                <w:lang w:val="it-IT"/>
+              </w:rPr>
+              <w:t>¥ZõZõ</w:t>
+            </w:r>
+            <w:r>
+              <w:rPr>
+                <w:rFonts w:ascii="BRH Malayalam Extra" w:hAnsi="BRH Malayalam Extra" w:cs="BRH Malayalam Extra"/>
+                <w:color w:val="000000"/>
+                <w:sz w:val="32"/>
+                <w:szCs w:val="40"/>
+                <w:lang w:val="it-IT"/>
+              </w:rPr>
+              <w:t xml:space="preserve">– </w:t>
+            </w:r>
+          </w:p>
+          <w:p>
+            <w:pPr>
+              <w:widowControl w:val="0"/>
+              <w:autoSpaceDE w:val="0"/>
+              <w:autoSpaceDN w:val="0"/>
+              <w:adjustRightInd w:val="0"/>
+              <w:spacing w:before="0" w:line="240" w:lineRule="auto"/>
+              <w:rPr>
+                <w:rFonts w:ascii="BRH Malayalam Extra" w:hAnsi="BRH Malayalam Extra" w:cs="BRH Malayalam Extra"/>
+                <w:color w:val="000000"/>
+                <w:sz w:val="32"/>
+                <w:szCs w:val="40"/>
+                <w:lang w:val="it-IT"/>
+              </w:rPr>
+            </w:pPr>
+            <w:r>
+              <w:rPr>
+                <w:rFonts w:ascii="BRH Malayalam Extra" w:hAnsi="BRH Malayalam Extra" w:cs="BRH Malayalam Extra"/>
+                <w:color w:val="000000"/>
+                <w:sz w:val="32"/>
+                <w:szCs w:val="40"/>
+                <w:lang w:val="it-IT"/>
+              </w:rPr>
+              <w:t>e¡d— Ò–k¡I P–k¡I e¡d</w:t>
+            </w:r>
+            <w:r>
+              <w:rPr>
+                <w:rFonts w:ascii="BRH Malayalam Extra" w:hAnsi="BRH Malayalam Extra" w:cs="BRH Malayalam Extra"/>
+                <w:color w:val="000000"/>
+                <w:sz w:val="32"/>
+                <w:szCs w:val="40"/>
+                <w:highlight w:val="green"/>
+                <w:lang w:val="it-IT"/>
+              </w:rPr>
+              <w:t>–¥kZõ</w:t>
+            </w:r>
+            <w:r>
+              <w:rPr>
+                <w:rFonts w:ascii="BRH Malayalam Extra" w:hAnsi="BRH Malayalam Extra" w:cs="BRH Malayalam Extra"/>
+                <w:color w:val="000000"/>
+                <w:sz w:val="32"/>
+                <w:szCs w:val="40"/>
+                <w:lang w:val="it-IT"/>
+              </w:rPr>
+              <w:t>— |</w:t>
+            </w:r>
+            <w:r>
+              <w:rPr>
+                <w:rFonts w:ascii="BRH Malayalam Extra" w:hAnsi="BRH Malayalam Extra" w:cs="BRH Malayalam Extra"/>
+                <w:color w:val="000000"/>
+                <w:sz w:val="32"/>
+                <w:szCs w:val="40"/>
+                <w:lang w:val="it-IT"/>
+              </w:rPr>
+              <w:tab/>
+              <w:t xml:space="preserve"> </w:t>
+            </w:r>
+            <w:r>
+              <w:rPr>
+                <w:rFonts w:ascii="BRH Malayalam Extra" w:hAnsi="BRH Malayalam Extra" w:cs="BRH Malayalam Extra"/>
+                <w:color w:val="000000"/>
+                <w:sz w:val="32"/>
+                <w:szCs w:val="40"/>
+                <w:lang w:val="it-IT"/>
+              </w:rPr>
+              <w:tab/>
+              <w:t xml:space="preserve"> </w:t>
+            </w:r>
+          </w:p>
+          <w:p>
+            <w:pPr>
+              <w:widowControl w:val="0"/>
+              <w:autoSpaceDE w:val="0"/>
+              <w:autoSpaceDN w:val="0"/>
+              <w:adjustRightInd w:val="0"/>
+              <w:spacing w:before="0" w:line="240" w:lineRule="auto"/>
+              <w:rPr>
+                <w:rFonts w:ascii="BRH Malayalam Extra" w:hAnsi="BRH Malayalam Extra" w:cs="BRH Malayalam Extra"/>
+                <w:color w:val="000000"/>
+                <w:sz w:val="32"/>
+                <w:szCs w:val="40"/>
+                <w:lang w:val="it-IT"/>
+              </w:rPr>
+            </w:pPr>
+            <w:r>
+              <w:rPr>
+                <w:rFonts w:cs="BRH Malayalam Extra"/>
+                <w:color w:val="000000"/>
+                <w:szCs w:val="40"/>
+                <w:lang w:val="it-IT"/>
+              </w:rPr>
+              <w:t>65</w:t>
+            </w:r>
+            <w:r>
+              <w:rPr>
+                <w:rFonts w:ascii="BRH Malayalam Extra" w:hAnsi="BRH Malayalam Extra" w:cs="BRH Malayalam Extra"/>
+                <w:color w:val="000000"/>
+                <w:sz w:val="32"/>
+                <w:szCs w:val="40"/>
+                <w:lang w:val="it-IT"/>
+              </w:rPr>
+              <w:t>)</w:t>
+            </w:r>
+            <w:r>
+              <w:rPr>
+                <w:rFonts w:ascii="BRH Malayalam Extra" w:hAnsi="BRH Malayalam Extra" w:cs="BRH Malayalam Extra"/>
+                <w:color w:val="000000"/>
+                <w:sz w:val="32"/>
+                <w:szCs w:val="40"/>
+                <w:lang w:val="it-IT"/>
+              </w:rPr>
+              <w:tab/>
+            </w:r>
+            <w:r>
+              <w:rPr>
+                <w:rFonts w:cs="BRH Malayalam Extra"/>
+                <w:color w:val="000000"/>
+                <w:szCs w:val="40"/>
+                <w:lang w:val="it-IT"/>
+              </w:rPr>
+              <w:t>2</w:t>
+            </w:r>
+            <w:r>
+              <w:rPr>
+                <w:rFonts w:ascii="BRH Malayalam Extra" w:hAnsi="BRH Malayalam Extra" w:cs="BRH Malayalam Extra"/>
+                <w:color w:val="000000"/>
+                <w:sz w:val="32"/>
+                <w:szCs w:val="40"/>
+                <w:lang w:val="it-IT"/>
+              </w:rPr>
+              <w:t>.</w:t>
+            </w:r>
+            <w:r>
+              <w:rPr>
+                <w:rFonts w:cs="BRH Malayalam Extra"/>
+                <w:color w:val="000000"/>
+                <w:szCs w:val="40"/>
+                <w:lang w:val="it-IT"/>
+              </w:rPr>
+              <w:t>3</w:t>
+            </w:r>
+            <w:r>
+              <w:rPr>
+                <w:rFonts w:ascii="BRH Malayalam Extra" w:hAnsi="BRH Malayalam Extra" w:cs="BRH Malayalam Extra"/>
+                <w:color w:val="000000"/>
+                <w:sz w:val="32"/>
+                <w:szCs w:val="40"/>
+                <w:lang w:val="it-IT"/>
+              </w:rPr>
+              <w:t>.</w:t>
+            </w:r>
+            <w:r>
+              <w:rPr>
+                <w:rFonts w:cs="BRH Malayalam Extra"/>
+                <w:color w:val="000000"/>
+                <w:szCs w:val="40"/>
+                <w:lang w:val="it-IT"/>
+              </w:rPr>
+              <w:t>12</w:t>
+            </w:r>
+            <w:r>
+              <w:rPr>
+                <w:rFonts w:ascii="BRH Malayalam Extra" w:hAnsi="BRH Malayalam Extra" w:cs="BRH Malayalam Extra"/>
+                <w:color w:val="000000"/>
+                <w:sz w:val="32"/>
+                <w:szCs w:val="40"/>
+                <w:lang w:val="it-IT"/>
+              </w:rPr>
+              <w:t>.</w:t>
+            </w:r>
+            <w:r>
+              <w:rPr>
+                <w:rFonts w:cs="BRH Malayalam Extra"/>
+                <w:color w:val="000000"/>
+                <w:szCs w:val="40"/>
+                <w:lang w:val="it-IT"/>
+              </w:rPr>
+              <w:t>2</w:t>
+            </w:r>
+            <w:r>
+              <w:rPr>
+                <w:rFonts w:ascii="BRH Malayalam Extra" w:hAnsi="BRH Malayalam Extra" w:cs="BRH Malayalam Extra"/>
+                <w:color w:val="000000"/>
+                <w:sz w:val="32"/>
+                <w:szCs w:val="40"/>
+                <w:lang w:val="it-IT"/>
+              </w:rPr>
+              <w:t>(</w:t>
+            </w:r>
+            <w:r>
+              <w:rPr>
+                <w:rFonts w:cs="BRH Malayalam Extra"/>
+                <w:color w:val="000000"/>
+                <w:szCs w:val="40"/>
+                <w:lang w:val="it-IT"/>
+              </w:rPr>
+              <w:t>51</w:t>
+            </w:r>
+            <w:r>
+              <w:rPr>
+                <w:rFonts w:ascii="BRH Malayalam Extra" w:hAnsi="BRH Malayalam Extra" w:cs="BRH Malayalam Extra"/>
+                <w:color w:val="000000"/>
+                <w:sz w:val="32"/>
+                <w:szCs w:val="40"/>
+                <w:lang w:val="it-IT"/>
+              </w:rPr>
+              <w:t>)-  e¡d—J | G</w:t>
+            </w:r>
+            <w:r>
+              <w:rPr>
+                <w:rFonts w:ascii="BRH Malayalam Extra" w:hAnsi="BRH Malayalam Extra" w:cs="BRH Malayalam Extra"/>
+                <w:color w:val="000000"/>
+                <w:sz w:val="32"/>
+                <w:szCs w:val="40"/>
+                <w:highlight w:val="green"/>
+                <w:lang w:val="it-IT"/>
+              </w:rPr>
+              <w:t>Zõ</w:t>
+            </w:r>
+            <w:r>
+              <w:rPr>
+                <w:rFonts w:ascii="BRH Malayalam Extra" w:hAnsi="BRH Malayalam Extra" w:cs="BRH Malayalam Extra"/>
+                <w:color w:val="000000"/>
+                <w:sz w:val="32"/>
+                <w:szCs w:val="40"/>
+                <w:lang w:val="it-IT"/>
+              </w:rPr>
+              <w:t>— |</w:t>
+            </w:r>
+            <w:r>
+              <w:rPr>
+                <w:rFonts w:ascii="BRH Malayalam Extra" w:hAnsi="BRH Malayalam Extra" w:cs="BRH Malayalam Extra"/>
+                <w:color w:val="000000"/>
+                <w:sz w:val="32"/>
+                <w:szCs w:val="40"/>
+                <w:lang w:val="it-IT"/>
+              </w:rPr>
+              <w:t xml:space="preserve"> </w:t>
+            </w:r>
+            <w:r>
+              <w:rPr>
+                <w:rFonts w:ascii="BRH Malayalam Extra" w:hAnsi="BRH Malayalam Extra" w:cs="BRH Malayalam Extra"/>
+                <w:color w:val="000000"/>
+                <w:sz w:val="32"/>
+                <w:szCs w:val="40"/>
+                <w:lang w:val="it-IT"/>
+              </w:rPr>
+              <w:t>dyJ |</w:t>
+            </w:r>
+          </w:p>
+          <w:p>
+            <w:pPr>
+              <w:widowControl w:val="0"/>
+              <w:autoSpaceDE w:val="0"/>
+              <w:autoSpaceDN w:val="0"/>
+              <w:adjustRightInd w:val="0"/>
+              <w:spacing w:before="0" w:line="240" w:lineRule="auto"/>
+              <w:rPr>
+                <w:rFonts w:ascii="BRH Malayalam Extra" w:hAnsi="BRH Malayalam Extra" w:cs="BRH Malayalam Extra"/>
+                <w:color w:val="000000"/>
+                <w:sz w:val="32"/>
+                <w:szCs w:val="40"/>
+                <w:lang w:val="it-IT"/>
+              </w:rPr>
+            </w:pPr>
+            <w:r>
+              <w:rPr>
+                <w:rFonts w:ascii="BRH Malayalam Extra" w:hAnsi="BRH Malayalam Extra" w:cs="BRH Malayalam Extra"/>
+                <w:color w:val="000000"/>
+                <w:sz w:val="32"/>
+                <w:szCs w:val="40"/>
+                <w:lang w:val="it-IT"/>
+              </w:rPr>
+              <w:t>e¡d–¥k</w:t>
+            </w:r>
+            <w:r>
+              <w:rPr>
+                <w:rFonts w:ascii="BRH Malayalam Extra" w:hAnsi="BRH Malayalam Extra" w:cs="BRH Malayalam Extra"/>
+                <w:color w:val="000000"/>
+                <w:sz w:val="32"/>
+                <w:szCs w:val="40"/>
+                <w:highlight w:val="green"/>
+                <w:lang w:val="it-IT"/>
+              </w:rPr>
+              <w:t>¥ZõZõ</w:t>
+            </w:r>
+            <w:r>
+              <w:rPr>
+                <w:rFonts w:ascii="BRH Malayalam Extra" w:hAnsi="BRH Malayalam Extra" w:cs="BRH Malayalam Extra"/>
+                <w:color w:val="000000"/>
+                <w:sz w:val="32"/>
+                <w:szCs w:val="40"/>
+                <w:lang w:val="it-IT"/>
+              </w:rPr>
+              <w:t>– e¡d–J e¡d–¥k</w:t>
+            </w:r>
+            <w:r>
+              <w:rPr>
+                <w:rFonts w:ascii="BRH Malayalam Extra" w:hAnsi="BRH Malayalam Extra" w:cs="BRH Malayalam Extra"/>
+                <w:color w:val="000000"/>
+                <w:sz w:val="32"/>
+                <w:szCs w:val="40"/>
+                <w:highlight w:val="green"/>
+                <w:lang w:val="it-IT"/>
+              </w:rPr>
+              <w:t>Zõ</w:t>
+            </w:r>
+            <w:r>
+              <w:rPr>
+                <w:rFonts w:ascii="BRH Malayalam Extra" w:hAnsi="BRH Malayalam Extra" w:cs="BRH Malayalam Extra"/>
+                <w:color w:val="000000"/>
+                <w:sz w:val="32"/>
+                <w:szCs w:val="40"/>
+                <w:lang w:val="it-IT"/>
+              </w:rPr>
+              <w:t xml:space="preserve">– dyª Yy¥kZõ– </w:t>
+            </w:r>
+          </w:p>
+          <w:p>
+            <w:pPr>
+              <w:widowControl w:val="0"/>
+              <w:autoSpaceDE w:val="0"/>
+              <w:autoSpaceDN w:val="0"/>
+              <w:adjustRightInd w:val="0"/>
+              <w:spacing w:before="0" w:line="240" w:lineRule="auto"/>
+              <w:rPr>
+                <w:rFonts w:ascii="BRH Malayalam Extra" w:hAnsi="BRH Malayalam Extra" w:cs="BRH Malayalam Extra"/>
+                <w:color w:val="000000"/>
+                <w:sz w:val="32"/>
+                <w:szCs w:val="40"/>
+                <w:lang w:val="it-IT"/>
+              </w:rPr>
+            </w:pPr>
+            <w:r>
+              <w:rPr>
+                <w:rFonts w:ascii="BRH Malayalam Extra" w:hAnsi="BRH Malayalam Extra" w:cs="BRH Malayalam Extra"/>
+                <w:color w:val="000000"/>
+                <w:sz w:val="32"/>
+                <w:szCs w:val="40"/>
+                <w:lang w:val="it-IT"/>
+              </w:rPr>
+              <w:t>e¡d–J e¡d–¥k</w:t>
+            </w:r>
+            <w:r>
+              <w:rPr>
+                <w:rFonts w:ascii="BRH Malayalam Extra" w:hAnsi="BRH Malayalam Extra" w:cs="BRH Malayalam Extra"/>
+                <w:color w:val="000000"/>
+                <w:sz w:val="32"/>
+                <w:szCs w:val="40"/>
+                <w:highlight w:val="green"/>
+                <w:lang w:val="it-IT"/>
+              </w:rPr>
+              <w:t>Zõ</w:t>
+            </w:r>
+            <w:r>
+              <w:rPr>
+                <w:rFonts w:ascii="BRH Malayalam Extra" w:hAnsi="BRH Malayalam Extra" w:cs="BRH Malayalam Extra"/>
+                <w:color w:val="000000"/>
+                <w:sz w:val="32"/>
+                <w:szCs w:val="40"/>
+                <w:lang w:val="it-IT"/>
+              </w:rPr>
+              <w:t xml:space="preserve">– dyJ | </w:t>
+            </w:r>
+          </w:p>
+          <w:p>
+            <w:pPr>
+              <w:widowControl w:val="0"/>
+              <w:autoSpaceDE w:val="0"/>
+              <w:autoSpaceDN w:val="0"/>
+              <w:adjustRightInd w:val="0"/>
+              <w:spacing w:before="0" w:line="240" w:lineRule="auto"/>
+              <w:rPr>
+                <w:rFonts w:ascii="BRH Malayalam Extra" w:hAnsi="BRH Malayalam Extra" w:cs="BRH Malayalam Extra"/>
+                <w:color w:val="000000"/>
+                <w:sz w:val="32"/>
+                <w:szCs w:val="40"/>
+                <w:lang w:val="it-IT"/>
+              </w:rPr>
+            </w:pPr>
+            <w:r>
+              <w:rPr>
+                <w:rFonts w:cs="BRH Malayalam Extra"/>
+                <w:color w:val="000000"/>
+                <w:szCs w:val="40"/>
+                <w:lang w:val="it-IT"/>
+              </w:rPr>
+              <w:t>66</w:t>
+            </w:r>
+            <w:r>
+              <w:rPr>
+                <w:rFonts w:ascii="BRH Malayalam Extra" w:hAnsi="BRH Malayalam Extra" w:cs="BRH Malayalam Extra"/>
+                <w:color w:val="000000"/>
+                <w:sz w:val="32"/>
+                <w:szCs w:val="40"/>
+                <w:lang w:val="it-IT"/>
+              </w:rPr>
+              <w:t>)</w:t>
+            </w:r>
+            <w:r>
+              <w:rPr>
+                <w:rFonts w:ascii="BRH Malayalam Extra" w:hAnsi="BRH Malayalam Extra" w:cs="BRH Malayalam Extra"/>
+                <w:color w:val="000000"/>
+                <w:sz w:val="32"/>
+                <w:szCs w:val="40"/>
+                <w:lang w:val="it-IT"/>
+              </w:rPr>
+              <w:tab/>
+            </w:r>
+            <w:r>
+              <w:rPr>
+                <w:rFonts w:cs="BRH Malayalam Extra"/>
+                <w:color w:val="000000"/>
+                <w:szCs w:val="40"/>
+                <w:lang w:val="it-IT"/>
+              </w:rPr>
+              <w:t>2</w:t>
+            </w:r>
+            <w:r>
+              <w:rPr>
+                <w:rFonts w:ascii="BRH Malayalam Extra" w:hAnsi="BRH Malayalam Extra" w:cs="BRH Malayalam Extra"/>
+                <w:color w:val="000000"/>
+                <w:sz w:val="32"/>
+                <w:szCs w:val="40"/>
+                <w:lang w:val="it-IT"/>
+              </w:rPr>
+              <w:t>.</w:t>
+            </w:r>
+            <w:r>
+              <w:rPr>
+                <w:rFonts w:cs="BRH Malayalam Extra"/>
+                <w:color w:val="000000"/>
+                <w:szCs w:val="40"/>
+                <w:lang w:val="it-IT"/>
+              </w:rPr>
+              <w:t>3</w:t>
+            </w:r>
+            <w:r>
+              <w:rPr>
+                <w:rFonts w:ascii="BRH Malayalam Extra" w:hAnsi="BRH Malayalam Extra" w:cs="BRH Malayalam Extra"/>
+                <w:color w:val="000000"/>
+                <w:sz w:val="32"/>
+                <w:szCs w:val="40"/>
+                <w:lang w:val="it-IT"/>
+              </w:rPr>
+              <w:t>.</w:t>
+            </w:r>
+            <w:r>
+              <w:rPr>
+                <w:rFonts w:cs="BRH Malayalam Extra"/>
+                <w:color w:val="000000"/>
+                <w:szCs w:val="40"/>
+                <w:lang w:val="it-IT"/>
+              </w:rPr>
+              <w:t>12</w:t>
+            </w:r>
+            <w:r>
+              <w:rPr>
+                <w:rFonts w:ascii="BRH Malayalam Extra" w:hAnsi="BRH Malayalam Extra" w:cs="BRH Malayalam Extra"/>
+                <w:color w:val="000000"/>
+                <w:sz w:val="32"/>
+                <w:szCs w:val="40"/>
+                <w:lang w:val="it-IT"/>
+              </w:rPr>
+              <w:t>.</w:t>
+            </w:r>
+            <w:r>
+              <w:rPr>
+                <w:rFonts w:cs="BRH Malayalam Extra"/>
+                <w:color w:val="000000"/>
+                <w:szCs w:val="40"/>
+                <w:lang w:val="it-IT"/>
+              </w:rPr>
+              <w:t>2</w:t>
+            </w:r>
+            <w:r>
+              <w:rPr>
+                <w:rFonts w:ascii="BRH Malayalam Extra" w:hAnsi="BRH Malayalam Extra" w:cs="BRH Malayalam Extra"/>
+                <w:color w:val="000000"/>
+                <w:sz w:val="32"/>
+                <w:szCs w:val="40"/>
+                <w:lang w:val="it-IT"/>
+              </w:rPr>
+              <w:t>(</w:t>
+            </w:r>
+            <w:r>
+              <w:rPr>
+                <w:rFonts w:cs="BRH Malayalam Extra"/>
+                <w:color w:val="000000"/>
+                <w:szCs w:val="40"/>
+                <w:lang w:val="it-IT"/>
+              </w:rPr>
+              <w:t>52</w:t>
+            </w:r>
+            <w:r>
+              <w:rPr>
+                <w:rFonts w:ascii="BRH Malayalam Extra" w:hAnsi="BRH Malayalam Extra" w:cs="BRH Malayalam Extra"/>
+                <w:color w:val="000000"/>
+                <w:sz w:val="32"/>
+                <w:szCs w:val="40"/>
+                <w:lang w:val="it-IT"/>
+              </w:rPr>
+              <w:t>)-  G</w:t>
+            </w:r>
+            <w:r>
+              <w:rPr>
+                <w:rFonts w:ascii="BRH Malayalam Extra" w:hAnsi="BRH Malayalam Extra" w:cs="BRH Malayalam Extra"/>
+                <w:color w:val="000000"/>
+                <w:sz w:val="32"/>
+                <w:szCs w:val="40"/>
+                <w:highlight w:val="green"/>
+                <w:lang w:val="it-IT"/>
+              </w:rPr>
+              <w:t>Zõ</w:t>
+            </w:r>
+            <w:r>
+              <w:rPr>
+                <w:rFonts w:ascii="BRH Malayalam Extra" w:hAnsi="BRH Malayalam Extra" w:cs="BRH Malayalam Extra"/>
+                <w:color w:val="000000"/>
+                <w:sz w:val="32"/>
+                <w:szCs w:val="40"/>
+                <w:lang w:val="it-IT"/>
+              </w:rPr>
+              <w:t>— |</w:t>
+            </w:r>
+            <w:r>
+              <w:rPr>
+                <w:rFonts w:ascii="BRH Malayalam Extra" w:hAnsi="BRH Malayalam Extra" w:cs="BRH Malayalam Extra"/>
+                <w:color w:val="000000"/>
+                <w:sz w:val="32"/>
+                <w:szCs w:val="40"/>
+                <w:lang w:val="it-IT"/>
+              </w:rPr>
+              <w:t xml:space="preserve"> </w:t>
+            </w:r>
+            <w:r>
+              <w:rPr>
+                <w:rFonts w:ascii="BRH Malayalam Extra" w:hAnsi="BRH Malayalam Extra" w:cs="BRH Malayalam Extra"/>
+                <w:color w:val="000000"/>
+                <w:sz w:val="32"/>
+                <w:szCs w:val="40"/>
+                <w:lang w:val="it-IT"/>
+              </w:rPr>
+              <w:t>dyJ | p</w:t>
+            </w:r>
+            <w:r>
+              <w:rPr>
+                <w:rFonts w:ascii="BRH Malayalam Extra" w:hAnsi="BRH Malayalam Extra" w:cs="BRH Malayalam Extra"/>
+                <w:color w:val="000000"/>
+                <w:sz w:val="26"/>
+                <w:szCs w:val="40"/>
+                <w:lang w:val="it-IT"/>
+              </w:rPr>
+              <w:t>–</w:t>
+            </w:r>
+            <w:r>
+              <w:rPr>
+                <w:rFonts w:ascii="BRH Malayalam Extra" w:hAnsi="BRH Malayalam Extra" w:cs="BRH Malayalam Extra"/>
+                <w:color w:val="000000"/>
+                <w:sz w:val="32"/>
+                <w:szCs w:val="40"/>
+                <w:lang w:val="it-IT"/>
+              </w:rPr>
+              <w:t>¥e</w:t>
+            </w:r>
+            <w:r>
+              <w:rPr>
+                <w:rFonts w:ascii="BRH Malayalam Extra" w:hAnsi="BRH Malayalam Extra" w:cs="BRH Malayalam Extra"/>
+                <w:color w:val="000000"/>
+                <w:sz w:val="26"/>
+                <w:szCs w:val="40"/>
+                <w:lang w:val="it-IT"/>
+              </w:rPr>
+              <w:t>–</w:t>
+            </w:r>
+            <w:r>
+              <w:rPr>
+                <w:rFonts w:ascii="BRH Malayalam Extra" w:hAnsi="BRH Malayalam Extra" w:cs="BRH Malayalam Extra"/>
+                <w:color w:val="000000"/>
+                <w:sz w:val="32"/>
+                <w:szCs w:val="40"/>
+                <w:lang w:val="it-IT"/>
+              </w:rPr>
+              <w:t>Z§ |</w:t>
+            </w:r>
+          </w:p>
+          <w:p>
+            <w:pPr>
+              <w:widowControl w:val="0"/>
+              <w:autoSpaceDE w:val="0"/>
+              <w:autoSpaceDN w:val="0"/>
+              <w:adjustRightInd w:val="0"/>
+              <w:spacing w:before="0" w:line="240" w:lineRule="auto"/>
+              <w:rPr>
+                <w:rFonts w:ascii="BRH Malayalam Extra" w:hAnsi="BRH Malayalam Extra" w:cs="BRH Malayalam Extra"/>
+                <w:color w:val="000000"/>
+                <w:sz w:val="32"/>
+                <w:szCs w:val="40"/>
+                <w:lang w:val="it-IT"/>
+              </w:rPr>
+            </w:pPr>
+            <w:r>
+              <w:rPr>
+                <w:rFonts w:ascii="BRH Malayalam Extra" w:hAnsi="BRH Malayalam Extra" w:cs="BRH Malayalam Extra"/>
+                <w:color w:val="000000"/>
+                <w:sz w:val="32"/>
+                <w:szCs w:val="40"/>
+                <w:lang w:val="it-IT"/>
+              </w:rPr>
+              <w:t>GZõ– dyª Yy¥k¥Zõ</w:t>
+            </w:r>
+            <w:r>
+              <w:rPr>
+                <w:rFonts w:ascii="BRH Malayalam Extra" w:hAnsi="BRH Malayalam Extra" w:cs="BRH Malayalam Extra"/>
+                <w:color w:val="000000"/>
+                <w:sz w:val="32"/>
+                <w:szCs w:val="40"/>
+                <w:highlight w:val="green"/>
+                <w:lang w:val="it-IT"/>
+              </w:rPr>
+              <w:t>Zõ</w:t>
+            </w:r>
+            <w:r>
+              <w:rPr>
+                <w:rFonts w:ascii="BRH Malayalam Extra" w:hAnsi="BRH Malayalam Extra" w:cs="BRH Malayalam Extra"/>
+                <w:color w:val="000000"/>
+                <w:sz w:val="32"/>
+                <w:szCs w:val="40"/>
+                <w:lang w:val="it-IT"/>
+              </w:rPr>
+              <w:t>– dyª p—¥eZ§ p¥e–© dy¥k¥Zõ</w:t>
+            </w:r>
+            <w:r>
+              <w:rPr>
+                <w:rFonts w:ascii="BRH Malayalam Extra" w:hAnsi="BRH Malayalam Extra" w:cs="BRH Malayalam Extra"/>
+                <w:color w:val="000000"/>
+                <w:sz w:val="32"/>
+                <w:szCs w:val="40"/>
+                <w:highlight w:val="green"/>
+                <w:lang w:val="it-IT"/>
+              </w:rPr>
+              <w:t>Zõ</w:t>
+            </w:r>
+            <w:r>
+              <w:rPr>
+                <w:rFonts w:ascii="BRH Malayalam Extra" w:hAnsi="BRH Malayalam Extra" w:cs="BRH Malayalam Extra"/>
+                <w:color w:val="000000"/>
+                <w:sz w:val="32"/>
+                <w:szCs w:val="40"/>
+                <w:lang w:val="it-IT"/>
+              </w:rPr>
+              <w:t>– dyª p—¥eZ§ |</w:t>
+            </w:r>
+            <w:r>
+              <w:rPr>
+                <w:rFonts w:ascii="BRH Malayalam Extra" w:hAnsi="BRH Malayalam Extra" w:cs="BRH Malayalam Extra"/>
+                <w:color w:val="000000"/>
+                <w:sz w:val="32"/>
+                <w:szCs w:val="40"/>
+                <w:lang w:val="it-IT"/>
+              </w:rPr>
+              <w:tab/>
+              <w:t xml:space="preserve"> </w:t>
+            </w:r>
+          </w:p>
+          <w:p>
+            <w:pPr>
+              <w:widowControl w:val="0"/>
+              <w:autoSpaceDE w:val="0"/>
+              <w:autoSpaceDN w:val="0"/>
+              <w:adjustRightInd w:val="0"/>
+              <w:spacing w:before="0" w:line="240" w:lineRule="auto"/>
+              <w:rPr>
+                <w:rFonts w:ascii="BRH Malayalam Extra" w:hAnsi="BRH Malayalam Extra" w:cs="BRH Malayalam Extra"/>
+                <w:color w:val="000000"/>
+                <w:sz w:val="32"/>
+                <w:szCs w:val="40"/>
+                <w:lang w:val="it-IT"/>
+              </w:rPr>
+            </w:pPr>
+            <w:r>
+              <w:rPr>
+                <w:rFonts w:cs="BRH Malayalam Extra"/>
+                <w:color w:val="000000"/>
+                <w:szCs w:val="40"/>
+                <w:lang w:val="it-IT"/>
+              </w:rPr>
+              <w:t>67</w:t>
+            </w:r>
+            <w:r>
+              <w:rPr>
+                <w:rFonts w:ascii="BRH Malayalam Extra" w:hAnsi="BRH Malayalam Extra" w:cs="BRH Malayalam Extra"/>
+                <w:color w:val="000000"/>
+                <w:sz w:val="32"/>
+                <w:szCs w:val="40"/>
+                <w:lang w:val="it-IT"/>
+              </w:rPr>
+              <w:t>)</w:t>
+            </w:r>
+            <w:r>
+              <w:rPr>
+                <w:rFonts w:ascii="BRH Malayalam Extra" w:hAnsi="BRH Malayalam Extra" w:cs="BRH Malayalam Extra"/>
+                <w:color w:val="000000"/>
+                <w:sz w:val="32"/>
+                <w:szCs w:val="40"/>
+                <w:lang w:val="it-IT"/>
+              </w:rPr>
+              <w:tab/>
+            </w:r>
+            <w:r>
+              <w:rPr>
+                <w:rFonts w:cs="BRH Malayalam Extra"/>
+                <w:color w:val="000000"/>
+                <w:szCs w:val="40"/>
+                <w:lang w:val="it-IT"/>
+              </w:rPr>
+              <w:t>2</w:t>
+            </w:r>
+            <w:r>
+              <w:rPr>
+                <w:rFonts w:ascii="BRH Malayalam Extra" w:hAnsi="BRH Malayalam Extra" w:cs="BRH Malayalam Extra"/>
+                <w:color w:val="000000"/>
+                <w:sz w:val="32"/>
+                <w:szCs w:val="40"/>
+                <w:lang w:val="it-IT"/>
+              </w:rPr>
+              <w:t>.</w:t>
+            </w:r>
+            <w:r>
+              <w:rPr>
+                <w:rFonts w:cs="BRH Malayalam Extra"/>
+                <w:color w:val="000000"/>
+                <w:szCs w:val="40"/>
+                <w:lang w:val="it-IT"/>
+              </w:rPr>
+              <w:t>3</w:t>
+            </w:r>
+            <w:r>
+              <w:rPr>
+                <w:rFonts w:ascii="BRH Malayalam Extra" w:hAnsi="BRH Malayalam Extra" w:cs="BRH Malayalam Extra"/>
+                <w:color w:val="000000"/>
+                <w:sz w:val="32"/>
+                <w:szCs w:val="40"/>
+                <w:lang w:val="it-IT"/>
+              </w:rPr>
+              <w:t>.</w:t>
+            </w:r>
+            <w:r>
+              <w:rPr>
+                <w:rFonts w:cs="BRH Malayalam Extra"/>
+                <w:color w:val="000000"/>
+                <w:szCs w:val="40"/>
+                <w:lang w:val="it-IT"/>
+              </w:rPr>
+              <w:t>12</w:t>
+            </w:r>
+            <w:r>
+              <w:rPr>
+                <w:rFonts w:ascii="BRH Malayalam Extra" w:hAnsi="BRH Malayalam Extra" w:cs="BRH Malayalam Extra"/>
+                <w:color w:val="000000"/>
+                <w:sz w:val="32"/>
+                <w:szCs w:val="40"/>
+                <w:lang w:val="it-IT"/>
+              </w:rPr>
+              <w:t>.</w:t>
+            </w:r>
+            <w:r>
+              <w:rPr>
+                <w:rFonts w:cs="BRH Malayalam Extra"/>
+                <w:color w:val="000000"/>
+                <w:szCs w:val="40"/>
+                <w:lang w:val="it-IT"/>
+              </w:rPr>
+              <w:t>2</w:t>
+            </w:r>
+            <w:r>
+              <w:rPr>
+                <w:rFonts w:ascii="BRH Malayalam Extra" w:hAnsi="BRH Malayalam Extra" w:cs="BRH Malayalam Extra"/>
+                <w:color w:val="000000"/>
+                <w:sz w:val="32"/>
+                <w:szCs w:val="40"/>
+                <w:lang w:val="it-IT"/>
+              </w:rPr>
+              <w:t>(</w:t>
+            </w:r>
+            <w:r>
+              <w:rPr>
+                <w:rFonts w:cs="BRH Malayalam Extra"/>
+                <w:color w:val="000000"/>
+                <w:szCs w:val="40"/>
+                <w:lang w:val="it-IT"/>
+              </w:rPr>
+              <w:t>52</w:t>
+            </w:r>
+            <w:r>
+              <w:rPr>
+                <w:rFonts w:ascii="BRH Malayalam Extra" w:hAnsi="BRH Malayalam Extra" w:cs="BRH Malayalam Extra"/>
+                <w:color w:val="000000"/>
+                <w:sz w:val="32"/>
+                <w:szCs w:val="40"/>
+                <w:lang w:val="it-IT"/>
+              </w:rPr>
+              <w:t>)-  G</w:t>
+            </w:r>
+            <w:r>
+              <w:rPr>
+                <w:rFonts w:ascii="BRH Malayalam Extra" w:hAnsi="BRH Malayalam Extra" w:cs="BRH Malayalam Extra"/>
+                <w:color w:val="000000"/>
+                <w:sz w:val="32"/>
+                <w:szCs w:val="40"/>
+                <w:highlight w:val="green"/>
+                <w:lang w:val="it-IT"/>
+              </w:rPr>
+              <w:t>Zõ</w:t>
+            </w:r>
+            <w:r>
+              <w:rPr>
+                <w:rFonts w:ascii="BRH Malayalam Extra" w:hAnsi="BRH Malayalam Extra" w:cs="BRH Malayalam Extra"/>
+                <w:color w:val="000000"/>
+                <w:sz w:val="32"/>
+                <w:szCs w:val="40"/>
+                <w:lang w:val="it-IT"/>
+              </w:rPr>
+              <w:t>— |</w:t>
+            </w:r>
+          </w:p>
+          <w:p>
+            <w:pPr>
+              <w:widowControl w:val="0"/>
+              <w:autoSpaceDE w:val="0"/>
+              <w:autoSpaceDN w:val="0"/>
+              <w:adjustRightInd w:val="0"/>
+              <w:spacing w:before="0" w:line="240" w:lineRule="auto"/>
+              <w:rPr>
+                <w:rFonts w:ascii="BRH Malayalam Extra" w:hAnsi="BRH Malayalam Extra" w:cs="BRH Malayalam Extra"/>
+                <w:color w:val="000000"/>
+                <w:sz w:val="32"/>
+                <w:szCs w:val="40"/>
+                <w:lang w:val="it-IT"/>
+              </w:rPr>
+            </w:pPr>
+            <w:r>
+              <w:rPr>
+                <w:rFonts w:ascii="BRH Malayalam Extra" w:hAnsi="BRH Malayalam Extra" w:cs="BRH Malayalam Extra"/>
+                <w:color w:val="000000"/>
+                <w:sz w:val="32"/>
+                <w:szCs w:val="40"/>
+                <w:lang w:val="it-IT"/>
+              </w:rPr>
+              <w:t xml:space="preserve">G¥ZõZõx˜ - CZõ— | </w:t>
+            </w:r>
+          </w:p>
+          <w:p>
+            <w:pPr>
+              <w:widowControl w:val="0"/>
+              <w:autoSpaceDE w:val="0"/>
+              <w:autoSpaceDN w:val="0"/>
+              <w:adjustRightInd w:val="0"/>
+              <w:spacing w:before="0" w:line="240" w:lineRule="auto"/>
+              <w:rPr>
+                <w:rFonts w:cs="Latha"/>
+                <w:b/>
+                <w:bCs/>
+                <w:szCs w:val="24"/>
+                <w:cs/>
+                <w:lang w:val="it-IT" w:bidi="ta-IN"/>
+              </w:rPr>
+            </w:pPr>
+          </w:p>
+        </w:tc>
+      </w:tr>
+      <w:tr>
+        <w:trPr>
+          <w:trHeight w:val="899"/>
+        </w:trPr>
+        <w:tc>
+          <w:tcPr>
+            <w:tcW w:w="7166" w:type="dxa"/>
+            <w:tcBorders>
+              <w:top w:val="single" w:sz="4" w:space="0" w:color="000000"/>
+              <w:left w:val="single" w:sz="4" w:space="0" w:color="000000"/>
+              <w:bottom w:val="single" w:sz="4" w:space="0" w:color="000000"/>
+              <w:right w:val="single" w:sz="4" w:space="0" w:color="000000"/>
+            </w:tcBorders>
+          </w:tcPr>
+          <w:p>
+            <w:pPr>
+              <w:widowControl w:val="0"/>
+              <w:autoSpaceDE w:val="0"/>
+              <w:autoSpaceDN w:val="0"/>
+              <w:adjustRightInd w:val="0"/>
+              <w:spacing w:before="0" w:line="240" w:lineRule="auto"/>
+              <w:rPr>
+                <w:rFonts w:cs="Latha"/>
+                <w:b/>
+                <w:bCs/>
+                <w:szCs w:val="24"/>
+                <w:cs/>
+                <w:lang w:val="it-IT" w:bidi="ta-IN"/>
+              </w:rPr>
+            </w:pPr>
+          </w:p>
+        </w:tc>
+        <w:tc>
+          <w:tcPr>
+            <w:tcW w:w="7371" w:type="dxa"/>
+            <w:tcBorders>
+              <w:top w:val="single" w:sz="4" w:space="0" w:color="000000"/>
+              <w:left w:val="single" w:sz="4" w:space="0" w:color="000000"/>
+              <w:bottom w:val="single" w:sz="4" w:space="0" w:color="000000"/>
+              <w:right w:val="single" w:sz="4" w:space="0" w:color="000000"/>
+            </w:tcBorders>
+          </w:tcPr>
+          <w:p>
+            <w:pPr>
+              <w:widowControl w:val="0"/>
+              <w:autoSpaceDE w:val="0"/>
+              <w:autoSpaceDN w:val="0"/>
+              <w:adjustRightInd w:val="0"/>
+              <w:spacing w:before="0" w:line="240" w:lineRule="auto"/>
+              <w:rPr>
+                <w:rFonts w:cs="Latha"/>
+                <w:b/>
+                <w:bCs/>
+                <w:szCs w:val="24"/>
+                <w:cs/>
+                <w:lang w:val="it-IT" w:bidi="ta-IN"/>
+              </w:rPr>
+            </w:pPr>
+          </w:p>
+        </w:tc>
+      </w:tr>
+      <w:tr>
+        <w:trPr>
+          <w:trHeight w:val="899"/>
+        </w:trPr>
+        <w:tc>
+          <w:tcPr>
+            <w:tcW w:w="7166" w:type="dxa"/>
+            <w:tcBorders>
+              <w:top w:val="single" w:sz="4" w:space="0" w:color="000000"/>
+              <w:left w:val="single" w:sz="4" w:space="0" w:color="000000"/>
+              <w:bottom w:val="single" w:sz="4" w:space="0" w:color="000000"/>
+              <w:right w:val="single" w:sz="4" w:space="0" w:color="000000"/>
+            </w:tcBorders>
+          </w:tcPr>
+          <w:p>
+            <w:pPr>
+              <w:widowControl w:val="0"/>
+              <w:autoSpaceDE w:val="0"/>
+              <w:autoSpaceDN w:val="0"/>
+              <w:adjustRightInd w:val="0"/>
+              <w:spacing w:before="0" w:line="240" w:lineRule="auto"/>
+              <w:rPr>
+                <w:rFonts w:cs="Latha"/>
+                <w:b/>
+                <w:bCs/>
+                <w:szCs w:val="24"/>
+                <w:cs/>
+                <w:lang w:val="it-IT" w:bidi="ta-IN"/>
+              </w:rPr>
+            </w:pPr>
+          </w:p>
+        </w:tc>
+        <w:tc>
+          <w:tcPr>
+            <w:tcW w:w="7371" w:type="dxa"/>
+            <w:tcBorders>
+              <w:top w:val="single" w:sz="4" w:space="0" w:color="000000"/>
+              <w:left w:val="single" w:sz="4" w:space="0" w:color="000000"/>
+              <w:bottom w:val="single" w:sz="4" w:space="0" w:color="000000"/>
+              <w:right w:val="single" w:sz="4" w:space="0" w:color="000000"/>
+            </w:tcBorders>
+          </w:tcPr>
+          <w:p>
+            <w:pPr>
+              <w:widowControl w:val="0"/>
+              <w:autoSpaceDE w:val="0"/>
+              <w:autoSpaceDN w:val="0"/>
+              <w:adjustRightInd w:val="0"/>
+              <w:spacing w:before="0" w:line="240" w:lineRule="auto"/>
+              <w:rPr>
+                <w:rFonts w:cs="Latha"/>
+                <w:b/>
+                <w:bCs/>
+                <w:szCs w:val="24"/>
+                <w:cs/>
+                <w:lang w:val="it-IT" w:bidi="ta-IN"/>
+              </w:rPr>
+            </w:pPr>
+          </w:p>
+        </w:tc>
+      </w:tr>
+      <w:tr>
+        <w:trPr>
+          <w:trHeight w:val="899"/>
+        </w:trPr>
+        <w:tc>
+          <w:tcPr>
+            <w:tcW w:w="7166" w:type="dxa"/>
+            <w:tcBorders>
+              <w:top w:val="single" w:sz="4" w:space="0" w:color="000000"/>
+              <w:left w:val="single" w:sz="4" w:space="0" w:color="000000"/>
+              <w:bottom w:val="single" w:sz="4" w:space="0" w:color="000000"/>
+              <w:right w:val="single" w:sz="4" w:space="0" w:color="000000"/>
+            </w:tcBorders>
+          </w:tcPr>
+          <w:p>
+            <w:pPr>
+              <w:widowControl w:val="0"/>
+              <w:autoSpaceDE w:val="0"/>
+              <w:autoSpaceDN w:val="0"/>
+              <w:adjustRightInd w:val="0"/>
+              <w:spacing w:before="0" w:line="240" w:lineRule="auto"/>
+              <w:rPr>
+                <w:rFonts w:cs="Latha"/>
+                <w:b/>
+                <w:bCs/>
+                <w:szCs w:val="24"/>
+                <w:cs/>
+                <w:lang w:val="it-IT" w:bidi="ta-IN"/>
+              </w:rPr>
+            </w:pPr>
+          </w:p>
+        </w:tc>
+        <w:tc>
+          <w:tcPr>
+            <w:tcW w:w="7371" w:type="dxa"/>
+            <w:tcBorders>
+              <w:top w:val="single" w:sz="4" w:space="0" w:color="000000"/>
+              <w:left w:val="single" w:sz="4" w:space="0" w:color="000000"/>
+              <w:bottom w:val="single" w:sz="4" w:space="0" w:color="000000"/>
+              <w:right w:val="single" w:sz="4" w:space="0" w:color="000000"/>
+            </w:tcBorders>
+          </w:tcPr>
+          <w:p>
+            <w:pPr>
+              <w:widowControl w:val="0"/>
+              <w:autoSpaceDE w:val="0"/>
+              <w:autoSpaceDN w:val="0"/>
+              <w:adjustRightInd w:val="0"/>
+              <w:spacing w:before="0" w:line="240" w:lineRule="auto"/>
+              <w:rPr>
+                <w:rFonts w:cs="Latha"/>
+                <w:b/>
+                <w:bCs/>
+                <w:szCs w:val="24"/>
+                <w:cs/>
+                <w:lang w:val="it-IT" w:bidi="ta-IN"/>
+              </w:rPr>
+            </w:pPr>
+          </w:p>
+        </w:tc>
+      </w:tr>
+    </w:tbl>
+    <w:p>
+      <w:pPr>
+        <w:spacing w:before="0" w:line="240" w:lineRule="auto"/>
+        <w:jc w:val="center"/>
+        <w:rPr>
+          <w:b/>
+          <w:bCs/>
+          <w:sz w:val="32"/>
+          <w:szCs w:val="32"/>
+          <w:u w:val="single"/>
+          <w:lang w:val="it-IT"/>
+        </w:rPr>
+      </w:pPr>
+    </w:p>
+    <w:p>
+      <w:pPr>
+        <w:spacing w:before="0" w:line="240" w:lineRule="auto"/>
+        <w:jc w:val="center"/>
+        <w:rPr>
+          <w:b/>
+          <w:bCs/>
+          <w:sz w:val="32"/>
+          <w:szCs w:val="32"/>
+          <w:u w:val="single"/>
+          <w:lang w:val="it-IT"/>
+        </w:rPr>
+      </w:pPr>
+    </w:p>
+    <w:p>
+      <w:pPr>
+        <w:spacing w:before="0" w:line="240" w:lineRule="auto"/>
+        <w:jc w:val="center"/>
+        <w:rPr>
+          <w:b/>
+          <w:bCs/>
+          <w:sz w:val="32"/>
+          <w:szCs w:val="32"/>
+          <w:u w:val="single"/>
+          <w:lang w:val="it-IT"/>
+        </w:rPr>
+      </w:pPr>
+    </w:p>
     <w:p>
       <w:pPr>
         <w:spacing w:before="0" w:line="240" w:lineRule="auto"/>
@@ -134,27 +3014,7 @@
           <w:sz w:val="28"/>
           <w:szCs w:val="32"/>
         </w:rPr>
-        <w:t>(</w:t>
-      </w:r>
-      <w:proofErr w:type="gramStart"/>
-      <w:r>
-        <w:rPr>
-          <w:b/>
-          <w:bCs/>
-          <w:sz w:val="28"/>
-          <w:szCs w:val="32"/>
-        </w:rPr>
-        <w:t>ignore</w:t>
-      </w:r>
-      <w:proofErr w:type="gramEnd"/>
-      <w:r>
-        <w:rPr>
-          <w:b/>
-          <w:bCs/>
-          <w:sz w:val="28"/>
-          <w:szCs w:val="32"/>
-        </w:rPr>
-        <w:t xml:space="preserve"> those which are already incorporated in your book’s version and date)</w:t>
+        <w:t>(ignore those which are already incorporated in your book’s version and date)</w:t>
       </w:r>
     </w:p>
     <w:tbl>
@@ -1470,6 +4330,7 @@
                 <w:szCs w:val="40"/>
                 <w:lang w:val="it-IT"/>
               </w:rPr>
+              <w:lastRenderedPageBreak/>
               <w:t>3</w:t>
             </w:r>
             <w:r>
@@ -2210,7 +5071,6 @@
                 <w:szCs w:val="40"/>
                 <w:lang w:val="it-IT"/>
               </w:rPr>
-              <w:lastRenderedPageBreak/>
               <w:t>4</w:t>
             </w:r>
             <w:r>
@@ -3747,6 +6607,7 @@
                 <w:szCs w:val="40"/>
                 <w:lang w:val="it-IT"/>
               </w:rPr>
+              <w:lastRenderedPageBreak/>
               <w:t>3</w:t>
             </w:r>
             <w:r>
@@ -4497,7 +7358,6 @@
                 <w:szCs w:val="40"/>
                 <w:lang w:val="it-IT"/>
               </w:rPr>
-              <w:lastRenderedPageBreak/>
               <w:t>4</w:t>
             </w:r>
             <w:r>
@@ -6529,6 +9389,7 @@
                 <w:szCs w:val="40"/>
                 <w:highlight w:val="yellow"/>
               </w:rPr>
+              <w:lastRenderedPageBreak/>
               <w:t>c</w:t>
             </w:r>
             <w:r>
@@ -7096,6 +9957,7 @@
                 <w:color w:val="000000"/>
                 <w:szCs w:val="40"/>
               </w:rPr>
+              <w:lastRenderedPageBreak/>
               <w:t>24</w:t>
             </w:r>
             <w:r>
@@ -7969,6 +10831,7 @@
                 <w:szCs w:val="40"/>
                 <w:highlight w:val="green"/>
               </w:rPr>
+              <w:lastRenderedPageBreak/>
               <w:t>c—x</w:t>
             </w:r>
             <w:r>
@@ -11417,6 +14280,7 @@
                 <w:color w:val="000000"/>
                 <w:szCs w:val="40"/>
               </w:rPr>
+              <w:lastRenderedPageBreak/>
               <w:t>42</w:t>
             </w:r>
             <w:r>
@@ -12595,18 +15459,7 @@
                 <w:szCs w:val="40"/>
                 <w:lang w:val="en-IN"/>
               </w:rPr>
-              <w:t xml:space="preserve">dy— </w:t>
-            </w:r>
-            <w:r>
-              <w:rPr>
-                <w:rFonts w:ascii="BRH Malayalam Extra" w:hAnsi="BRH Malayalam Extra" w:cs="BRH Malayalam Extra"/>
-                <w:color w:val="000000"/>
-                <w:sz w:val="32"/>
-                <w:szCs w:val="40"/>
-                <w:lang w:val="en-IN"/>
-              </w:rPr>
-              <w:lastRenderedPageBreak/>
-              <w:t>öeZy</w:t>
+              <w:t>dy— öeZy</w:t>
             </w:r>
             <w:r>
               <w:rPr>
@@ -13444,7 +16297,6 @@
                 <w:szCs w:val="40"/>
                 <w:lang w:val="en-IN"/>
               </w:rPr>
-              <w:lastRenderedPageBreak/>
               <w:t>27</w:t>
             </w:r>
             <w:r>
@@ -13945,7 +16797,6 @@
                 <w:szCs w:val="40"/>
                 <w:lang w:val="en-IN"/>
               </w:rPr>
-              <w:lastRenderedPageBreak/>
               <w:t>öeZy</w:t>
             </w:r>
             <w:r>
@@ -16042,7 +18893,6 @@
                 <w:color w:val="000000"/>
                 <w:szCs w:val="40"/>
               </w:rPr>
-              <w:lastRenderedPageBreak/>
               <w:t>32</w:t>
             </w:r>
             <w:r>
@@ -16533,7 +19383,6 @@
                 <w:color w:val="000000"/>
                 <w:szCs w:val="40"/>
               </w:rPr>
-              <w:lastRenderedPageBreak/>
               <w:t>16</w:t>
             </w:r>
             <w:r>
@@ -17797,7 +20646,6 @@
                 <w:color w:val="000000"/>
                 <w:szCs w:val="40"/>
               </w:rPr>
-              <w:lastRenderedPageBreak/>
               <w:t>32</w:t>
             </w:r>
             <w:r>
@@ -18310,7 +21158,6 @@
           <w:szCs w:val="32"/>
           <w:u w:val="single"/>
         </w:rPr>
-        <w:lastRenderedPageBreak/>
         <w:t>==================</w:t>
       </w:r>
     </w:p>
@@ -18458,27 +21305,7 @@
           <w:sz w:val="28"/>
           <w:szCs w:val="32"/>
         </w:rPr>
-        <w:t>(</w:t>
-      </w:r>
-      <w:proofErr w:type="gramStart"/>
-      <w:r>
-        <w:rPr>
-          <w:b/>
-          <w:bCs/>
-          <w:sz w:val="28"/>
-          <w:szCs w:val="32"/>
-        </w:rPr>
-        <w:t>ignore</w:t>
-      </w:r>
-      <w:proofErr w:type="gramEnd"/>
-      <w:r>
-        <w:rPr>
-          <w:b/>
-          <w:bCs/>
-          <w:sz w:val="28"/>
-          <w:szCs w:val="32"/>
-        </w:rPr>
-        <w:t xml:space="preserve"> those which are already incorporated in your book’s version and date)</w:t>
+        <w:t>(ignore those which are already incorporated in your book’s version and date)</w:t>
       </w:r>
     </w:p>
     <w:tbl>
@@ -18521,6 +21348,7 @@
                 <w:sz w:val="32"/>
                 <w:szCs w:val="32"/>
               </w:rPr>
+              <w:lastRenderedPageBreak/>
               <w:t>Section, Paragraph</w:t>
             </w:r>
           </w:p>
@@ -18764,7 +21592,7 @@
 </file>
 
 <file path=word/endnotes.xml><?xml version="1.0" encoding="utf-8"?>
-<w:endnotes xmlns:wpc="http://schemas.microsoft.com/office/word/2010/wordprocessingCanvas" xmlns:cx="http://schemas.microsoft.com/office/drawing/2014/chartex" xmlns:cx1="http://schemas.microsoft.com/office/drawing/2015/9/8/chartex" xmlns:cx2="http://schemas.microsoft.com/office/drawing/2015/10/21/chartex" xmlns:cx3="http://schemas.microsoft.com/office/drawing/2016/5/9/chartex" xmlns:cx4="http://schemas.microsoft.com/office/drawing/2016/5/10/chartex" xmlns:cx5="http://schemas.microsoft.com/office/drawing/2016/5/11/chartex" xmlns:cx6="http://schemas.microsoft.com/office/drawing/2016/5/12/chartex" xmlns:cx7="http://schemas.microsoft.com/office/drawing/2016/5/13/chartex" xmlns:cx8="http://schemas.microsoft.com/office/drawing/2016/5/14/chartex" xmlns:mc="http://schemas.openxmlformats.org/markup-compatibility/2006" xmlns:aink="http://schemas.microsoft.com/office/drawing/2016/ink" xmlns:am3d="http://schemas.microsoft.com/office/drawing/2017/model3d" xmlns:o="urn:schemas-microsoft-com:office:office" xmlns:oel="http://schemas.microsoft.com/office/2019/extlst" xmlns:r="http://schemas.openxmlformats.org/officeDocument/2006/relationships" xmlns:m="http://schemas.openxmlformats.org/officeDocument/2006/math" xmlns:v="urn:schemas-microsoft-com:vml" xmlns:wp14="http://schemas.microsoft.com/office/word/2010/wordprocessingDrawing" xmlns:wp="http://schemas.openxmlformats.org/drawingml/2006/wordprocessingDrawing" xmlns:w10="urn:schemas-microsoft-com:office:word" xmlns:w="http://schemas.openxmlformats.org/wordprocessingml/2006/main" xmlns:w14="http://schemas.microsoft.com/office/word/2010/wordml" xmlns:w15="http://schemas.microsoft.com/office/word/2012/wordml" xmlns:w16cex="http://schemas.microsoft.com/office/word/2018/wordml/cex" xmlns:w16cid="http://schemas.microsoft.com/office/word/2016/wordml/cid" xmlns:w16="http://schemas.microsoft.com/office/word/2018/wordml" xmlns:w16sdtdh="http://schemas.microsoft.com/office/word/2020/wordml/sdtdatahash" xmlns:w16se="http://schemas.microsoft.com/office/word/2015/wordml/symex" xmlns:wpg="http://schemas.microsoft.com/office/word/2010/wordprocessingGroup" xmlns:wpi="http://schemas.microsoft.com/office/word/2010/wordprocessingInk" xmlns:wne="http://schemas.microsoft.com/office/word/2006/wordml" xmlns:wps="http://schemas.microsoft.com/office/word/2010/wordprocessingShape" mc:Ignorable="w14 w15 w16se w16cid w16 w16cex w16sdtdh wp14">
+<w:endnotes xmlns:wpc="http://schemas.microsoft.com/office/word/2010/wordprocessingCanvas" xmlns:cx="http://schemas.microsoft.com/office/drawing/2014/chartex" xmlns:cx1="http://schemas.microsoft.com/office/drawing/2015/9/8/chartex" xmlns:cx2="http://schemas.microsoft.com/office/drawing/2015/10/21/chartex" xmlns:cx3="http://schemas.microsoft.com/office/drawing/2016/5/9/chartex" xmlns:cx4="http://schemas.microsoft.com/office/drawing/2016/5/10/chartex" xmlns:cx5="http://schemas.microsoft.com/office/drawing/2016/5/11/chartex" xmlns:cx6="http://schemas.microsoft.com/office/drawing/2016/5/12/chartex" xmlns:cx7="http://schemas.microsoft.com/office/drawing/2016/5/13/chartex" xmlns:cx8="http://schemas.microsoft.com/office/drawing/2016/5/14/chartex" xmlns:mc="http://schemas.openxmlformats.org/markup-compatibility/2006" xmlns:aink="http://schemas.microsoft.com/office/drawing/2016/ink" xmlns:am3d="http://schemas.microsoft.com/office/drawing/2017/model3d" xmlns:o="urn:schemas-microsoft-com:office:office" xmlns:oel="http://schemas.microsoft.com/office/2019/extlst" xmlns:r="http://schemas.openxmlformats.org/officeDocument/2006/relationships" xmlns:m="http://schemas.openxmlformats.org/officeDocument/2006/math" xmlns:v="urn:schemas-microsoft-com:vml" xmlns:wp14="http://schemas.microsoft.com/office/word/2010/wordprocessingDrawing" xmlns:wp="http://schemas.openxmlformats.org/drawingml/2006/wordprocessingDrawing" xmlns:w10="urn:schemas-microsoft-com:office:word" xmlns:w="http://schemas.openxmlformats.org/wordprocessingml/2006/main" xmlns:w14="http://schemas.microsoft.com/office/word/2010/wordml" xmlns:w15="http://schemas.microsoft.com/office/word/2012/wordml" xmlns:w16cex="http://schemas.microsoft.com/office/word/2018/wordml/cex" xmlns:w16cid="http://schemas.microsoft.com/office/word/2016/wordml/cid" xmlns:w16="http://schemas.microsoft.com/office/word/2018/wordml" xmlns:w16du="http://schemas.microsoft.com/office/word/2023/wordml/word16du" xmlns:w16sdtdh="http://schemas.microsoft.com/office/word/2020/wordml/sdtdatahash" xmlns:w16sdtfl="http://schemas.microsoft.com/office/word/2024/wordml/sdtformatlock" xmlns:w16se="http://schemas.microsoft.com/office/word/2015/wordml/symex" xmlns:wpg="http://schemas.microsoft.com/office/word/2010/wordprocessingGroup" xmlns:wpi="http://schemas.microsoft.com/office/word/2010/wordprocessingInk" xmlns:wne="http://schemas.microsoft.com/office/word/2006/wordml" xmlns:wps="http://schemas.microsoft.com/office/word/2010/wordprocessingShape" mc:Ignorable="w14 w15 w16se w16cid w16 w16cex w16sdtdh w16sdtfl w16du wp14">
   <w:endnote w:type="separator" w:id="-1">
     <w:p>
       <w:pPr>
@@ -18789,7 +21617,7 @@
 </file>
 
 <file path=word/footer1.xml><?xml version="1.0" encoding="utf-8"?>
-<w:ftr xmlns:wpc="http://schemas.microsoft.com/office/word/2010/wordprocessingCanvas" xmlns:cx="http://schemas.microsoft.com/office/drawing/2014/chartex" xmlns:cx1="http://schemas.microsoft.com/office/drawing/2015/9/8/chartex" xmlns:cx2="http://schemas.microsoft.com/office/drawing/2015/10/21/chartex" xmlns:cx3="http://schemas.microsoft.com/office/drawing/2016/5/9/chartex" xmlns:cx4="http://schemas.microsoft.com/office/drawing/2016/5/10/chartex" xmlns:cx5="http://schemas.microsoft.com/office/drawing/2016/5/11/chartex" xmlns:cx6="http://schemas.microsoft.com/office/drawing/2016/5/12/chartex" xmlns:cx7="http://schemas.microsoft.com/office/drawing/2016/5/13/chartex" xmlns:cx8="http://schemas.microsoft.com/office/drawing/2016/5/14/chartex" xmlns:mc="http://schemas.openxmlformats.org/markup-compatibility/2006" xmlns:aink="http://schemas.microsoft.com/office/drawing/2016/ink" xmlns:am3d="http://schemas.microsoft.com/office/drawing/2017/model3d" xmlns:o="urn:schemas-microsoft-com:office:office" xmlns:oel="http://schemas.microsoft.com/office/2019/extlst" xmlns:r="http://schemas.openxmlformats.org/officeDocument/2006/relationships" xmlns:m="http://schemas.openxmlformats.org/officeDocument/2006/math" xmlns:v="urn:schemas-microsoft-com:vml" xmlns:wp14="http://schemas.microsoft.com/office/word/2010/wordprocessingDrawing" xmlns:wp="http://schemas.openxmlformats.org/drawingml/2006/wordprocessingDrawing" xmlns:w10="urn:schemas-microsoft-com:office:word" xmlns:w="http://schemas.openxmlformats.org/wordprocessingml/2006/main" xmlns:w14="http://schemas.microsoft.com/office/word/2010/wordml" xmlns:w15="http://schemas.microsoft.com/office/word/2012/wordml" xmlns:w16cex="http://schemas.microsoft.com/office/word/2018/wordml/cex" xmlns:w16cid="http://schemas.microsoft.com/office/word/2016/wordml/cid" xmlns:w16="http://schemas.microsoft.com/office/word/2018/wordml" xmlns:w16sdtdh="http://schemas.microsoft.com/office/word/2020/wordml/sdtdatahash" xmlns:w16se="http://schemas.microsoft.com/office/word/2015/wordml/symex" xmlns:wpg="http://schemas.microsoft.com/office/word/2010/wordprocessingGroup" xmlns:wpi="http://schemas.microsoft.com/office/word/2010/wordprocessingInk" xmlns:wne="http://schemas.microsoft.com/office/word/2006/wordml" xmlns:wps="http://schemas.microsoft.com/office/word/2010/wordprocessingShape" mc:Ignorable="w14 w15 w16se w16cid w16 w16cex w16sdtdh wp14">
+<w:ftr xmlns:wpc="http://schemas.microsoft.com/office/word/2010/wordprocessingCanvas" xmlns:cx="http://schemas.microsoft.com/office/drawing/2014/chartex" xmlns:cx1="http://schemas.microsoft.com/office/drawing/2015/9/8/chartex" xmlns:cx2="http://schemas.microsoft.com/office/drawing/2015/10/21/chartex" xmlns:cx3="http://schemas.microsoft.com/office/drawing/2016/5/9/chartex" xmlns:cx4="http://schemas.microsoft.com/office/drawing/2016/5/10/chartex" xmlns:cx5="http://schemas.microsoft.com/office/drawing/2016/5/11/chartex" xmlns:cx6="http://schemas.microsoft.com/office/drawing/2016/5/12/chartex" xmlns:cx7="http://schemas.microsoft.com/office/drawing/2016/5/13/chartex" xmlns:cx8="http://schemas.microsoft.com/office/drawing/2016/5/14/chartex" xmlns:mc="http://schemas.openxmlformats.org/markup-compatibility/2006" xmlns:aink="http://schemas.microsoft.com/office/drawing/2016/ink" xmlns:am3d="http://schemas.microsoft.com/office/drawing/2017/model3d" xmlns:o="urn:schemas-microsoft-com:office:office" xmlns:oel="http://schemas.microsoft.com/office/2019/extlst" xmlns:r="http://schemas.openxmlformats.org/officeDocument/2006/relationships" xmlns:m="http://schemas.openxmlformats.org/officeDocument/2006/math" xmlns:v="urn:schemas-microsoft-com:vml" xmlns:wp14="http://schemas.microsoft.com/office/word/2010/wordprocessingDrawing" xmlns:wp="http://schemas.openxmlformats.org/drawingml/2006/wordprocessingDrawing" xmlns:w10="urn:schemas-microsoft-com:office:word" xmlns:w="http://schemas.openxmlformats.org/wordprocessingml/2006/main" xmlns:w14="http://schemas.microsoft.com/office/word/2010/wordml" xmlns:w15="http://schemas.microsoft.com/office/word/2012/wordml" xmlns:w16cex="http://schemas.microsoft.com/office/word/2018/wordml/cex" xmlns:w16cid="http://schemas.microsoft.com/office/word/2016/wordml/cid" xmlns:w16="http://schemas.microsoft.com/office/word/2018/wordml" xmlns:w16du="http://schemas.microsoft.com/office/word/2023/wordml/word16du" xmlns:w16sdtdh="http://schemas.microsoft.com/office/word/2020/wordml/sdtdatahash" xmlns:w16sdtfl="http://schemas.microsoft.com/office/word/2024/wordml/sdtformatlock" xmlns:w16se="http://schemas.microsoft.com/office/word/2015/wordml/symex" xmlns:wpg="http://schemas.microsoft.com/office/word/2010/wordprocessingGroup" xmlns:wpi="http://schemas.microsoft.com/office/word/2010/wordprocessingInk" xmlns:wne="http://schemas.microsoft.com/office/word/2006/wordml" xmlns:wps="http://schemas.microsoft.com/office/word/2010/wordprocessingShape" mc:Ignorable="w14 w15 w16se w16cid w16 w16cex w16sdtdh w16sdtfl w16du wp14">
   <w:p>
     <w:pPr>
       <w:pBdr>
@@ -18974,7 +21802,7 @@
 </file>
 
 <file path=word/footer2.xml><?xml version="1.0" encoding="utf-8"?>
-<w:ftr xmlns:wpc="http://schemas.microsoft.com/office/word/2010/wordprocessingCanvas" xmlns:cx="http://schemas.microsoft.com/office/drawing/2014/chartex" xmlns:cx1="http://schemas.microsoft.com/office/drawing/2015/9/8/chartex" xmlns:cx2="http://schemas.microsoft.com/office/drawing/2015/10/21/chartex" xmlns:cx3="http://schemas.microsoft.com/office/drawing/2016/5/9/chartex" xmlns:cx4="http://schemas.microsoft.com/office/drawing/2016/5/10/chartex" xmlns:cx5="http://schemas.microsoft.com/office/drawing/2016/5/11/chartex" xmlns:cx6="http://schemas.microsoft.com/office/drawing/2016/5/12/chartex" xmlns:cx7="http://schemas.microsoft.com/office/drawing/2016/5/13/chartex" xmlns:cx8="http://schemas.microsoft.com/office/drawing/2016/5/14/chartex" xmlns:mc="http://schemas.openxmlformats.org/markup-compatibility/2006" xmlns:aink="http://schemas.microsoft.com/office/drawing/2016/ink" xmlns:am3d="http://schemas.microsoft.com/office/drawing/2017/model3d" xmlns:o="urn:schemas-microsoft-com:office:office" xmlns:oel="http://schemas.microsoft.com/office/2019/extlst" xmlns:r="http://schemas.openxmlformats.org/officeDocument/2006/relationships" xmlns:m="http://schemas.openxmlformats.org/officeDocument/2006/math" xmlns:v="urn:schemas-microsoft-com:vml" xmlns:wp14="http://schemas.microsoft.com/office/word/2010/wordprocessingDrawing" xmlns:wp="http://schemas.openxmlformats.org/drawingml/2006/wordprocessingDrawing" xmlns:w10="urn:schemas-microsoft-com:office:word" xmlns:w="http://schemas.openxmlformats.org/wordprocessingml/2006/main" xmlns:w14="http://schemas.microsoft.com/office/word/2010/wordml" xmlns:w15="http://schemas.microsoft.com/office/word/2012/wordml" xmlns:w16cex="http://schemas.microsoft.com/office/word/2018/wordml/cex" xmlns:w16cid="http://schemas.microsoft.com/office/word/2016/wordml/cid" xmlns:w16="http://schemas.microsoft.com/office/word/2018/wordml" xmlns:w16sdtdh="http://schemas.microsoft.com/office/word/2020/wordml/sdtdatahash" xmlns:w16se="http://schemas.microsoft.com/office/word/2015/wordml/symex" xmlns:wpg="http://schemas.microsoft.com/office/word/2010/wordprocessingGroup" xmlns:wpi="http://schemas.microsoft.com/office/word/2010/wordprocessingInk" xmlns:wne="http://schemas.microsoft.com/office/word/2006/wordml" xmlns:wps="http://schemas.microsoft.com/office/word/2010/wordprocessingShape" mc:Ignorable="w14 w15 w16se w16cid w16 w16cex w16sdtdh wp14">
+<w:ftr xmlns:wpc="http://schemas.microsoft.com/office/word/2010/wordprocessingCanvas" xmlns:cx="http://schemas.microsoft.com/office/drawing/2014/chartex" xmlns:cx1="http://schemas.microsoft.com/office/drawing/2015/9/8/chartex" xmlns:cx2="http://schemas.microsoft.com/office/drawing/2015/10/21/chartex" xmlns:cx3="http://schemas.microsoft.com/office/drawing/2016/5/9/chartex" xmlns:cx4="http://schemas.microsoft.com/office/drawing/2016/5/10/chartex" xmlns:cx5="http://schemas.microsoft.com/office/drawing/2016/5/11/chartex" xmlns:cx6="http://schemas.microsoft.com/office/drawing/2016/5/12/chartex" xmlns:cx7="http://schemas.microsoft.com/office/drawing/2016/5/13/chartex" xmlns:cx8="http://schemas.microsoft.com/office/drawing/2016/5/14/chartex" xmlns:mc="http://schemas.openxmlformats.org/markup-compatibility/2006" xmlns:aink="http://schemas.microsoft.com/office/drawing/2016/ink" xmlns:am3d="http://schemas.microsoft.com/office/drawing/2017/model3d" xmlns:o="urn:schemas-microsoft-com:office:office" xmlns:oel="http://schemas.microsoft.com/office/2019/extlst" xmlns:r="http://schemas.openxmlformats.org/officeDocument/2006/relationships" xmlns:m="http://schemas.openxmlformats.org/officeDocument/2006/math" xmlns:v="urn:schemas-microsoft-com:vml" xmlns:wp14="http://schemas.microsoft.com/office/word/2010/wordprocessingDrawing" xmlns:wp="http://schemas.openxmlformats.org/drawingml/2006/wordprocessingDrawing" xmlns:w10="urn:schemas-microsoft-com:office:word" xmlns:w="http://schemas.openxmlformats.org/wordprocessingml/2006/main" xmlns:w14="http://schemas.microsoft.com/office/word/2010/wordml" xmlns:w15="http://schemas.microsoft.com/office/word/2012/wordml" xmlns:w16cex="http://schemas.microsoft.com/office/word/2018/wordml/cex" xmlns:w16cid="http://schemas.microsoft.com/office/word/2016/wordml/cid" xmlns:w16="http://schemas.microsoft.com/office/word/2018/wordml" xmlns:w16du="http://schemas.microsoft.com/office/word/2023/wordml/word16du" xmlns:w16sdtdh="http://schemas.microsoft.com/office/word/2020/wordml/sdtdatahash" xmlns:w16sdtfl="http://schemas.microsoft.com/office/word/2024/wordml/sdtformatlock" xmlns:w16se="http://schemas.microsoft.com/office/word/2015/wordml/symex" xmlns:wpg="http://schemas.microsoft.com/office/word/2010/wordprocessingGroup" xmlns:wpi="http://schemas.microsoft.com/office/word/2010/wordprocessingInk" xmlns:wne="http://schemas.microsoft.com/office/word/2006/wordml" xmlns:wps="http://schemas.microsoft.com/office/word/2010/wordprocessingShape" mc:Ignorable="w14 w15 w16se w16cid w16 w16cex w16sdtdh w16sdtfl w16du wp14">
   <w:p>
     <w:pPr>
       <w:pBdr>
@@ -19180,7 +22008,7 @@
 </file>
 
 <file path=word/footer3.xml><?xml version="1.0" encoding="utf-8"?>
-<w:ftr xmlns:wpc="http://schemas.microsoft.com/office/word/2010/wordprocessingCanvas" xmlns:cx="http://schemas.microsoft.com/office/drawing/2014/chartex" xmlns:cx1="http://schemas.microsoft.com/office/drawing/2015/9/8/chartex" xmlns:cx2="http://schemas.microsoft.com/office/drawing/2015/10/21/chartex" xmlns:cx3="http://schemas.microsoft.com/office/drawing/2016/5/9/chartex" xmlns:cx4="http://schemas.microsoft.com/office/drawing/2016/5/10/chartex" xmlns:cx5="http://schemas.microsoft.com/office/drawing/2016/5/11/chartex" xmlns:cx6="http://schemas.microsoft.com/office/drawing/2016/5/12/chartex" xmlns:cx7="http://schemas.microsoft.com/office/drawing/2016/5/13/chartex" xmlns:cx8="http://schemas.microsoft.com/office/drawing/2016/5/14/chartex" xmlns:mc="http://schemas.openxmlformats.org/markup-compatibility/2006" xmlns:aink="http://schemas.microsoft.com/office/drawing/2016/ink" xmlns:am3d="http://schemas.microsoft.com/office/drawing/2017/model3d" xmlns:o="urn:schemas-microsoft-com:office:office" xmlns:oel="http://schemas.microsoft.com/office/2019/extlst" xmlns:r="http://schemas.openxmlformats.org/officeDocument/2006/relationships" xmlns:m="http://schemas.openxmlformats.org/officeDocument/2006/math" xmlns:v="urn:schemas-microsoft-com:vml" xmlns:wp14="http://schemas.microsoft.com/office/word/2010/wordprocessingDrawing" xmlns:wp="http://schemas.openxmlformats.org/drawingml/2006/wordprocessingDrawing" xmlns:w10="urn:schemas-microsoft-com:office:word" xmlns:w="http://schemas.openxmlformats.org/wordprocessingml/2006/main" xmlns:w14="http://schemas.microsoft.com/office/word/2010/wordml" xmlns:w15="http://schemas.microsoft.com/office/word/2012/wordml" xmlns:w16cex="http://schemas.microsoft.com/office/word/2018/wordml/cex" xmlns:w16cid="http://schemas.microsoft.com/office/word/2016/wordml/cid" xmlns:w16="http://schemas.microsoft.com/office/word/2018/wordml" xmlns:w16sdtdh="http://schemas.microsoft.com/office/word/2020/wordml/sdtdatahash" xmlns:w16se="http://schemas.microsoft.com/office/word/2015/wordml/symex" xmlns:wpg="http://schemas.microsoft.com/office/word/2010/wordprocessingGroup" xmlns:wpi="http://schemas.microsoft.com/office/word/2010/wordprocessingInk" xmlns:wne="http://schemas.microsoft.com/office/word/2006/wordml" xmlns:wps="http://schemas.microsoft.com/office/word/2010/wordprocessingShape" mc:Ignorable="w14 w15 w16se w16cid w16 w16cex w16sdtdh wp14">
+<w:ftr xmlns:wpc="http://schemas.microsoft.com/office/word/2010/wordprocessingCanvas" xmlns:cx="http://schemas.microsoft.com/office/drawing/2014/chartex" xmlns:cx1="http://schemas.microsoft.com/office/drawing/2015/9/8/chartex" xmlns:cx2="http://schemas.microsoft.com/office/drawing/2015/10/21/chartex" xmlns:cx3="http://schemas.microsoft.com/office/drawing/2016/5/9/chartex" xmlns:cx4="http://schemas.microsoft.com/office/drawing/2016/5/10/chartex" xmlns:cx5="http://schemas.microsoft.com/office/drawing/2016/5/11/chartex" xmlns:cx6="http://schemas.microsoft.com/office/drawing/2016/5/12/chartex" xmlns:cx7="http://schemas.microsoft.com/office/drawing/2016/5/13/chartex" xmlns:cx8="http://schemas.microsoft.com/office/drawing/2016/5/14/chartex" xmlns:mc="http://schemas.openxmlformats.org/markup-compatibility/2006" xmlns:aink="http://schemas.microsoft.com/office/drawing/2016/ink" xmlns:am3d="http://schemas.microsoft.com/office/drawing/2017/model3d" xmlns:o="urn:schemas-microsoft-com:office:office" xmlns:oel="http://schemas.microsoft.com/office/2019/extlst" xmlns:r="http://schemas.openxmlformats.org/officeDocument/2006/relationships" xmlns:m="http://schemas.openxmlformats.org/officeDocument/2006/math" xmlns:v="urn:schemas-microsoft-com:vml" xmlns:wp14="http://schemas.microsoft.com/office/word/2010/wordprocessingDrawing" xmlns:wp="http://schemas.openxmlformats.org/drawingml/2006/wordprocessingDrawing" xmlns:w10="urn:schemas-microsoft-com:office:word" xmlns:w="http://schemas.openxmlformats.org/wordprocessingml/2006/main" xmlns:w14="http://schemas.microsoft.com/office/word/2010/wordml" xmlns:w15="http://schemas.microsoft.com/office/word/2012/wordml" xmlns:w16cex="http://schemas.microsoft.com/office/word/2018/wordml/cex" xmlns:w16cid="http://schemas.microsoft.com/office/word/2016/wordml/cid" xmlns:w16="http://schemas.microsoft.com/office/word/2018/wordml" xmlns:w16du="http://schemas.microsoft.com/office/word/2023/wordml/word16du" xmlns:w16sdtdh="http://schemas.microsoft.com/office/word/2020/wordml/sdtdatahash" xmlns:w16sdtfl="http://schemas.microsoft.com/office/word/2024/wordml/sdtformatlock" xmlns:w16se="http://schemas.microsoft.com/office/word/2015/wordml/symex" xmlns:wpg="http://schemas.microsoft.com/office/word/2010/wordprocessingGroup" xmlns:wpi="http://schemas.microsoft.com/office/word/2010/wordprocessingInk" xmlns:wne="http://schemas.microsoft.com/office/word/2006/wordml" xmlns:wps="http://schemas.microsoft.com/office/word/2010/wordprocessingShape" mc:Ignorable="w14 w15 w16se w16cid w16 w16cex w16sdtdh w16sdtfl w16du wp14">
   <w:p>
     <w:pPr>
       <w:pStyle w:val="Footer"/>
@@ -19190,7 +22018,7 @@
 </file>
 
 <file path=word/footnotes.xml><?xml version="1.0" encoding="utf-8"?>
-<w:footnotes xmlns:wpc="http://schemas.microsoft.com/office/word/2010/wordprocessingCanvas" xmlns:cx="http://schemas.microsoft.com/office/drawing/2014/chartex" xmlns:cx1="http://schemas.microsoft.com/office/drawing/2015/9/8/chartex" xmlns:cx2="http://schemas.microsoft.com/office/drawing/2015/10/21/chartex" xmlns:cx3="http://schemas.microsoft.com/office/drawing/2016/5/9/chartex" xmlns:cx4="http://schemas.microsoft.com/office/drawing/2016/5/10/chartex" xmlns:cx5="http://schemas.microsoft.com/office/drawing/2016/5/11/chartex" xmlns:cx6="http://schemas.microsoft.com/office/drawing/2016/5/12/chartex" xmlns:cx7="http://schemas.microsoft.com/office/drawing/2016/5/13/chartex" xmlns:cx8="http://schemas.microsoft.com/office/drawing/2016/5/14/chartex" xmlns:mc="http://schemas.openxmlformats.org/markup-compatibility/2006" xmlns:aink="http://schemas.microsoft.com/office/drawing/2016/ink" xmlns:am3d="http://schemas.microsoft.com/office/drawing/2017/model3d" xmlns:o="urn:schemas-microsoft-com:office:office" xmlns:oel="http://schemas.microsoft.com/office/2019/extlst" xmlns:r="http://schemas.openxmlformats.org/officeDocument/2006/relationships" xmlns:m="http://schemas.openxmlformats.org/officeDocument/2006/math" xmlns:v="urn:schemas-microsoft-com:vml" xmlns:wp14="http://schemas.microsoft.com/office/word/2010/wordprocessingDrawing" xmlns:wp="http://schemas.openxmlformats.org/drawingml/2006/wordprocessingDrawing" xmlns:w10="urn:schemas-microsoft-com:office:word" xmlns:w="http://schemas.openxmlformats.org/wordprocessingml/2006/main" xmlns:w14="http://schemas.microsoft.com/office/word/2010/wordml" xmlns:w15="http://schemas.microsoft.com/office/word/2012/wordml" xmlns:w16cex="http://schemas.microsoft.com/office/word/2018/wordml/cex" xmlns:w16cid="http://schemas.microsoft.com/office/word/2016/wordml/cid" xmlns:w16="http://schemas.microsoft.com/office/word/2018/wordml" xmlns:w16sdtdh="http://schemas.microsoft.com/office/word/2020/wordml/sdtdatahash" xmlns:w16se="http://schemas.microsoft.com/office/word/2015/wordml/symex" xmlns:wpg="http://schemas.microsoft.com/office/word/2010/wordprocessingGroup" xmlns:wpi="http://schemas.microsoft.com/office/word/2010/wordprocessingInk" xmlns:wne="http://schemas.microsoft.com/office/word/2006/wordml" xmlns:wps="http://schemas.microsoft.com/office/word/2010/wordprocessingShape" mc:Ignorable="w14 w15 w16se w16cid w16 w16cex w16sdtdh wp14">
+<w:footnotes xmlns:wpc="http://schemas.microsoft.com/office/word/2010/wordprocessingCanvas" xmlns:cx="http://schemas.microsoft.com/office/drawing/2014/chartex" xmlns:cx1="http://schemas.microsoft.com/office/drawing/2015/9/8/chartex" xmlns:cx2="http://schemas.microsoft.com/office/drawing/2015/10/21/chartex" xmlns:cx3="http://schemas.microsoft.com/office/drawing/2016/5/9/chartex" xmlns:cx4="http://schemas.microsoft.com/office/drawing/2016/5/10/chartex" xmlns:cx5="http://schemas.microsoft.com/office/drawing/2016/5/11/chartex" xmlns:cx6="http://schemas.microsoft.com/office/drawing/2016/5/12/chartex" xmlns:cx7="http://schemas.microsoft.com/office/drawing/2016/5/13/chartex" xmlns:cx8="http://schemas.microsoft.com/office/drawing/2016/5/14/chartex" xmlns:mc="http://schemas.openxmlformats.org/markup-compatibility/2006" xmlns:aink="http://schemas.microsoft.com/office/drawing/2016/ink" xmlns:am3d="http://schemas.microsoft.com/office/drawing/2017/model3d" xmlns:o="urn:schemas-microsoft-com:office:office" xmlns:oel="http://schemas.microsoft.com/office/2019/extlst" xmlns:r="http://schemas.openxmlformats.org/officeDocument/2006/relationships" xmlns:m="http://schemas.openxmlformats.org/officeDocument/2006/math" xmlns:v="urn:schemas-microsoft-com:vml" xmlns:wp14="http://schemas.microsoft.com/office/word/2010/wordprocessingDrawing" xmlns:wp="http://schemas.openxmlformats.org/drawingml/2006/wordprocessingDrawing" xmlns:w10="urn:schemas-microsoft-com:office:word" xmlns:w="http://schemas.openxmlformats.org/wordprocessingml/2006/main" xmlns:w14="http://schemas.microsoft.com/office/word/2010/wordml" xmlns:w15="http://schemas.microsoft.com/office/word/2012/wordml" xmlns:w16cex="http://schemas.microsoft.com/office/word/2018/wordml/cex" xmlns:w16cid="http://schemas.microsoft.com/office/word/2016/wordml/cid" xmlns:w16="http://schemas.microsoft.com/office/word/2018/wordml" xmlns:w16du="http://schemas.microsoft.com/office/word/2023/wordml/word16du" xmlns:w16sdtdh="http://schemas.microsoft.com/office/word/2020/wordml/sdtdatahash" xmlns:w16sdtfl="http://schemas.microsoft.com/office/word/2024/wordml/sdtformatlock" xmlns:w16se="http://schemas.microsoft.com/office/word/2015/wordml/symex" xmlns:wpg="http://schemas.microsoft.com/office/word/2010/wordprocessingGroup" xmlns:wpi="http://schemas.microsoft.com/office/word/2010/wordprocessingInk" xmlns:wne="http://schemas.microsoft.com/office/word/2006/wordml" xmlns:wps="http://schemas.microsoft.com/office/word/2010/wordprocessingShape" mc:Ignorable="w14 w15 w16se w16cid w16 w16cex w16sdtdh w16sdtfl w16du wp14">
   <w:footnote w:type="separator" w:id="-1">
     <w:p>
       <w:pPr>
@@ -19215,7 +22043,7 @@
 </file>
 
 <file path=word/header1.xml><?xml version="1.0" encoding="utf-8"?>
-<w:hdr xmlns:wpc="http://schemas.microsoft.com/office/word/2010/wordprocessingCanvas" xmlns:cx="http://schemas.microsoft.com/office/drawing/2014/chartex" xmlns:cx1="http://schemas.microsoft.com/office/drawing/2015/9/8/chartex" xmlns:cx2="http://schemas.microsoft.com/office/drawing/2015/10/21/chartex" xmlns:cx3="http://schemas.microsoft.com/office/drawing/2016/5/9/chartex" xmlns:cx4="http://schemas.microsoft.com/office/drawing/2016/5/10/chartex" xmlns:cx5="http://schemas.microsoft.com/office/drawing/2016/5/11/chartex" xmlns:cx6="http://schemas.microsoft.com/office/drawing/2016/5/12/chartex" xmlns:cx7="http://schemas.microsoft.com/office/drawing/2016/5/13/chartex" xmlns:cx8="http://schemas.microsoft.com/office/drawing/2016/5/14/chartex" xmlns:mc="http://schemas.openxmlformats.org/markup-compatibility/2006" xmlns:aink="http://schemas.microsoft.com/office/drawing/2016/ink" xmlns:am3d="http://schemas.microsoft.com/office/drawing/2017/model3d" xmlns:o="urn:schemas-microsoft-com:office:office" xmlns:oel="http://schemas.microsoft.com/office/2019/extlst" xmlns:r="http://schemas.openxmlformats.org/officeDocument/2006/relationships" xmlns:m="http://schemas.openxmlformats.org/officeDocument/2006/math" xmlns:v="urn:schemas-microsoft-com:vml" xmlns:wp14="http://schemas.microsoft.com/office/word/2010/wordprocessingDrawing" xmlns:wp="http://schemas.openxmlformats.org/drawingml/2006/wordprocessingDrawing" xmlns:w10="urn:schemas-microsoft-com:office:word" xmlns:w="http://schemas.openxmlformats.org/wordprocessingml/2006/main" xmlns:w14="http://schemas.microsoft.com/office/word/2010/wordml" xmlns:w15="http://schemas.microsoft.com/office/word/2012/wordml" xmlns:w16cex="http://schemas.microsoft.com/office/word/2018/wordml/cex" xmlns:w16cid="http://schemas.microsoft.com/office/word/2016/wordml/cid" xmlns:w16="http://schemas.microsoft.com/office/word/2018/wordml" xmlns:w16sdtdh="http://schemas.microsoft.com/office/word/2020/wordml/sdtdatahash" xmlns:w16se="http://schemas.microsoft.com/office/word/2015/wordml/symex" xmlns:wpg="http://schemas.microsoft.com/office/word/2010/wordprocessingGroup" xmlns:wpi="http://schemas.microsoft.com/office/word/2010/wordprocessingInk" xmlns:wne="http://schemas.microsoft.com/office/word/2006/wordml" xmlns:wps="http://schemas.microsoft.com/office/word/2010/wordprocessingShape" mc:Ignorable="w14 w15 w16se w16cid w16 w16cex w16sdtdh wp14">
+<w:hdr xmlns:wpc="http://schemas.microsoft.com/office/word/2010/wordprocessingCanvas" xmlns:cx="http://schemas.microsoft.com/office/drawing/2014/chartex" xmlns:cx1="http://schemas.microsoft.com/office/drawing/2015/9/8/chartex" xmlns:cx2="http://schemas.microsoft.com/office/drawing/2015/10/21/chartex" xmlns:cx3="http://schemas.microsoft.com/office/drawing/2016/5/9/chartex" xmlns:cx4="http://schemas.microsoft.com/office/drawing/2016/5/10/chartex" xmlns:cx5="http://schemas.microsoft.com/office/drawing/2016/5/11/chartex" xmlns:cx6="http://schemas.microsoft.com/office/drawing/2016/5/12/chartex" xmlns:cx7="http://schemas.microsoft.com/office/drawing/2016/5/13/chartex" xmlns:cx8="http://schemas.microsoft.com/office/drawing/2016/5/14/chartex" xmlns:mc="http://schemas.openxmlformats.org/markup-compatibility/2006" xmlns:aink="http://schemas.microsoft.com/office/drawing/2016/ink" xmlns:am3d="http://schemas.microsoft.com/office/drawing/2017/model3d" xmlns:o="urn:schemas-microsoft-com:office:office" xmlns:oel="http://schemas.microsoft.com/office/2019/extlst" xmlns:r="http://schemas.openxmlformats.org/officeDocument/2006/relationships" xmlns:m="http://schemas.openxmlformats.org/officeDocument/2006/math" xmlns:v="urn:schemas-microsoft-com:vml" xmlns:wp14="http://schemas.microsoft.com/office/word/2010/wordprocessingDrawing" xmlns:wp="http://schemas.openxmlformats.org/drawingml/2006/wordprocessingDrawing" xmlns:w10="urn:schemas-microsoft-com:office:word" xmlns:w="http://schemas.openxmlformats.org/wordprocessingml/2006/main" xmlns:w14="http://schemas.microsoft.com/office/word/2010/wordml" xmlns:w15="http://schemas.microsoft.com/office/word/2012/wordml" xmlns:w16cex="http://schemas.microsoft.com/office/word/2018/wordml/cex" xmlns:w16cid="http://schemas.microsoft.com/office/word/2016/wordml/cid" xmlns:w16="http://schemas.microsoft.com/office/word/2018/wordml" xmlns:w16du="http://schemas.microsoft.com/office/word/2023/wordml/word16du" xmlns:w16sdtdh="http://schemas.microsoft.com/office/word/2020/wordml/sdtdatahash" xmlns:w16sdtfl="http://schemas.microsoft.com/office/word/2024/wordml/sdtformatlock" xmlns:w16se="http://schemas.microsoft.com/office/word/2015/wordml/symex" xmlns:wpg="http://schemas.microsoft.com/office/word/2010/wordprocessingGroup" xmlns:wpi="http://schemas.microsoft.com/office/word/2010/wordprocessingInk" xmlns:wne="http://schemas.microsoft.com/office/word/2006/wordml" xmlns:wps="http://schemas.microsoft.com/office/word/2010/wordprocessingShape" mc:Ignorable="w14 w15 w16se w16cid w16 w16cex w16sdtdh w16sdtfl w16du wp14">
   <w:p>
     <w:pPr>
       <w:pStyle w:val="Header"/>
@@ -19236,7 +22064,7 @@
 </file>
 
 <file path=word/header2.xml><?xml version="1.0" encoding="utf-8"?>
-<w:hdr xmlns:wpc="http://schemas.microsoft.com/office/word/2010/wordprocessingCanvas" xmlns:cx="http://schemas.microsoft.com/office/drawing/2014/chartex" xmlns:cx1="http://schemas.microsoft.com/office/drawing/2015/9/8/chartex" xmlns:cx2="http://schemas.microsoft.com/office/drawing/2015/10/21/chartex" xmlns:cx3="http://schemas.microsoft.com/office/drawing/2016/5/9/chartex" xmlns:cx4="http://schemas.microsoft.com/office/drawing/2016/5/10/chartex" xmlns:cx5="http://schemas.microsoft.com/office/drawing/2016/5/11/chartex" xmlns:cx6="http://schemas.microsoft.com/office/drawing/2016/5/12/chartex" xmlns:cx7="http://schemas.microsoft.com/office/drawing/2016/5/13/chartex" xmlns:cx8="http://schemas.microsoft.com/office/drawing/2016/5/14/chartex" xmlns:mc="http://schemas.openxmlformats.org/markup-compatibility/2006" xmlns:aink="http://schemas.microsoft.com/office/drawing/2016/ink" xmlns:am3d="http://schemas.microsoft.com/office/drawing/2017/model3d" xmlns:o="urn:schemas-microsoft-com:office:office" xmlns:oel="http://schemas.microsoft.com/office/2019/extlst" xmlns:r="http://schemas.openxmlformats.org/officeDocument/2006/relationships" xmlns:m="http://schemas.openxmlformats.org/officeDocument/2006/math" xmlns:v="urn:schemas-microsoft-com:vml" xmlns:wp14="http://schemas.microsoft.com/office/word/2010/wordprocessingDrawing" xmlns:wp="http://schemas.openxmlformats.org/drawingml/2006/wordprocessingDrawing" xmlns:w10="urn:schemas-microsoft-com:office:word" xmlns:w="http://schemas.openxmlformats.org/wordprocessingml/2006/main" xmlns:w14="http://schemas.microsoft.com/office/word/2010/wordml" xmlns:w15="http://schemas.microsoft.com/office/word/2012/wordml" xmlns:w16cex="http://schemas.microsoft.com/office/word/2018/wordml/cex" xmlns:w16cid="http://schemas.microsoft.com/office/word/2016/wordml/cid" xmlns:w16="http://schemas.microsoft.com/office/word/2018/wordml" xmlns:w16sdtdh="http://schemas.microsoft.com/office/word/2020/wordml/sdtdatahash" xmlns:w16se="http://schemas.microsoft.com/office/word/2015/wordml/symex" xmlns:wpg="http://schemas.microsoft.com/office/word/2010/wordprocessingGroup" xmlns:wpi="http://schemas.microsoft.com/office/word/2010/wordprocessingInk" xmlns:wne="http://schemas.microsoft.com/office/word/2006/wordml" xmlns:wps="http://schemas.microsoft.com/office/word/2010/wordprocessingShape" mc:Ignorable="w14 w15 w16se w16cid w16 w16cex w16sdtdh wp14">
+<w:hdr xmlns:wpc="http://schemas.microsoft.com/office/word/2010/wordprocessingCanvas" xmlns:cx="http://schemas.microsoft.com/office/drawing/2014/chartex" xmlns:cx1="http://schemas.microsoft.com/office/drawing/2015/9/8/chartex" xmlns:cx2="http://schemas.microsoft.com/office/drawing/2015/10/21/chartex" xmlns:cx3="http://schemas.microsoft.com/office/drawing/2016/5/9/chartex" xmlns:cx4="http://schemas.microsoft.com/office/drawing/2016/5/10/chartex" xmlns:cx5="http://schemas.microsoft.com/office/drawing/2016/5/11/chartex" xmlns:cx6="http://schemas.microsoft.com/office/drawing/2016/5/12/chartex" xmlns:cx7="http://schemas.microsoft.com/office/drawing/2016/5/13/chartex" xmlns:cx8="http://schemas.microsoft.com/office/drawing/2016/5/14/chartex" xmlns:mc="http://schemas.openxmlformats.org/markup-compatibility/2006" xmlns:aink="http://schemas.microsoft.com/office/drawing/2016/ink" xmlns:am3d="http://schemas.microsoft.com/office/drawing/2017/model3d" xmlns:o="urn:schemas-microsoft-com:office:office" xmlns:oel="http://schemas.microsoft.com/office/2019/extlst" xmlns:r="http://schemas.openxmlformats.org/officeDocument/2006/relationships" xmlns:m="http://schemas.openxmlformats.org/officeDocument/2006/math" xmlns:v="urn:schemas-microsoft-com:vml" xmlns:wp14="http://schemas.microsoft.com/office/word/2010/wordprocessingDrawing" xmlns:wp="http://schemas.openxmlformats.org/drawingml/2006/wordprocessingDrawing" xmlns:w10="urn:schemas-microsoft-com:office:word" xmlns:w="http://schemas.openxmlformats.org/wordprocessingml/2006/main" xmlns:w14="http://schemas.microsoft.com/office/word/2010/wordml" xmlns:w15="http://schemas.microsoft.com/office/word/2012/wordml" xmlns:w16cex="http://schemas.microsoft.com/office/word/2018/wordml/cex" xmlns:w16cid="http://schemas.microsoft.com/office/word/2016/wordml/cid" xmlns:w16="http://schemas.microsoft.com/office/word/2018/wordml" xmlns:w16du="http://schemas.microsoft.com/office/word/2023/wordml/word16du" xmlns:w16sdtdh="http://schemas.microsoft.com/office/word/2020/wordml/sdtdatahash" xmlns:w16sdtfl="http://schemas.microsoft.com/office/word/2024/wordml/sdtformatlock" xmlns:w16se="http://schemas.microsoft.com/office/word/2015/wordml/symex" xmlns:wpg="http://schemas.microsoft.com/office/word/2010/wordprocessingGroup" xmlns:wpi="http://schemas.microsoft.com/office/word/2010/wordprocessingInk" xmlns:wne="http://schemas.microsoft.com/office/word/2006/wordml" xmlns:wps="http://schemas.microsoft.com/office/word/2010/wordprocessingShape" mc:Ignorable="w14 w15 w16se w16cid w16 w16cex w16sdtdh w16sdtfl w16du wp14">
   <w:p>
     <w:pPr>
       <w:pStyle w:val="Header"/>
@@ -19249,7 +22077,7 @@
 </file>
 
 <file path=word/header3.xml><?xml version="1.0" encoding="utf-8"?>
-<w:hdr xmlns:wpc="http://schemas.microsoft.com/office/word/2010/wordprocessingCanvas" xmlns:cx="http://schemas.microsoft.com/office/drawing/2014/chartex" xmlns:cx1="http://schemas.microsoft.com/office/drawing/2015/9/8/chartex" xmlns:cx2="http://schemas.microsoft.com/office/drawing/2015/10/21/chartex" xmlns:cx3="http://schemas.microsoft.com/office/drawing/2016/5/9/chartex" xmlns:cx4="http://schemas.microsoft.com/office/drawing/2016/5/10/chartex" xmlns:cx5="http://schemas.microsoft.com/office/drawing/2016/5/11/chartex" xmlns:cx6="http://schemas.microsoft.com/office/drawing/2016/5/12/chartex" xmlns:cx7="http://schemas.microsoft.com/office/drawing/2016/5/13/chartex" xmlns:cx8="http://schemas.microsoft.com/office/drawing/2016/5/14/chartex" xmlns:mc="http://schemas.openxmlformats.org/markup-compatibility/2006" xmlns:aink="http://schemas.microsoft.com/office/drawing/2016/ink" xmlns:am3d="http://schemas.microsoft.com/office/drawing/2017/model3d" xmlns:o="urn:schemas-microsoft-com:office:office" xmlns:oel="http://schemas.microsoft.com/office/2019/extlst" xmlns:r="http://schemas.openxmlformats.org/officeDocument/2006/relationships" xmlns:m="http://schemas.openxmlformats.org/officeDocument/2006/math" xmlns:v="urn:schemas-microsoft-com:vml" xmlns:wp14="http://schemas.microsoft.com/office/word/2010/wordprocessingDrawing" xmlns:wp="http://schemas.openxmlformats.org/drawingml/2006/wordprocessingDrawing" xmlns:w10="urn:schemas-microsoft-com:office:word" xmlns:w="http://schemas.openxmlformats.org/wordprocessingml/2006/main" xmlns:w14="http://schemas.microsoft.com/office/word/2010/wordml" xmlns:w15="http://schemas.microsoft.com/office/word/2012/wordml" xmlns:w16cex="http://schemas.microsoft.com/office/word/2018/wordml/cex" xmlns:w16cid="http://schemas.microsoft.com/office/word/2016/wordml/cid" xmlns:w16="http://schemas.microsoft.com/office/word/2018/wordml" xmlns:w16sdtdh="http://schemas.microsoft.com/office/word/2020/wordml/sdtdatahash" xmlns:w16se="http://schemas.microsoft.com/office/word/2015/wordml/symex" xmlns:wpg="http://schemas.microsoft.com/office/word/2010/wordprocessingGroup" xmlns:wpi="http://schemas.microsoft.com/office/word/2010/wordprocessingInk" xmlns:wne="http://schemas.microsoft.com/office/word/2006/wordml" xmlns:wps="http://schemas.microsoft.com/office/word/2010/wordprocessingShape" mc:Ignorable="w14 w15 w16se w16cid w16 w16cex w16sdtdh wp14">
+<w:hdr xmlns:wpc="http://schemas.microsoft.com/office/word/2010/wordprocessingCanvas" xmlns:cx="http://schemas.microsoft.com/office/drawing/2014/chartex" xmlns:cx1="http://schemas.microsoft.com/office/drawing/2015/9/8/chartex" xmlns:cx2="http://schemas.microsoft.com/office/drawing/2015/10/21/chartex" xmlns:cx3="http://schemas.microsoft.com/office/drawing/2016/5/9/chartex" xmlns:cx4="http://schemas.microsoft.com/office/drawing/2016/5/10/chartex" xmlns:cx5="http://schemas.microsoft.com/office/drawing/2016/5/11/chartex" xmlns:cx6="http://schemas.microsoft.com/office/drawing/2016/5/12/chartex" xmlns:cx7="http://schemas.microsoft.com/office/drawing/2016/5/13/chartex" xmlns:cx8="http://schemas.microsoft.com/office/drawing/2016/5/14/chartex" xmlns:mc="http://schemas.openxmlformats.org/markup-compatibility/2006" xmlns:aink="http://schemas.microsoft.com/office/drawing/2016/ink" xmlns:am3d="http://schemas.microsoft.com/office/drawing/2017/model3d" xmlns:o="urn:schemas-microsoft-com:office:office" xmlns:oel="http://schemas.microsoft.com/office/2019/extlst" xmlns:r="http://schemas.openxmlformats.org/officeDocument/2006/relationships" xmlns:m="http://schemas.openxmlformats.org/officeDocument/2006/math" xmlns:v="urn:schemas-microsoft-com:vml" xmlns:wp14="http://schemas.microsoft.com/office/word/2010/wordprocessingDrawing" xmlns:wp="http://schemas.openxmlformats.org/drawingml/2006/wordprocessingDrawing" xmlns:w10="urn:schemas-microsoft-com:office:word" xmlns:w="http://schemas.openxmlformats.org/wordprocessingml/2006/main" xmlns:w14="http://schemas.microsoft.com/office/word/2010/wordml" xmlns:w15="http://schemas.microsoft.com/office/word/2012/wordml" xmlns:w16cex="http://schemas.microsoft.com/office/word/2018/wordml/cex" xmlns:w16cid="http://schemas.microsoft.com/office/word/2016/wordml/cid" xmlns:w16="http://schemas.microsoft.com/office/word/2018/wordml" xmlns:w16du="http://schemas.microsoft.com/office/word/2023/wordml/word16du" xmlns:w16sdtdh="http://schemas.microsoft.com/office/word/2020/wordml/sdtdatahash" xmlns:w16sdtfl="http://schemas.microsoft.com/office/word/2024/wordml/sdtformatlock" xmlns:w16se="http://schemas.microsoft.com/office/word/2015/wordml/symex" xmlns:wpg="http://schemas.microsoft.com/office/word/2010/wordprocessingGroup" xmlns:wpi="http://schemas.microsoft.com/office/word/2010/wordprocessingInk" xmlns:wne="http://schemas.microsoft.com/office/word/2006/wordml" xmlns:wps="http://schemas.microsoft.com/office/word/2010/wordprocessingShape" mc:Ignorable="w14 w15 w16se w16cid w16 w16cex w16sdtdh w16sdtfl w16du wp14">
   <w:p>
     <w:pPr>
       <w:pStyle w:val="Header"/>
@@ -19259,7 +22087,7 @@
 </file>
 
 <file path=word/styles.xml><?xml version="1.0" encoding="utf-8"?>
-<w:styles xmlns:mc="http://schemas.openxmlformats.org/markup-compatibility/2006" xmlns:r="http://schemas.openxmlformats.org/officeDocument/2006/relationships" xmlns:w="http://schemas.openxmlformats.org/wordprocessingml/2006/main" xmlns:w14="http://schemas.microsoft.com/office/word/2010/wordml" xmlns:w15="http://schemas.microsoft.com/office/word/2012/wordml" xmlns:w16cex="http://schemas.microsoft.com/office/word/2018/wordml/cex" xmlns:w16cid="http://schemas.microsoft.com/office/word/2016/wordml/cid" xmlns:w16="http://schemas.microsoft.com/office/word/2018/wordml" xmlns:w16sdtdh="http://schemas.microsoft.com/office/word/2020/wordml/sdtdatahash" xmlns:w16se="http://schemas.microsoft.com/office/word/2015/wordml/symex" mc:Ignorable="w14 w15 w16se w16cid w16 w16cex w16sdtdh">
+<w:styles xmlns:mc="http://schemas.openxmlformats.org/markup-compatibility/2006" xmlns:r="http://schemas.openxmlformats.org/officeDocument/2006/relationships" xmlns:w="http://schemas.openxmlformats.org/wordprocessingml/2006/main" xmlns:w14="http://schemas.microsoft.com/office/word/2010/wordml" xmlns:w15="http://schemas.microsoft.com/office/word/2012/wordml" xmlns:w16cex="http://schemas.microsoft.com/office/word/2018/wordml/cex" xmlns:w16cid="http://schemas.microsoft.com/office/word/2016/wordml/cid" xmlns:w16="http://schemas.microsoft.com/office/word/2018/wordml" xmlns:w16du="http://schemas.microsoft.com/office/word/2023/wordml/word16du" xmlns:w16sdtdh="http://schemas.microsoft.com/office/word/2020/wordml/sdtdatahash" xmlns:w16sdtfl="http://schemas.microsoft.com/office/word/2024/wordml/sdtformatlock" xmlns:w16se="http://schemas.microsoft.com/office/word/2015/wordml/symex" mc:Ignorable="w14 w15 w16se w16cid w16 w16cex w16sdtdh w16sdtfl w16du">
   <w:docDefaults>
     <w:rPrDefault>
       <w:rPr>

</xml_diff>

<commit_message>
nmv 29 07 2026
</commit_message>
<xml_diff>
--- a/TS Jatai Ghanam Project/TS 2.3/TS 2.3 Ghanam Malayalam Corrections.docx
+++ b/TS Jatai Ghanam Project/TS 2.3/TS 2.3 Ghanam Malayalam Corrections.docx
@@ -1,6 +1,6 @@
 
 <file path=word/document.xml><?xml version="1.0" encoding="utf-8"?>
-<w:document xmlns:wpc="http://schemas.microsoft.com/office/word/2010/wordprocessingCanvas" xmlns:cx="http://schemas.microsoft.com/office/drawing/2014/chartex" xmlns:cx1="http://schemas.microsoft.com/office/drawing/2015/9/8/chartex" xmlns:cx2="http://schemas.microsoft.com/office/drawing/2015/10/21/chartex" xmlns:cx3="http://schemas.microsoft.com/office/drawing/2016/5/9/chartex" xmlns:cx4="http://schemas.microsoft.com/office/drawing/2016/5/10/chartex" xmlns:cx5="http://schemas.microsoft.com/office/drawing/2016/5/11/chartex" xmlns:cx6="http://schemas.microsoft.com/office/drawing/2016/5/12/chartex" xmlns:cx7="http://schemas.microsoft.com/office/drawing/2016/5/13/chartex" xmlns:cx8="http://schemas.microsoft.com/office/drawing/2016/5/14/chartex" xmlns:mc="http://schemas.openxmlformats.org/markup-compatibility/2006" xmlns:aink="http://schemas.microsoft.com/office/drawing/2016/ink" xmlns:am3d="http://schemas.microsoft.com/office/drawing/2017/model3d" xmlns:o="urn:schemas-microsoft-com:office:office" xmlns:oel="http://schemas.microsoft.com/office/2019/extlst" xmlns:r="http://schemas.openxmlformats.org/officeDocument/2006/relationships" xmlns:m="http://schemas.openxmlformats.org/officeDocument/2006/math" xmlns:v="urn:schemas-microsoft-com:vml" xmlns:wp14="http://schemas.microsoft.com/office/word/2010/wordprocessingDrawing" xmlns:wp="http://schemas.openxmlformats.org/drawingml/2006/wordprocessingDrawing" xmlns:w10="urn:schemas-microsoft-com:office:word" xmlns:w="http://schemas.openxmlformats.org/wordprocessingml/2006/main" xmlns:w14="http://schemas.microsoft.com/office/word/2010/wordml" xmlns:w15="http://schemas.microsoft.com/office/word/2012/wordml" xmlns:w16cex="http://schemas.microsoft.com/office/word/2018/wordml/cex" xmlns:w16cid="http://schemas.microsoft.com/office/word/2016/wordml/cid" xmlns:w16="http://schemas.microsoft.com/office/word/2018/wordml" xmlns:w16du="http://schemas.microsoft.com/office/word/2023/wordml/word16du" xmlns:w16sdtdh="http://schemas.microsoft.com/office/word/2020/wordml/sdtdatahash" xmlns:w16sdtfl="http://schemas.microsoft.com/office/word/2024/wordml/sdtformatlock" xmlns:w16se="http://schemas.microsoft.com/office/word/2015/wordml/symex" xmlns:wpg="http://schemas.microsoft.com/office/word/2010/wordprocessingGroup" xmlns:wpi="http://schemas.microsoft.com/office/word/2010/wordprocessingInk" xmlns:wne="http://schemas.microsoft.com/office/word/2006/wordml" xmlns:wps="http://schemas.microsoft.com/office/word/2010/wordprocessingShape" mc:Ignorable="w14 w15 w16se w16cid w16 w16cex w16sdtdh w16sdtfl w16du wp14">
+<w:document xmlns:wpc="http://schemas.microsoft.com/office/word/2010/wordprocessingCanvas" xmlns:cx="http://schemas.microsoft.com/office/drawing/2014/chartex" xmlns:cx1="http://schemas.microsoft.com/office/drawing/2015/9/8/chartex" xmlns:cx2="http://schemas.microsoft.com/office/drawing/2015/10/21/chartex" xmlns:cx3="http://schemas.microsoft.com/office/drawing/2016/5/9/chartex" xmlns:cx4="http://schemas.microsoft.com/office/drawing/2016/5/10/chartex" xmlns:cx5="http://schemas.microsoft.com/office/drawing/2016/5/11/chartex" xmlns:cx6="http://schemas.microsoft.com/office/drawing/2016/5/12/chartex" xmlns:cx7="http://schemas.microsoft.com/office/drawing/2016/5/13/chartex" xmlns:cx8="http://schemas.microsoft.com/office/drawing/2016/5/14/chartex" xmlns:mc="http://schemas.openxmlformats.org/markup-compatibility/2006" xmlns:aink="http://schemas.microsoft.com/office/drawing/2016/ink" xmlns:am3d="http://schemas.microsoft.com/office/drawing/2017/model3d" xmlns:o="urn:schemas-microsoft-com:office:office" xmlns:oel="http://schemas.microsoft.com/office/2019/extlst" xmlns:r="http://schemas.openxmlformats.org/officeDocument/2006/relationships" xmlns:m="http://schemas.openxmlformats.org/officeDocument/2006/math" xmlns:v="urn:schemas-microsoft-com:vml" xmlns:wp14="http://schemas.microsoft.com/office/word/2010/wordprocessingDrawing" xmlns:wp="http://schemas.openxmlformats.org/drawingml/2006/wordprocessingDrawing" xmlns:w10="urn:schemas-microsoft-com:office:word" xmlns:w="http://schemas.openxmlformats.org/wordprocessingml/2006/main" xmlns:w14="http://schemas.microsoft.com/office/word/2010/wordml" xmlns:w15="http://schemas.microsoft.com/office/word/2012/wordml" xmlns:w16cei="http://schemas.microsoft.com/office/word/2026/wordml/cei" xmlns:w16cex="http://schemas.microsoft.com/office/word/2018/wordml/cex" xmlns:w16cid="http://schemas.microsoft.com/office/word/2016/wordml/cid" xmlns:w16="http://schemas.microsoft.com/office/word/2018/wordml" xmlns:w16du="http://schemas.microsoft.com/office/word/2023/wordml/word16du" xmlns:w16sdtdh="http://schemas.microsoft.com/office/word/2020/wordml/sdtdatahash" xmlns:w16sdtfl="http://schemas.microsoft.com/office/word/2024/wordml/sdtformatlock" xmlns:w16se="http://schemas.microsoft.com/office/word/2015/wordml/symex" xmlns:wpg="http://schemas.microsoft.com/office/word/2010/wordprocessingGroup" xmlns:wpi="http://schemas.microsoft.com/office/word/2010/wordprocessingInk" xmlns:wne="http://schemas.microsoft.com/office/word/2006/wordml" xmlns:wps="http://schemas.microsoft.com/office/word/2010/wordprocessingShape" mc:Ignorable="w14 w15 w16se w16cid w16 w16cex w16sdtdh w16sdtfl w16du wp14">
   <w:body>
     <w:p>
       <w:pPr>
@@ -42,17 +42,7 @@
           <w:szCs w:val="32"/>
           <w:u w:val="single"/>
         </w:rPr>
-        <w:t xml:space="preserve"> </w:t>
-      </w:r>
-      <w:r>
-        <w:rPr>
-          <w:b/>
-          <w:bCs/>
-          <w:sz w:val="32"/>
-          <w:szCs w:val="32"/>
-          <w:u w:val="single"/>
-        </w:rPr>
-        <w:t xml:space="preserve">– TS 2.3 Malayalam Corrections – Observed </w:t>
+        <w:t xml:space="preserve"> – TS 2.3 Malayalam Corrections – Observed </w:t>
       </w:r>
       <w:proofErr w:type="gramStart"/>
       <w:r>
@@ -1499,30 +1489,6 @@
               <w:adjustRightInd w:val="0"/>
               <w:spacing w:before="0" w:line="240" w:lineRule="auto"/>
               <w:rPr>
-                <w:rFonts w:ascii="BRH Malayalam Extra" w:hAnsi="BRH Malayalam Extra" w:cs="BRH Malayalam Extra"/>
-                <w:color w:val="000000"/>
-                <w:sz w:val="32"/>
-                <w:szCs w:val="40"/>
-              </w:rPr>
-            </w:pPr>
-            <w:r>
-              <w:rPr>
-                <w:rFonts w:ascii="BRH Malayalam Extra" w:hAnsi="BRH Malayalam Extra" w:cs="BRH Malayalam Extra"/>
-                <w:color w:val="000000"/>
-                <w:sz w:val="32"/>
-                <w:szCs w:val="40"/>
-              </w:rPr>
-              <w:t xml:space="preserve">G¥ZõZõx˜ - CZõ— | </w:t>
-            </w:r>
-          </w:p>
-          <w:p>
-            <w:pPr>
-              <w:widowControl w:val="0"/>
-              <w:autoSpaceDE w:val="0"/>
-              <w:autoSpaceDN w:val="0"/>
-              <w:adjustRightInd w:val="0"/>
-              <w:spacing w:before="0" w:line="240" w:lineRule="auto"/>
-              <w:rPr>
                 <w:rFonts w:cs="Latha"/>
                 <w:b/>
                 <w:bCs/>
@@ -1531,6 +1497,15 @@
                 <w:lang w:bidi="ta-IN"/>
               </w:rPr>
             </w:pPr>
+            <w:r>
+              <w:rPr>
+                <w:rFonts w:ascii="BRH Malayalam Extra" w:hAnsi="BRH Malayalam Extra" w:cs="BRH Malayalam Extra"/>
+                <w:color w:val="000000"/>
+                <w:sz w:val="32"/>
+                <w:szCs w:val="40"/>
+              </w:rPr>
+              <w:t xml:space="preserve">G¥ZõZõx˜ - CZõ— | </w:t>
+            </w:r>
           </w:p>
         </w:tc>
         <w:tc>
@@ -2619,32 +2594,6 @@
               <w:adjustRightInd w:val="0"/>
               <w:spacing w:before="0" w:line="240" w:lineRule="auto"/>
               <w:rPr>
-                <w:rFonts w:ascii="BRH Malayalam Extra" w:hAnsi="BRH Malayalam Extra" w:cs="BRH Malayalam Extra"/>
-                <w:color w:val="000000"/>
-                <w:sz w:val="32"/>
-                <w:szCs w:val="40"/>
-                <w:lang w:val="it-IT"/>
-              </w:rPr>
-            </w:pPr>
-            <w:r>
-              <w:rPr>
-                <w:rFonts w:ascii="BRH Malayalam Extra" w:hAnsi="BRH Malayalam Extra" w:cs="BRH Malayalam Extra"/>
-                <w:color w:val="000000"/>
-                <w:sz w:val="32"/>
-                <w:szCs w:val="40"/>
-                <w:lang w:val="it-IT"/>
-              </w:rPr>
-              <w:t xml:space="preserve">G¥ZõZõx˜ - CZõ— | </w:t>
-            </w:r>
-          </w:p>
-          <w:p>
-            <w:pPr>
-              <w:widowControl w:val="0"/>
-              <w:autoSpaceDE w:val="0"/>
-              <w:autoSpaceDN w:val="0"/>
-              <w:adjustRightInd w:val="0"/>
-              <w:spacing w:before="0" w:line="240" w:lineRule="auto"/>
-              <w:rPr>
                 <w:rFonts w:cs="Latha"/>
                 <w:b/>
                 <w:bCs/>
@@ -2653,6 +2602,16 @@
                 <w:lang w:val="it-IT" w:bidi="ta-IN"/>
               </w:rPr>
             </w:pPr>
+            <w:r>
+              <w:rPr>
+                <w:rFonts w:ascii="BRH Malayalam Extra" w:hAnsi="BRH Malayalam Extra" w:cs="BRH Malayalam Extra"/>
+                <w:color w:val="000000"/>
+                <w:sz w:val="32"/>
+                <w:szCs w:val="40"/>
+                <w:lang w:val="it-IT"/>
+              </w:rPr>
+              <w:t xml:space="preserve">G¥ZõZõx˜ - CZõ— | </w:t>
+            </w:r>
           </w:p>
         </w:tc>
       </w:tr>
@@ -2678,14 +2637,640 @@
               <w:adjustRightInd w:val="0"/>
               <w:spacing w:before="0" w:line="240" w:lineRule="auto"/>
               <w:rPr>
+                <w:rFonts w:ascii="BRH Malayalam Extra" w:hAnsi="BRH Malayalam Extra" w:cs="BRH Malayalam Extra"/>
+                <w:color w:val="000000"/>
+                <w:sz w:val="32"/>
+                <w:szCs w:val="40"/>
+              </w:rPr>
+            </w:pPr>
+            <w:r>
+              <w:rPr>
+                <w:rFonts w:cs="BRH Malayalam Extra"/>
+                <w:color w:val="000000"/>
+                <w:szCs w:val="40"/>
+              </w:rPr>
+              <w:t>64</w:t>
+            </w:r>
+            <w:r>
+              <w:rPr>
+                <w:rFonts w:ascii="BRH Malayalam Extra" w:hAnsi="BRH Malayalam Extra" w:cs="BRH Malayalam Extra"/>
+                <w:color w:val="000000"/>
+                <w:sz w:val="32"/>
+                <w:szCs w:val="40"/>
+              </w:rPr>
+              <w:t>)</w:t>
+            </w:r>
+            <w:r>
+              <w:rPr>
+                <w:rFonts w:ascii="BRH Malayalam Extra" w:hAnsi="BRH Malayalam Extra" w:cs="BRH Malayalam Extra"/>
+                <w:color w:val="000000"/>
+                <w:sz w:val="32"/>
+                <w:szCs w:val="40"/>
+              </w:rPr>
+              <w:tab/>
+            </w:r>
+            <w:r>
+              <w:rPr>
+                <w:rFonts w:cs="BRH Malayalam Extra"/>
+                <w:color w:val="000000"/>
+                <w:szCs w:val="40"/>
+              </w:rPr>
+              <w:t>2</w:t>
+            </w:r>
+            <w:r>
+              <w:rPr>
+                <w:rFonts w:ascii="BRH Malayalam Extra" w:hAnsi="BRH Malayalam Extra" w:cs="BRH Malayalam Extra"/>
+                <w:color w:val="000000"/>
+                <w:sz w:val="32"/>
+                <w:szCs w:val="40"/>
+              </w:rPr>
+              <w:t>.</w:t>
+            </w:r>
+            <w:r>
+              <w:rPr>
+                <w:rFonts w:cs="BRH Malayalam Extra"/>
+                <w:color w:val="000000"/>
+                <w:szCs w:val="40"/>
+              </w:rPr>
+              <w:t>3</w:t>
+            </w:r>
+            <w:r>
+              <w:rPr>
+                <w:rFonts w:ascii="BRH Malayalam Extra" w:hAnsi="BRH Malayalam Extra" w:cs="BRH Malayalam Extra"/>
+                <w:color w:val="000000"/>
+                <w:sz w:val="32"/>
+                <w:szCs w:val="40"/>
+              </w:rPr>
+              <w:t>.</w:t>
+            </w:r>
+            <w:r>
+              <w:rPr>
+                <w:rFonts w:cs="BRH Malayalam Extra"/>
+                <w:color w:val="000000"/>
+                <w:szCs w:val="40"/>
+              </w:rPr>
+              <w:t>5</w:t>
+            </w:r>
+            <w:r>
+              <w:rPr>
+                <w:rFonts w:ascii="BRH Malayalam Extra" w:hAnsi="BRH Malayalam Extra" w:cs="BRH Malayalam Extra"/>
+                <w:color w:val="000000"/>
+                <w:sz w:val="32"/>
+                <w:szCs w:val="40"/>
+              </w:rPr>
+              <w:t>.</w:t>
+            </w:r>
+            <w:r>
+              <w:rPr>
+                <w:rFonts w:cs="BRH Malayalam Extra"/>
+                <w:color w:val="000000"/>
+                <w:szCs w:val="40"/>
+              </w:rPr>
+              <w:t>3</w:t>
+            </w:r>
+            <w:r>
+              <w:rPr>
+                <w:rFonts w:ascii="BRH Malayalam Extra" w:hAnsi="BRH Malayalam Extra" w:cs="BRH Malayalam Extra"/>
+                <w:color w:val="000000"/>
+                <w:sz w:val="32"/>
+                <w:szCs w:val="40"/>
+              </w:rPr>
+              <w:t>(</w:t>
+            </w:r>
+            <w:r>
+              <w:rPr>
+                <w:rFonts w:cs="BRH Malayalam Extra"/>
+                <w:color w:val="000000"/>
+                <w:szCs w:val="40"/>
+              </w:rPr>
+              <w:t>57</w:t>
+            </w:r>
+            <w:r>
+              <w:rPr>
+                <w:rFonts w:ascii="BRH Malayalam Extra" w:hAnsi="BRH Malayalam Extra" w:cs="BRH Malayalam Extra"/>
+                <w:color w:val="000000"/>
+                <w:sz w:val="32"/>
+                <w:szCs w:val="40"/>
+              </w:rPr>
+              <w:t>)</w:t>
+            </w:r>
+            <w:proofErr w:type="gramStart"/>
+            <w:r>
+              <w:rPr>
+                <w:rFonts w:ascii="BRH Malayalam Extra" w:hAnsi="BRH Malayalam Extra" w:cs="BRH Malayalam Extra"/>
+                <w:color w:val="000000"/>
+                <w:sz w:val="32"/>
+                <w:szCs w:val="40"/>
+              </w:rPr>
+              <w:t>-  CZy</w:t>
+            </w:r>
+            <w:proofErr w:type="gramEnd"/>
+            <w:r>
+              <w:rPr>
+                <w:rFonts w:ascii="BRH Malayalam Extra" w:hAnsi="BRH Malayalam Extra" w:cs="BRH Malayalam Extra"/>
+                <w:color w:val="000000"/>
+                <w:sz w:val="32"/>
+                <w:szCs w:val="40"/>
+              </w:rPr>
+              <w:t>— | jx</w:t>
+            </w:r>
+            <w:r>
+              <w:rPr>
+                <w:rFonts w:ascii="BRH Malayalam Extra" w:hAnsi="BRH Malayalam Extra" w:cs="BRH Malayalam Extra"/>
+                <w:color w:val="000000"/>
+                <w:sz w:val="26"/>
+                <w:szCs w:val="40"/>
+              </w:rPr>
+              <w:t>–</w:t>
+            </w:r>
+            <w:r>
+              <w:rPr>
+                <w:rFonts w:ascii="BRH Malayalam Extra" w:hAnsi="BRH Malayalam Extra" w:cs="BRH Malayalam Extra"/>
+                <w:color w:val="000000"/>
+                <w:sz w:val="32"/>
+                <w:szCs w:val="40"/>
+              </w:rPr>
+              <w:t xml:space="preserve">Rõx˜ | B | </w:t>
+            </w:r>
+          </w:p>
+          <w:p>
+            <w:pPr>
+              <w:widowControl w:val="0"/>
+              <w:autoSpaceDE w:val="0"/>
+              <w:autoSpaceDN w:val="0"/>
+              <w:adjustRightInd w:val="0"/>
+              <w:spacing w:before="0" w:line="240" w:lineRule="auto"/>
+              <w:rPr>
+                <w:rFonts w:ascii="BRH Malayalam Extra" w:hAnsi="BRH Malayalam Extra" w:cs="BRH Malayalam Extra"/>
+                <w:color w:val="000000"/>
+                <w:sz w:val="32"/>
+                <w:szCs w:val="40"/>
+              </w:rPr>
+            </w:pPr>
+            <w:r>
+              <w:rPr>
+                <w:rFonts w:ascii="BRH Malayalam Extra" w:hAnsi="BRH Malayalam Extra" w:cs="BRH Malayalam Extra"/>
+                <w:color w:val="000000"/>
+                <w:sz w:val="32"/>
+                <w:szCs w:val="40"/>
+              </w:rPr>
+              <w:t>CZy— jx</w:t>
+            </w:r>
+            <w:r>
+              <w:rPr>
+                <w:rFonts w:ascii="BRH Malayalam Extra" w:hAnsi="BRH Malayalam Extra" w:cs="BRH Malayalam Extra"/>
+                <w:color w:val="000000"/>
+                <w:sz w:val="26"/>
+                <w:szCs w:val="40"/>
+              </w:rPr>
+              <w:t>–</w:t>
+            </w:r>
+            <w:r>
+              <w:rPr>
+                <w:rFonts w:ascii="BRH Malayalam Extra" w:hAnsi="BRH Malayalam Extra" w:cs="BRH Malayalam Extra"/>
+                <w:color w:val="000000"/>
+                <w:sz w:val="32"/>
+                <w:szCs w:val="40"/>
+              </w:rPr>
+              <w:t>Rõx— jx</w:t>
+            </w:r>
+            <w:r>
+              <w:rPr>
+                <w:rFonts w:ascii="BRH Malayalam Extra" w:hAnsi="BRH Malayalam Extra" w:cs="BRH Malayalam Extra"/>
+                <w:color w:val="000000"/>
+                <w:sz w:val="26"/>
+                <w:szCs w:val="40"/>
+              </w:rPr>
+              <w:t>–</w:t>
+            </w:r>
+            <w:r>
+              <w:rPr>
+                <w:rFonts w:ascii="BRH Malayalam Extra" w:hAnsi="BRH Malayalam Extra" w:cs="BRH Malayalam Extra"/>
+                <w:color w:val="000000"/>
+                <w:sz w:val="32"/>
+                <w:szCs w:val="40"/>
+              </w:rPr>
+              <w:t>¥Rõ—ZzZy— jx</w:t>
+            </w:r>
+            <w:r>
+              <w:rPr>
+                <w:rFonts w:ascii="BRH Malayalam Extra" w:hAnsi="BRH Malayalam Extra" w:cs="BRH Malayalam Extra"/>
+                <w:color w:val="000000"/>
+                <w:sz w:val="26"/>
+                <w:szCs w:val="40"/>
+              </w:rPr>
+              <w:t>–</w:t>
+            </w:r>
+            <w:r>
+              <w:rPr>
+                <w:rFonts w:ascii="BRH Malayalam Extra" w:hAnsi="BRH Malayalam Extra" w:cs="BRH Malayalam Extra"/>
+                <w:color w:val="000000"/>
+                <w:sz w:val="32"/>
+                <w:szCs w:val="40"/>
+                <w:highlight w:val="yellow"/>
+              </w:rPr>
+              <w:t>Rõx</w:t>
+            </w:r>
+            <w:r>
+              <w:rPr>
+                <w:rFonts w:ascii="BRH Malayalam Extra" w:hAnsi="BRH Malayalam Extra" w:cs="BRH Malayalam Extra"/>
+                <w:color w:val="000000"/>
+                <w:sz w:val="32"/>
+                <w:szCs w:val="40"/>
+              </w:rPr>
+              <w:t>— „„jx</w:t>
+            </w:r>
+            <w:r>
+              <w:rPr>
+                <w:rFonts w:ascii="BRH Malayalam Extra" w:hAnsi="BRH Malayalam Extra" w:cs="BRH Malayalam Extra"/>
+                <w:color w:val="000000"/>
+                <w:sz w:val="26"/>
+                <w:szCs w:val="40"/>
+              </w:rPr>
+              <w:t>–</w:t>
+            </w:r>
+            <w:r>
+              <w:rPr>
+                <w:rFonts w:ascii="BRH Malayalam Extra" w:hAnsi="BRH Malayalam Extra" w:cs="BRH Malayalam Extra"/>
+                <w:color w:val="000000"/>
+                <w:sz w:val="32"/>
+                <w:szCs w:val="40"/>
+              </w:rPr>
+              <w:t>¥Rõ—ZzZy— jx</w:t>
+            </w:r>
+            <w:r>
+              <w:rPr>
+                <w:rFonts w:ascii="BRH Malayalam Extra" w:hAnsi="BRH Malayalam Extra" w:cs="BRH Malayalam Extra"/>
+                <w:color w:val="000000"/>
+                <w:sz w:val="26"/>
+                <w:szCs w:val="40"/>
+              </w:rPr>
+              <w:t>–</w:t>
+            </w:r>
+            <w:r>
+              <w:rPr>
+                <w:rFonts w:ascii="BRH Malayalam Extra" w:hAnsi="BRH Malayalam Extra" w:cs="BRH Malayalam Extra"/>
+                <w:color w:val="000000"/>
+                <w:sz w:val="32"/>
+                <w:szCs w:val="40"/>
+                <w:highlight w:val="yellow"/>
+              </w:rPr>
+              <w:t>Rõx</w:t>
+            </w:r>
+            <w:r>
+              <w:rPr>
+                <w:rFonts w:ascii="BRH Malayalam Extra" w:hAnsi="BRH Malayalam Extra" w:cs="BRH Malayalam Extra"/>
+                <w:color w:val="000000"/>
+                <w:sz w:val="32"/>
+                <w:szCs w:val="40"/>
+              </w:rPr>
+              <w:t xml:space="preserve">˜ | </w:t>
+            </w:r>
+          </w:p>
+          <w:p>
+            <w:pPr>
+              <w:widowControl w:val="0"/>
+              <w:autoSpaceDE w:val="0"/>
+              <w:autoSpaceDN w:val="0"/>
+              <w:adjustRightInd w:val="0"/>
+              <w:spacing w:before="0" w:line="240" w:lineRule="auto"/>
+              <w:rPr>
+                <w:rFonts w:ascii="BRH Malayalam Extra" w:hAnsi="BRH Malayalam Extra" w:cs="BRH Malayalam Extra"/>
+                <w:color w:val="000000"/>
+                <w:sz w:val="32"/>
+                <w:szCs w:val="40"/>
+              </w:rPr>
+            </w:pPr>
+            <w:r>
+              <w:rPr>
+                <w:rFonts w:cs="BRH Malayalam Extra"/>
+                <w:color w:val="000000"/>
+                <w:szCs w:val="40"/>
+              </w:rPr>
+              <w:t>65</w:t>
+            </w:r>
+            <w:r>
+              <w:rPr>
+                <w:rFonts w:ascii="BRH Malayalam Extra" w:hAnsi="BRH Malayalam Extra" w:cs="BRH Malayalam Extra"/>
+                <w:color w:val="000000"/>
+                <w:sz w:val="32"/>
+                <w:szCs w:val="40"/>
+              </w:rPr>
+              <w:t>)</w:t>
+            </w:r>
+            <w:r>
+              <w:rPr>
+                <w:rFonts w:ascii="BRH Malayalam Extra" w:hAnsi="BRH Malayalam Extra" w:cs="BRH Malayalam Extra"/>
+                <w:color w:val="000000"/>
+                <w:sz w:val="32"/>
+                <w:szCs w:val="40"/>
+              </w:rPr>
+              <w:tab/>
+            </w:r>
+            <w:r>
+              <w:rPr>
+                <w:rFonts w:cs="BRH Malayalam Extra"/>
+                <w:color w:val="000000"/>
+                <w:szCs w:val="40"/>
+              </w:rPr>
+              <w:t>2</w:t>
+            </w:r>
+            <w:r>
+              <w:rPr>
+                <w:rFonts w:ascii="BRH Malayalam Extra" w:hAnsi="BRH Malayalam Extra" w:cs="BRH Malayalam Extra"/>
+                <w:color w:val="000000"/>
+                <w:sz w:val="32"/>
+                <w:szCs w:val="40"/>
+              </w:rPr>
+              <w:t>.</w:t>
+            </w:r>
+            <w:r>
+              <w:rPr>
+                <w:rFonts w:cs="BRH Malayalam Extra"/>
+                <w:color w:val="000000"/>
+                <w:szCs w:val="40"/>
+              </w:rPr>
+              <w:t>3</w:t>
+            </w:r>
+            <w:r>
+              <w:rPr>
+                <w:rFonts w:ascii="BRH Malayalam Extra" w:hAnsi="BRH Malayalam Extra" w:cs="BRH Malayalam Extra"/>
+                <w:color w:val="000000"/>
+                <w:sz w:val="32"/>
+                <w:szCs w:val="40"/>
+              </w:rPr>
+              <w:t>.</w:t>
+            </w:r>
+            <w:r>
+              <w:rPr>
+                <w:rFonts w:cs="BRH Malayalam Extra"/>
+                <w:color w:val="000000"/>
+                <w:szCs w:val="40"/>
+              </w:rPr>
+              <w:t>5</w:t>
+            </w:r>
+            <w:r>
+              <w:rPr>
+                <w:rFonts w:ascii="BRH Malayalam Extra" w:hAnsi="BRH Malayalam Extra" w:cs="BRH Malayalam Extra"/>
+                <w:color w:val="000000"/>
+                <w:sz w:val="32"/>
+                <w:szCs w:val="40"/>
+              </w:rPr>
+              <w:t>.</w:t>
+            </w:r>
+            <w:r>
+              <w:rPr>
+                <w:rFonts w:cs="BRH Malayalam Extra"/>
+                <w:color w:val="000000"/>
+                <w:szCs w:val="40"/>
+              </w:rPr>
+              <w:t>3</w:t>
+            </w:r>
+            <w:r>
+              <w:rPr>
+                <w:rFonts w:ascii="BRH Malayalam Extra" w:hAnsi="BRH Malayalam Extra" w:cs="BRH Malayalam Extra"/>
+                <w:color w:val="000000"/>
+                <w:sz w:val="32"/>
+                <w:szCs w:val="40"/>
+              </w:rPr>
+              <w:t>(</w:t>
+            </w:r>
+            <w:r>
+              <w:rPr>
+                <w:rFonts w:cs="BRH Malayalam Extra"/>
+                <w:color w:val="000000"/>
+                <w:szCs w:val="40"/>
+              </w:rPr>
+              <w:t>58</w:t>
+            </w:r>
+            <w:r>
+              <w:rPr>
+                <w:rFonts w:ascii="BRH Malayalam Extra" w:hAnsi="BRH Malayalam Extra" w:cs="BRH Malayalam Extra"/>
+                <w:color w:val="000000"/>
+                <w:sz w:val="32"/>
+                <w:szCs w:val="40"/>
+              </w:rPr>
+              <w:t>)</w:t>
+            </w:r>
+            <w:proofErr w:type="gramStart"/>
+            <w:r>
+              <w:rPr>
+                <w:rFonts w:ascii="BRH Malayalam Extra" w:hAnsi="BRH Malayalam Extra" w:cs="BRH Malayalam Extra"/>
+                <w:color w:val="000000"/>
+                <w:sz w:val="32"/>
+                <w:szCs w:val="40"/>
+              </w:rPr>
+              <w:t>-  jx</w:t>
+            </w:r>
+            <w:proofErr w:type="gramEnd"/>
+            <w:r>
+              <w:rPr>
+                <w:rFonts w:ascii="BRH Malayalam Extra" w:hAnsi="BRH Malayalam Extra" w:cs="BRH Malayalam Extra"/>
+                <w:color w:val="000000"/>
+                <w:sz w:val="26"/>
+                <w:szCs w:val="40"/>
+              </w:rPr>
+              <w:t>–</w:t>
+            </w:r>
+            <w:r>
+              <w:rPr>
+                <w:rFonts w:ascii="BRH Malayalam Extra" w:hAnsi="BRH Malayalam Extra" w:cs="BRH Malayalam Extra"/>
+                <w:color w:val="000000"/>
+                <w:sz w:val="32"/>
+                <w:szCs w:val="40"/>
+              </w:rPr>
+              <w:t>Rõx˜ | B | G</w:t>
+            </w:r>
+            <w:r>
+              <w:rPr>
+                <w:rFonts w:ascii="BRH Malayalam Extra" w:hAnsi="BRH Malayalam Extra" w:cs="BRH Malayalam Extra"/>
+                <w:color w:val="000000"/>
+                <w:sz w:val="26"/>
+                <w:szCs w:val="40"/>
+              </w:rPr>
+              <w:t>–</w:t>
+            </w:r>
+            <w:r>
+              <w:rPr>
+                <w:rFonts w:ascii="BRH Malayalam Extra" w:hAnsi="BRH Malayalam Extra" w:cs="BRH Malayalam Extra"/>
+                <w:color w:val="000000"/>
+                <w:sz w:val="32"/>
+                <w:szCs w:val="40"/>
+              </w:rPr>
+              <w:t xml:space="preserve">p | </w:t>
+            </w:r>
+          </w:p>
+          <w:p>
+            <w:pPr>
+              <w:widowControl w:val="0"/>
+              <w:autoSpaceDE w:val="0"/>
+              <w:autoSpaceDN w:val="0"/>
+              <w:adjustRightInd w:val="0"/>
+              <w:spacing w:before="0" w:line="240" w:lineRule="auto"/>
+              <w:rPr>
+                <w:rFonts w:ascii="BRH Malayalam Extra" w:hAnsi="BRH Malayalam Extra" w:cs="BRH Malayalam Extra"/>
+                <w:color w:val="000000"/>
+                <w:sz w:val="32"/>
+                <w:szCs w:val="40"/>
+              </w:rPr>
+            </w:pPr>
+            <w:r>
+              <w:rPr>
+                <w:rFonts w:ascii="BRH Malayalam Extra" w:hAnsi="BRH Malayalam Extra" w:cs="BRH Malayalam Extra"/>
+                <w:color w:val="000000"/>
+                <w:sz w:val="32"/>
+                <w:szCs w:val="40"/>
+              </w:rPr>
+              <w:lastRenderedPageBreak/>
+              <w:t>jx</w:t>
+            </w:r>
+            <w:r>
+              <w:rPr>
+                <w:rFonts w:ascii="BRH Malayalam Extra" w:hAnsi="BRH Malayalam Extra" w:cs="BRH Malayalam Extra"/>
+                <w:color w:val="000000"/>
+                <w:sz w:val="26"/>
+                <w:szCs w:val="40"/>
+              </w:rPr>
+              <w:t>–</w:t>
+            </w:r>
+            <w:r>
+              <w:rPr>
+                <w:rFonts w:ascii="BRH Malayalam Extra" w:hAnsi="BRH Malayalam Extra" w:cs="BRH Malayalam Extra"/>
+                <w:color w:val="000000"/>
+                <w:sz w:val="32"/>
+                <w:szCs w:val="40"/>
+                <w:highlight w:val="yellow"/>
+              </w:rPr>
+              <w:t>Rõx</w:t>
+            </w:r>
+            <w:r>
+              <w:rPr>
+                <w:rFonts w:ascii="BRH Malayalam Extra" w:hAnsi="BRH Malayalam Extra" w:cs="BRH Malayalam Extra"/>
+                <w:color w:val="000000"/>
+                <w:sz w:val="32"/>
+                <w:szCs w:val="40"/>
+              </w:rPr>
+              <w:t>— „„jx</w:t>
+            </w:r>
+            <w:r>
+              <w:rPr>
+                <w:rFonts w:ascii="BRH Malayalam Extra" w:hAnsi="BRH Malayalam Extra" w:cs="BRH Malayalam Extra"/>
+                <w:color w:val="000000"/>
+                <w:sz w:val="26"/>
+                <w:szCs w:val="40"/>
+              </w:rPr>
+              <w:t>–</w:t>
+            </w:r>
+            <w:r>
+              <w:rPr>
+                <w:rFonts w:ascii="BRH Malayalam Extra" w:hAnsi="BRH Malayalam Extra" w:cs="BRH Malayalam Extra"/>
+                <w:color w:val="000000"/>
+                <w:sz w:val="32"/>
+                <w:szCs w:val="40"/>
+              </w:rPr>
+              <w:t>Rõx— jx</w:t>
+            </w:r>
+            <w:r>
+              <w:rPr>
+                <w:rFonts w:ascii="BRH Malayalam Extra" w:hAnsi="BRH Malayalam Extra" w:cs="BRH Malayalam Extra"/>
+                <w:color w:val="000000"/>
+                <w:sz w:val="26"/>
+                <w:szCs w:val="40"/>
+                <w:highlight w:val="yellow"/>
+              </w:rPr>
+              <w:t>–</w:t>
+            </w:r>
+            <w:r>
+              <w:rPr>
+                <w:rFonts w:ascii="BRH Malayalam Extra" w:hAnsi="BRH Malayalam Extra" w:cs="BRH Malayalam Extra"/>
+                <w:color w:val="000000"/>
+                <w:sz w:val="32"/>
+                <w:szCs w:val="40"/>
+                <w:highlight w:val="yellow"/>
+              </w:rPr>
+              <w:t>¤¤Rõ</w:t>
+            </w:r>
+            <w:r>
+              <w:rPr>
+                <w:rFonts w:ascii="BRH Malayalam Extra" w:hAnsi="BRH Malayalam Extra" w:cs="BRH Malayalam Extra"/>
+                <w:color w:val="000000"/>
+                <w:sz w:val="32"/>
+                <w:szCs w:val="40"/>
+              </w:rPr>
+              <w:t>—¤¤ppx jx</w:t>
+            </w:r>
+            <w:r>
+              <w:rPr>
+                <w:rFonts w:ascii="BRH Malayalam Extra" w:hAnsi="BRH Malayalam Extra" w:cs="BRH Malayalam Extra"/>
+                <w:color w:val="000000"/>
+                <w:sz w:val="26"/>
+                <w:szCs w:val="40"/>
+              </w:rPr>
+              <w:t>–</w:t>
+            </w:r>
+            <w:r>
+              <w:rPr>
+                <w:rFonts w:ascii="BRH Malayalam Extra" w:hAnsi="BRH Malayalam Extra" w:cs="BRH Malayalam Extra"/>
+                <w:color w:val="000000"/>
+                <w:sz w:val="32"/>
+                <w:szCs w:val="40"/>
+              </w:rPr>
+              <w:t xml:space="preserve">Rõx— </w:t>
+            </w:r>
+          </w:p>
+          <w:p>
+            <w:pPr>
+              <w:widowControl w:val="0"/>
+              <w:autoSpaceDE w:val="0"/>
+              <w:autoSpaceDN w:val="0"/>
+              <w:adjustRightInd w:val="0"/>
+              <w:spacing w:before="0" w:line="240" w:lineRule="auto"/>
+              <w:rPr>
                 <w:rFonts w:cs="Latha"/>
                 <w:b/>
                 <w:bCs/>
                 <w:szCs w:val="24"/>
                 <w:cs/>
-                <w:lang w:val="it-IT" w:bidi="ta-IN"/>
+                <w:lang w:bidi="ta-IN"/>
               </w:rPr>
             </w:pPr>
+            <w:r>
+              <w:rPr>
+                <w:rFonts w:ascii="BRH Malayalam Extra" w:hAnsi="BRH Malayalam Extra" w:cs="BRH Malayalam Extra"/>
+                <w:color w:val="000000"/>
+                <w:sz w:val="32"/>
+                <w:szCs w:val="40"/>
+              </w:rPr>
+              <w:t>jx</w:t>
+            </w:r>
+            <w:r>
+              <w:rPr>
+                <w:rFonts w:ascii="BRH Malayalam Extra" w:hAnsi="BRH Malayalam Extra" w:cs="BRH Malayalam Extra"/>
+                <w:color w:val="000000"/>
+                <w:sz w:val="26"/>
+                <w:szCs w:val="40"/>
+              </w:rPr>
+              <w:t>–</w:t>
+            </w:r>
+            <w:r>
+              <w:rPr>
+                <w:rFonts w:ascii="BRH Malayalam Extra" w:hAnsi="BRH Malayalam Extra" w:cs="BRH Malayalam Extra"/>
+                <w:color w:val="000000"/>
+                <w:sz w:val="32"/>
+                <w:szCs w:val="40"/>
+                <w:highlight w:val="yellow"/>
+              </w:rPr>
+              <w:t>¤¤Rõ—</w:t>
+            </w:r>
+            <w:r>
+              <w:rPr>
+                <w:rFonts w:ascii="BRH Malayalam Extra" w:hAnsi="BRH Malayalam Extra" w:cs="BRH Malayalam Extra"/>
+                <w:color w:val="000000"/>
+                <w:sz w:val="32"/>
+                <w:szCs w:val="40"/>
+              </w:rPr>
+              <w:t xml:space="preserve">p | </w:t>
+            </w:r>
           </w:p>
         </w:tc>
         <w:tc>
@@ -2706,31 +3291,163 @@
               <w:adjustRightInd w:val="0"/>
               <w:spacing w:before="0" w:line="240" w:lineRule="auto"/>
               <w:rPr>
-                <w:rFonts w:cs="Latha"/>
-                <w:b/>
-                <w:bCs/>
-                <w:szCs w:val="24"/>
-                <w:cs/>
-                <w:lang w:val="it-IT" w:bidi="ta-IN"/>
+                <w:rFonts w:ascii="BRH Malayalam Extra" w:hAnsi="BRH Malayalam Extra" w:cs="BRH Malayalam Extra"/>
+                <w:color w:val="000000"/>
+                <w:sz w:val="32"/>
+                <w:szCs w:val="40"/>
               </w:rPr>
             </w:pPr>
+            <w:r>
+              <w:rPr>
+                <w:rFonts w:cs="BRH Malayalam Extra"/>
+                <w:color w:val="000000"/>
+                <w:szCs w:val="40"/>
+              </w:rPr>
+              <w:lastRenderedPageBreak/>
+              <w:t>64</w:t>
+            </w:r>
+            <w:r>
+              <w:rPr>
+                <w:rFonts w:ascii="BRH Malayalam Extra" w:hAnsi="BRH Malayalam Extra" w:cs="BRH Malayalam Extra"/>
+                <w:color w:val="000000"/>
+                <w:sz w:val="32"/>
+                <w:szCs w:val="40"/>
+              </w:rPr>
+              <w:t>)</w:t>
+            </w:r>
+            <w:r>
+              <w:rPr>
+                <w:rFonts w:ascii="BRH Malayalam Extra" w:hAnsi="BRH Malayalam Extra" w:cs="BRH Malayalam Extra"/>
+                <w:color w:val="000000"/>
+                <w:sz w:val="32"/>
+                <w:szCs w:val="40"/>
+              </w:rPr>
+              <w:tab/>
+            </w:r>
+            <w:r>
+              <w:rPr>
+                <w:rFonts w:cs="BRH Malayalam Extra"/>
+                <w:color w:val="000000"/>
+                <w:szCs w:val="40"/>
+              </w:rPr>
+              <w:t>2</w:t>
+            </w:r>
+            <w:r>
+              <w:rPr>
+                <w:rFonts w:ascii="BRH Malayalam Extra" w:hAnsi="BRH Malayalam Extra" w:cs="BRH Malayalam Extra"/>
+                <w:color w:val="000000"/>
+                <w:sz w:val="32"/>
+                <w:szCs w:val="40"/>
+              </w:rPr>
+              <w:t>.</w:t>
+            </w:r>
+            <w:r>
+              <w:rPr>
+                <w:rFonts w:cs="BRH Malayalam Extra"/>
+                <w:color w:val="000000"/>
+                <w:szCs w:val="40"/>
+              </w:rPr>
+              <w:t>3</w:t>
+            </w:r>
+            <w:r>
+              <w:rPr>
+                <w:rFonts w:ascii="BRH Malayalam Extra" w:hAnsi="BRH Malayalam Extra" w:cs="BRH Malayalam Extra"/>
+                <w:color w:val="000000"/>
+                <w:sz w:val="32"/>
+                <w:szCs w:val="40"/>
+              </w:rPr>
+              <w:t>.</w:t>
+            </w:r>
+            <w:r>
+              <w:rPr>
+                <w:rFonts w:cs="BRH Malayalam Extra"/>
+                <w:color w:val="000000"/>
+                <w:szCs w:val="40"/>
+              </w:rPr>
+              <w:t>5</w:t>
+            </w:r>
+            <w:r>
+              <w:rPr>
+                <w:rFonts w:ascii="BRH Malayalam Extra" w:hAnsi="BRH Malayalam Extra" w:cs="BRH Malayalam Extra"/>
+                <w:color w:val="000000"/>
+                <w:sz w:val="32"/>
+                <w:szCs w:val="40"/>
+              </w:rPr>
+              <w:t>.</w:t>
+            </w:r>
+            <w:r>
+              <w:rPr>
+                <w:rFonts w:cs="BRH Malayalam Extra"/>
+                <w:color w:val="000000"/>
+                <w:szCs w:val="40"/>
+              </w:rPr>
+              <w:t>3</w:t>
+            </w:r>
+            <w:r>
+              <w:rPr>
+                <w:rFonts w:ascii="BRH Malayalam Extra" w:hAnsi="BRH Malayalam Extra" w:cs="BRH Malayalam Extra"/>
+                <w:color w:val="000000"/>
+                <w:sz w:val="32"/>
+                <w:szCs w:val="40"/>
+              </w:rPr>
+              <w:t>(</w:t>
+            </w:r>
+            <w:r>
+              <w:rPr>
+                <w:rFonts w:cs="BRH Malayalam Extra"/>
+                <w:color w:val="000000"/>
+                <w:szCs w:val="40"/>
+              </w:rPr>
+              <w:t>57</w:t>
+            </w:r>
+            <w:r>
+              <w:rPr>
+                <w:rFonts w:ascii="BRH Malayalam Extra" w:hAnsi="BRH Malayalam Extra" w:cs="BRH Malayalam Extra"/>
+                <w:color w:val="000000"/>
+                <w:sz w:val="32"/>
+                <w:szCs w:val="40"/>
+              </w:rPr>
+              <w:t>)</w:t>
+            </w:r>
+            <w:proofErr w:type="gramStart"/>
+            <w:r>
+              <w:rPr>
+                <w:rFonts w:ascii="BRH Malayalam Extra" w:hAnsi="BRH Malayalam Extra" w:cs="BRH Malayalam Extra"/>
+                <w:color w:val="000000"/>
+                <w:sz w:val="32"/>
+                <w:szCs w:val="40"/>
+              </w:rPr>
+              <w:t>-  CZy</w:t>
+            </w:r>
+            <w:proofErr w:type="gramEnd"/>
+            <w:r>
+              <w:rPr>
+                <w:rFonts w:ascii="BRH Malayalam Extra" w:hAnsi="BRH Malayalam Extra" w:cs="BRH Malayalam Extra"/>
+                <w:color w:val="000000"/>
+                <w:sz w:val="32"/>
+                <w:szCs w:val="40"/>
+              </w:rPr>
+              <w:t>— | jx</w:t>
+            </w:r>
+            <w:r>
+              <w:rPr>
+                <w:rFonts w:ascii="BRH Malayalam Extra" w:hAnsi="BRH Malayalam Extra" w:cs="BRH Malayalam Extra"/>
+                <w:color w:val="000000"/>
+                <w:sz w:val="26"/>
+                <w:szCs w:val="40"/>
+              </w:rPr>
+              <w:t>–</w:t>
+            </w:r>
+            <w:r>
+              <w:rPr>
+                <w:rFonts w:ascii="BRH Malayalam Extra" w:hAnsi="BRH Malayalam Extra" w:cs="BRH Malayalam Extra"/>
+                <w:color w:val="000000"/>
+                <w:sz w:val="32"/>
+                <w:szCs w:val="40"/>
+              </w:rPr>
+              <w:t xml:space="preserve">Rõx˜ | B | </w:t>
+            </w:r>
           </w:p>
-        </w:tc>
-      </w:tr>
-      <w:tr>
-        <w:trPr>
-          <w:trHeight w:val="899"/>
-        </w:trPr>
-        <w:tc>
-          <w:tcPr>
-            <w:tcW w:w="7166" w:type="dxa"/>
-            <w:tcBorders>
-              <w:top w:val="single" w:sz="4" w:space="0" w:color="000000"/>
-              <w:left w:val="single" w:sz="4" w:space="0" w:color="000000"/>
-              <w:bottom w:val="single" w:sz="4" w:space="0" w:color="000000"/>
-              <w:right w:val="single" w:sz="4" w:space="0" w:color="000000"/>
-            </w:tcBorders>
-          </w:tcPr>
           <w:p>
             <w:pPr>
               <w:widowControl w:val="0"/>
@@ -2739,26 +3456,104 @@
               <w:adjustRightInd w:val="0"/>
               <w:spacing w:before="0" w:line="240" w:lineRule="auto"/>
               <w:rPr>
-                <w:rFonts w:cs="Latha"/>
-                <w:b/>
-                <w:bCs/>
-                <w:szCs w:val="24"/>
-                <w:cs/>
-                <w:lang w:val="it-IT" w:bidi="ta-IN"/>
+                <w:rFonts w:ascii="BRH Malayalam Extra" w:hAnsi="BRH Malayalam Extra" w:cs="BRH Malayalam Extra"/>
+                <w:color w:val="000000"/>
+                <w:sz w:val="32"/>
+                <w:szCs w:val="40"/>
               </w:rPr>
             </w:pPr>
+            <w:r>
+              <w:rPr>
+                <w:rFonts w:ascii="BRH Malayalam Extra" w:hAnsi="BRH Malayalam Extra" w:cs="BRH Malayalam Extra"/>
+                <w:color w:val="000000"/>
+                <w:sz w:val="32"/>
+                <w:szCs w:val="40"/>
+              </w:rPr>
+              <w:t>CZy— jx</w:t>
+            </w:r>
+            <w:r>
+              <w:rPr>
+                <w:rFonts w:ascii="BRH Malayalam Extra" w:hAnsi="BRH Malayalam Extra" w:cs="BRH Malayalam Extra"/>
+                <w:color w:val="000000"/>
+                <w:sz w:val="26"/>
+                <w:szCs w:val="40"/>
+              </w:rPr>
+              <w:t>–</w:t>
+            </w:r>
+            <w:r>
+              <w:rPr>
+                <w:rFonts w:ascii="BRH Malayalam Extra" w:hAnsi="BRH Malayalam Extra" w:cs="BRH Malayalam Extra"/>
+                <w:color w:val="000000"/>
+                <w:sz w:val="32"/>
+                <w:szCs w:val="40"/>
+              </w:rPr>
+              <w:t>Rõx— jx</w:t>
+            </w:r>
+            <w:r>
+              <w:rPr>
+                <w:rFonts w:ascii="BRH Malayalam Extra" w:hAnsi="BRH Malayalam Extra" w:cs="BRH Malayalam Extra"/>
+                <w:color w:val="000000"/>
+                <w:sz w:val="26"/>
+                <w:szCs w:val="40"/>
+              </w:rPr>
+              <w:t>–</w:t>
+            </w:r>
+            <w:r>
+              <w:rPr>
+                <w:rFonts w:ascii="BRH Malayalam Extra" w:hAnsi="BRH Malayalam Extra" w:cs="BRH Malayalam Extra"/>
+                <w:color w:val="000000"/>
+                <w:sz w:val="32"/>
+                <w:szCs w:val="40"/>
+              </w:rPr>
+              <w:t>¥Rõ—ZzZy— jx</w:t>
+            </w:r>
+            <w:r>
+              <w:rPr>
+                <w:rFonts w:ascii="BRH Malayalam Extra" w:hAnsi="BRH Malayalam Extra" w:cs="BRH Malayalam Extra"/>
+                <w:color w:val="000000"/>
+                <w:sz w:val="26"/>
+                <w:szCs w:val="40"/>
+              </w:rPr>
+              <w:t>–</w:t>
+            </w:r>
+            <w:r>
+              <w:rPr>
+                <w:rFonts w:ascii="BRH Malayalam Extra" w:hAnsi="BRH Malayalam Extra" w:cs="BRH Malayalam Extra"/>
+                <w:color w:val="000000"/>
+                <w:sz w:val="32"/>
+                <w:szCs w:val="40"/>
+                <w:highlight w:val="green"/>
+              </w:rPr>
+              <w:t>Rõx</w:t>
+            </w:r>
+            <w:r>
+              <w:rPr>
+                <w:rFonts w:ascii="BRH Malayalam Extra" w:hAnsi="BRH Malayalam Extra" w:cs="BRH Malayalam Extra"/>
+                <w:color w:val="000000"/>
+                <w:sz w:val="32"/>
+                <w:szCs w:val="40"/>
+              </w:rPr>
+              <w:t xml:space="preserve"> „„jx</w:t>
+            </w:r>
+            <w:r>
+              <w:rPr>
+                <w:rFonts w:ascii="BRH Malayalam Extra" w:hAnsi="BRH Malayalam Extra" w:cs="BRH Malayalam Extra"/>
+                <w:color w:val="000000"/>
+                <w:sz w:val="26"/>
+                <w:szCs w:val="40"/>
+              </w:rPr>
+              <w:t>–</w:t>
+            </w:r>
+            <w:r>
+              <w:rPr>
+                <w:rFonts w:ascii="BRH Malayalam Extra" w:hAnsi="BRH Malayalam Extra" w:cs="BRH Malayalam Extra"/>
+                <w:color w:val="000000"/>
+                <w:sz w:val="32"/>
+                <w:szCs w:val="40"/>
+              </w:rPr>
+              <w:t xml:space="preserve">¥Rõ—ZzZy— </w:t>
+            </w:r>
           </w:p>
-        </w:tc>
-        <w:tc>
-          <w:tcPr>
-            <w:tcW w:w="7371" w:type="dxa"/>
-            <w:tcBorders>
-              <w:top w:val="single" w:sz="4" w:space="0" w:color="000000"/>
-              <w:left w:val="single" w:sz="4" w:space="0" w:color="000000"/>
-              <w:bottom w:val="single" w:sz="4" w:space="0" w:color="000000"/>
-              <w:right w:val="single" w:sz="4" w:space="0" w:color="000000"/>
-            </w:tcBorders>
-          </w:tcPr>
           <w:p>
             <w:pPr>
               <w:widowControl w:val="0"/>
@@ -2767,31 +3562,50 @@
               <w:adjustRightInd w:val="0"/>
               <w:spacing w:before="0" w:line="240" w:lineRule="auto"/>
               <w:rPr>
-                <w:rFonts w:cs="Latha"/>
-                <w:b/>
-                <w:bCs/>
-                <w:szCs w:val="24"/>
-                <w:cs/>
-                <w:lang w:val="it-IT" w:bidi="ta-IN"/>
+                <w:rFonts w:ascii="BRH Malayalam Extra" w:hAnsi="BRH Malayalam Extra" w:cs="BRH Malayalam Extra"/>
+                <w:color w:val="000000"/>
+                <w:sz w:val="32"/>
+                <w:szCs w:val="40"/>
               </w:rPr>
             </w:pPr>
+            <w:r>
+              <w:rPr>
+                <w:rFonts w:ascii="BRH Malayalam Extra" w:hAnsi="BRH Malayalam Extra" w:cs="BRH Malayalam Extra"/>
+                <w:color w:val="000000"/>
+                <w:sz w:val="32"/>
+                <w:szCs w:val="40"/>
+              </w:rPr>
+              <w:t>jx</w:t>
+            </w:r>
+            <w:r>
+              <w:rPr>
+                <w:rFonts w:ascii="BRH Malayalam Extra" w:hAnsi="BRH Malayalam Extra" w:cs="BRH Malayalam Extra"/>
+                <w:color w:val="000000"/>
+                <w:sz w:val="26"/>
+                <w:szCs w:val="40"/>
+              </w:rPr>
+              <w:t>–</w:t>
+            </w:r>
+            <w:r>
+              <w:rPr>
+                <w:rFonts w:ascii="BRH Malayalam Extra" w:hAnsi="BRH Malayalam Extra" w:cs="BRH Malayalam Extra"/>
+                <w:color w:val="000000"/>
+                <w:sz w:val="32"/>
+                <w:szCs w:val="40"/>
+                <w:highlight w:val="green"/>
+              </w:rPr>
+              <w:t>Rõx</w:t>
+            </w:r>
+            <w:r>
+              <w:rPr>
+                <w:rFonts w:ascii="BRH Malayalam Extra" w:hAnsi="BRH Malayalam Extra" w:cs="BRH Malayalam Extra"/>
+                <w:color w:val="000000"/>
+                <w:sz w:val="32"/>
+                <w:szCs w:val="40"/>
+              </w:rPr>
+              <w:t xml:space="preserve"> | </w:t>
+            </w:r>
           </w:p>
-        </w:tc>
-      </w:tr>
-      <w:tr>
-        <w:trPr>
-          <w:trHeight w:val="899"/>
-        </w:trPr>
-        <w:tc>
-          <w:tcPr>
-            <w:tcW w:w="7166" w:type="dxa"/>
-            <w:tcBorders>
-              <w:top w:val="single" w:sz="4" w:space="0" w:color="000000"/>
-              <w:left w:val="single" w:sz="4" w:space="0" w:color="000000"/>
-              <w:bottom w:val="single" w:sz="4" w:space="0" w:color="000000"/>
-              <w:right w:val="single" w:sz="4" w:space="0" w:color="000000"/>
-            </w:tcBorders>
-          </w:tcPr>
           <w:p>
             <w:pPr>
               <w:widowControl w:val="0"/>
@@ -2800,26 +3614,171 @@
               <w:adjustRightInd w:val="0"/>
               <w:spacing w:before="0" w:line="240" w:lineRule="auto"/>
               <w:rPr>
-                <w:rFonts w:cs="Latha"/>
-                <w:b/>
-                <w:bCs/>
-                <w:szCs w:val="24"/>
-                <w:cs/>
-                <w:lang w:val="it-IT" w:bidi="ta-IN"/>
+                <w:rFonts w:ascii="BRH Malayalam Extra" w:hAnsi="BRH Malayalam Extra" w:cs="BRH Malayalam Extra"/>
+                <w:color w:val="000000"/>
+                <w:sz w:val="32"/>
+                <w:szCs w:val="40"/>
               </w:rPr>
             </w:pPr>
+            <w:r>
+              <w:rPr>
+                <w:rFonts w:cs="BRH Malayalam Extra"/>
+                <w:color w:val="000000"/>
+                <w:szCs w:val="40"/>
+              </w:rPr>
+              <w:t>65</w:t>
+            </w:r>
+            <w:r>
+              <w:rPr>
+                <w:rFonts w:ascii="BRH Malayalam Extra" w:hAnsi="BRH Malayalam Extra" w:cs="BRH Malayalam Extra"/>
+                <w:color w:val="000000"/>
+                <w:sz w:val="32"/>
+                <w:szCs w:val="40"/>
+              </w:rPr>
+              <w:t>)</w:t>
+            </w:r>
+            <w:r>
+              <w:rPr>
+                <w:rFonts w:ascii="BRH Malayalam Extra" w:hAnsi="BRH Malayalam Extra" w:cs="BRH Malayalam Extra"/>
+                <w:color w:val="000000"/>
+                <w:sz w:val="32"/>
+                <w:szCs w:val="40"/>
+              </w:rPr>
+              <w:tab/>
+            </w:r>
+            <w:r>
+              <w:rPr>
+                <w:rFonts w:cs="BRH Malayalam Extra"/>
+                <w:color w:val="000000"/>
+                <w:szCs w:val="40"/>
+              </w:rPr>
+              <w:t>2</w:t>
+            </w:r>
+            <w:r>
+              <w:rPr>
+                <w:rFonts w:ascii="BRH Malayalam Extra" w:hAnsi="BRH Malayalam Extra" w:cs="BRH Malayalam Extra"/>
+                <w:color w:val="000000"/>
+                <w:sz w:val="32"/>
+                <w:szCs w:val="40"/>
+              </w:rPr>
+              <w:t>.</w:t>
+            </w:r>
+            <w:r>
+              <w:rPr>
+                <w:rFonts w:cs="BRH Malayalam Extra"/>
+                <w:color w:val="000000"/>
+                <w:szCs w:val="40"/>
+              </w:rPr>
+              <w:t>3</w:t>
+            </w:r>
+            <w:r>
+              <w:rPr>
+                <w:rFonts w:ascii="BRH Malayalam Extra" w:hAnsi="BRH Malayalam Extra" w:cs="BRH Malayalam Extra"/>
+                <w:color w:val="000000"/>
+                <w:sz w:val="32"/>
+                <w:szCs w:val="40"/>
+              </w:rPr>
+              <w:t>.</w:t>
+            </w:r>
+            <w:r>
+              <w:rPr>
+                <w:rFonts w:cs="BRH Malayalam Extra"/>
+                <w:color w:val="000000"/>
+                <w:szCs w:val="40"/>
+              </w:rPr>
+              <w:t>5</w:t>
+            </w:r>
+            <w:r>
+              <w:rPr>
+                <w:rFonts w:ascii="BRH Malayalam Extra" w:hAnsi="BRH Malayalam Extra" w:cs="BRH Malayalam Extra"/>
+                <w:color w:val="000000"/>
+                <w:sz w:val="32"/>
+                <w:szCs w:val="40"/>
+              </w:rPr>
+              <w:t>.</w:t>
+            </w:r>
+            <w:r>
+              <w:rPr>
+                <w:rFonts w:cs="BRH Malayalam Extra"/>
+                <w:color w:val="000000"/>
+                <w:szCs w:val="40"/>
+              </w:rPr>
+              <w:t>3</w:t>
+            </w:r>
+            <w:r>
+              <w:rPr>
+                <w:rFonts w:ascii="BRH Malayalam Extra" w:hAnsi="BRH Malayalam Extra" w:cs="BRH Malayalam Extra"/>
+                <w:color w:val="000000"/>
+                <w:sz w:val="32"/>
+                <w:szCs w:val="40"/>
+              </w:rPr>
+              <w:t>(</w:t>
+            </w:r>
+            <w:r>
+              <w:rPr>
+                <w:rFonts w:cs="BRH Malayalam Extra"/>
+                <w:color w:val="000000"/>
+                <w:szCs w:val="40"/>
+              </w:rPr>
+              <w:t>58</w:t>
+            </w:r>
+            <w:r>
+              <w:rPr>
+                <w:rFonts w:ascii="BRH Malayalam Extra" w:hAnsi="BRH Malayalam Extra" w:cs="BRH Malayalam Extra"/>
+                <w:color w:val="000000"/>
+                <w:sz w:val="32"/>
+                <w:szCs w:val="40"/>
+              </w:rPr>
+              <w:t>)</w:t>
+            </w:r>
+            <w:proofErr w:type="gramStart"/>
+            <w:r>
+              <w:rPr>
+                <w:rFonts w:ascii="BRH Malayalam Extra" w:hAnsi="BRH Malayalam Extra" w:cs="BRH Malayalam Extra"/>
+                <w:color w:val="000000"/>
+                <w:sz w:val="32"/>
+                <w:szCs w:val="40"/>
+              </w:rPr>
+              <w:t>-  jx</w:t>
+            </w:r>
+            <w:proofErr w:type="gramEnd"/>
+            <w:r>
+              <w:rPr>
+                <w:rFonts w:ascii="BRH Malayalam Extra" w:hAnsi="BRH Malayalam Extra" w:cs="BRH Malayalam Extra"/>
+                <w:color w:val="000000"/>
+                <w:sz w:val="26"/>
+                <w:szCs w:val="40"/>
+              </w:rPr>
+              <w:t>–</w:t>
+            </w:r>
+            <w:r>
+              <w:rPr>
+                <w:rFonts w:ascii="BRH Malayalam Extra" w:hAnsi="BRH Malayalam Extra" w:cs="BRH Malayalam Extra"/>
+                <w:color w:val="000000"/>
+                <w:sz w:val="32"/>
+                <w:szCs w:val="40"/>
+              </w:rPr>
+              <w:t>Rõx˜ | B | G</w:t>
+            </w:r>
+            <w:r>
+              <w:rPr>
+                <w:rFonts w:ascii="BRH Malayalam Extra" w:hAnsi="BRH Malayalam Extra" w:cs="BRH Malayalam Extra"/>
+                <w:color w:val="000000"/>
+                <w:sz w:val="26"/>
+                <w:szCs w:val="40"/>
+              </w:rPr>
+              <w:t>–</w:t>
+            </w:r>
+            <w:r>
+              <w:rPr>
+                <w:rFonts w:ascii="BRH Malayalam Extra" w:hAnsi="BRH Malayalam Extra" w:cs="BRH Malayalam Extra"/>
+                <w:color w:val="000000"/>
+                <w:sz w:val="32"/>
+                <w:szCs w:val="40"/>
+              </w:rPr>
+              <w:t xml:space="preserve">p | </w:t>
+            </w:r>
           </w:p>
-        </w:tc>
-        <w:tc>
-          <w:tcPr>
-            <w:tcW w:w="7371" w:type="dxa"/>
-            <w:tcBorders>
-              <w:top w:val="single" w:sz="4" w:space="0" w:color="000000"/>
-              <w:left w:val="single" w:sz="4" w:space="0" w:color="000000"/>
-              <w:bottom w:val="single" w:sz="4" w:space="0" w:color="000000"/>
-              <w:right w:val="single" w:sz="4" w:space="0" w:color="000000"/>
-            </w:tcBorders>
-          </w:tcPr>
           <w:p>
             <w:pPr>
               <w:widowControl w:val="0"/>
@@ -2828,14 +3787,170 @@
               <w:adjustRightInd w:val="0"/>
               <w:spacing w:before="0" w:line="240" w:lineRule="auto"/>
               <w:rPr>
+                <w:rFonts w:ascii="BRH Malayalam Extra" w:hAnsi="BRH Malayalam Extra" w:cs="BRH Malayalam Extra"/>
+                <w:color w:val="000000"/>
+                <w:sz w:val="32"/>
+                <w:szCs w:val="40"/>
+              </w:rPr>
+            </w:pPr>
+            <w:r>
+              <w:rPr>
+                <w:rFonts w:ascii="BRH Malayalam Extra" w:hAnsi="BRH Malayalam Extra" w:cs="BRH Malayalam Extra"/>
+                <w:color w:val="000000"/>
+                <w:sz w:val="32"/>
+                <w:szCs w:val="40"/>
+              </w:rPr>
+              <w:lastRenderedPageBreak/>
+              <w:t>jx</w:t>
+            </w:r>
+            <w:r>
+              <w:rPr>
+                <w:rFonts w:ascii="BRH Malayalam Extra" w:hAnsi="BRH Malayalam Extra" w:cs="BRH Malayalam Extra"/>
+                <w:color w:val="000000"/>
+                <w:sz w:val="26"/>
+                <w:szCs w:val="40"/>
+                <w:highlight w:val="green"/>
+              </w:rPr>
+              <w:t>–</w:t>
+            </w:r>
+            <w:r>
+              <w:rPr>
+                <w:rFonts w:ascii="BRH Malayalam Extra" w:hAnsi="BRH Malayalam Extra" w:cs="BRH Malayalam Extra"/>
+                <w:color w:val="000000"/>
+                <w:sz w:val="32"/>
+                <w:szCs w:val="40"/>
+                <w:highlight w:val="green"/>
+              </w:rPr>
+              <w:t>Rõx</w:t>
+            </w:r>
+            <w:r>
+              <w:rPr>
+                <w:rFonts w:ascii="BRH Malayalam Extra" w:hAnsi="BRH Malayalam Extra" w:cs="BRH Malayalam Extra"/>
+                <w:color w:val="000000"/>
+                <w:sz w:val="32"/>
+                <w:szCs w:val="40"/>
+              </w:rPr>
+              <w:t xml:space="preserve"> „„jx</w:t>
+            </w:r>
+            <w:r>
+              <w:rPr>
+                <w:rFonts w:ascii="BRH Malayalam Extra" w:hAnsi="BRH Malayalam Extra" w:cs="BRH Malayalam Extra"/>
+                <w:color w:val="000000"/>
+                <w:sz w:val="26"/>
+                <w:szCs w:val="40"/>
+              </w:rPr>
+              <w:t>–</w:t>
+            </w:r>
+            <w:r>
+              <w:rPr>
+                <w:rFonts w:ascii="BRH Malayalam Extra" w:hAnsi="BRH Malayalam Extra" w:cs="BRH Malayalam Extra"/>
+                <w:color w:val="000000"/>
+                <w:sz w:val="32"/>
+                <w:szCs w:val="40"/>
+              </w:rPr>
+              <w:t>Rõx— jx</w:t>
+            </w:r>
+            <w:r>
+              <w:rPr>
+                <w:rFonts w:ascii="BRH Malayalam Extra" w:hAnsi="BRH Malayalam Extra" w:cs="BRH Malayalam Extra"/>
+                <w:color w:val="000000"/>
+                <w:sz w:val="26"/>
+                <w:szCs w:val="40"/>
+                <w:highlight w:val="green"/>
+              </w:rPr>
+              <w:t>–</w:t>
+            </w:r>
+            <w:r>
+              <w:rPr>
+                <w:rFonts w:ascii="BRH Malayalam Extra" w:hAnsi="BRH Malayalam Extra" w:cs="BRH Malayalam Extra"/>
+                <w:color w:val="000000"/>
+                <w:sz w:val="32"/>
+                <w:szCs w:val="40"/>
+                <w:highlight w:val="green"/>
+              </w:rPr>
+              <w:t>¤¤Rõ</w:t>
+            </w:r>
+            <w:r>
+              <w:rPr>
+                <w:rFonts w:ascii="BRH Malayalam Extra" w:hAnsi="BRH Malayalam Extra" w:cs="BRH Malayalam Extra"/>
+                <w:color w:val="000000"/>
+                <w:sz w:val="32"/>
+                <w:szCs w:val="40"/>
+              </w:rPr>
+              <w:t>¤¤ppx jx</w:t>
+            </w:r>
+            <w:r>
+              <w:rPr>
+                <w:rFonts w:ascii="BRH Malayalam Extra" w:hAnsi="BRH Malayalam Extra" w:cs="BRH Malayalam Extra"/>
+                <w:color w:val="000000"/>
+                <w:sz w:val="26"/>
+                <w:szCs w:val="40"/>
+              </w:rPr>
+              <w:t>–</w:t>
+            </w:r>
+            <w:r>
+              <w:rPr>
+                <w:rFonts w:ascii="BRH Malayalam Extra" w:hAnsi="BRH Malayalam Extra" w:cs="BRH Malayalam Extra"/>
+                <w:color w:val="000000"/>
+                <w:sz w:val="32"/>
+                <w:szCs w:val="40"/>
+              </w:rPr>
+              <w:t xml:space="preserve">Rõx— </w:t>
+            </w:r>
+          </w:p>
+          <w:p>
+            <w:pPr>
+              <w:widowControl w:val="0"/>
+              <w:autoSpaceDE w:val="0"/>
+              <w:autoSpaceDN w:val="0"/>
+              <w:adjustRightInd w:val="0"/>
+              <w:spacing w:before="0" w:line="240" w:lineRule="auto"/>
+              <w:rPr>
                 <w:rFonts w:cs="Latha"/>
                 <w:b/>
                 <w:bCs/>
                 <w:szCs w:val="24"/>
                 <w:cs/>
-                <w:lang w:val="it-IT" w:bidi="ta-IN"/>
+                <w:lang w:bidi="ta-IN"/>
               </w:rPr>
             </w:pPr>
+            <w:r>
+              <w:rPr>
+                <w:rFonts w:ascii="BRH Malayalam Extra" w:hAnsi="BRH Malayalam Extra" w:cs="BRH Malayalam Extra"/>
+                <w:color w:val="000000"/>
+                <w:sz w:val="32"/>
+                <w:szCs w:val="40"/>
+              </w:rPr>
+              <w:t>jx</w:t>
+            </w:r>
+            <w:r>
+              <w:rPr>
+                <w:rFonts w:ascii="BRH Malayalam Extra" w:hAnsi="BRH Malayalam Extra" w:cs="BRH Malayalam Extra"/>
+                <w:color w:val="000000"/>
+                <w:sz w:val="26"/>
+                <w:szCs w:val="40"/>
+              </w:rPr>
+              <w:t>–</w:t>
+            </w:r>
+            <w:r>
+              <w:rPr>
+                <w:rFonts w:ascii="BRH Malayalam Extra" w:hAnsi="BRH Malayalam Extra" w:cs="BRH Malayalam Extra"/>
+                <w:color w:val="000000"/>
+                <w:sz w:val="32"/>
+                <w:szCs w:val="40"/>
+                <w:highlight w:val="green"/>
+              </w:rPr>
+              <w:t>¤¤Rõ</w:t>
+            </w:r>
+            <w:r>
+              <w:rPr>
+                <w:rFonts w:ascii="BRH Malayalam Extra" w:hAnsi="BRH Malayalam Extra" w:cs="BRH Malayalam Extra"/>
+                <w:color w:val="000000"/>
+                <w:sz w:val="32"/>
+                <w:szCs w:val="40"/>
+              </w:rPr>
+              <w:t xml:space="preserve">p | </w:t>
+            </w:r>
           </w:p>
         </w:tc>
       </w:tr>
@@ -2850,9 +3965,18 @@
           <w:sz w:val="32"/>
           <w:szCs w:val="32"/>
           <w:u w:val="single"/>
-          <w:lang w:val="it-IT"/>
         </w:rPr>
       </w:pPr>
+      <w:r>
+        <w:rPr>
+          <w:b/>
+          <w:bCs/>
+          <w:sz w:val="32"/>
+          <w:szCs w:val="32"/>
+          <w:u w:val="single"/>
+        </w:rPr>
+        <w:t>===============</w:t>
+      </w:r>
     </w:p>
     <w:p>
       <w:pPr>
@@ -2864,21 +3988,6 @@
           <w:sz w:val="32"/>
           <w:szCs w:val="32"/>
           <w:u w:val="single"/>
-          <w:lang w:val="it-IT"/>
-        </w:rPr>
-      </w:pPr>
-    </w:p>
-    <w:p>
-      <w:pPr>
-        <w:spacing w:before="0" w:line="240" w:lineRule="auto"/>
-        <w:jc w:val="center"/>
-        <w:rPr>
-          <w:b/>
-          <w:bCs/>
-          <w:sz w:val="32"/>
-          <w:szCs w:val="32"/>
-          <w:u w:val="single"/>
-          <w:lang w:val="it-IT"/>
         </w:rPr>
       </w:pPr>
     </w:p>
@@ -4323,6 +5432,22 @@
                 <w:lang w:val="it-IT"/>
               </w:rPr>
             </w:pPr>
+          </w:p>
+          <w:p>
+            <w:pPr>
+              <w:widowControl w:val="0"/>
+              <w:autoSpaceDE w:val="0"/>
+              <w:autoSpaceDN w:val="0"/>
+              <w:adjustRightInd w:val="0"/>
+              <w:spacing w:before="0" w:line="240" w:lineRule="auto"/>
+              <w:rPr>
+                <w:rFonts w:ascii="BRH Malayalam Extra" w:hAnsi="BRH Malayalam Extra" w:cs="BRH Malayalam Extra"/>
+                <w:color w:val="000000"/>
+                <w:sz w:val="32"/>
+                <w:szCs w:val="40"/>
+                <w:lang w:val="it-IT"/>
+              </w:rPr>
+            </w:pPr>
             <w:r>
               <w:rPr>
                 <w:rFonts w:cs="BRH Malayalam Extra"/>
@@ -6584,6 +7709,22 @@
               </w:rPr>
               <w:t xml:space="preserve"> h—pZy | </w:t>
             </w:r>
+          </w:p>
+          <w:p>
+            <w:pPr>
+              <w:widowControl w:val="0"/>
+              <w:autoSpaceDE w:val="0"/>
+              <w:autoSpaceDN w:val="0"/>
+              <w:adjustRightInd w:val="0"/>
+              <w:spacing w:before="0" w:line="240" w:lineRule="auto"/>
+              <w:rPr>
+                <w:rFonts w:ascii="BRH Malayalam Extra" w:hAnsi="BRH Malayalam Extra" w:cs="BRH Malayalam Extra"/>
+                <w:color w:val="000000"/>
+                <w:sz w:val="32"/>
+                <w:szCs w:val="40"/>
+                <w:lang w:val="it-IT"/>
+              </w:rPr>
+            </w:pPr>
           </w:p>
           <w:p>
             <w:pPr>
@@ -21186,6 +22327,45 @@
           <w:u w:val="single"/>
         </w:rPr>
       </w:pPr>
+    </w:p>
+    <w:p>
+      <w:pPr>
+        <w:spacing w:before="0" w:line="240" w:lineRule="auto"/>
+        <w:jc w:val="center"/>
+        <w:rPr>
+          <w:b/>
+          <w:bCs/>
+          <w:sz w:val="32"/>
+          <w:szCs w:val="32"/>
+          <w:u w:val="single"/>
+        </w:rPr>
+      </w:pPr>
+    </w:p>
+    <w:p>
+      <w:pPr>
+        <w:spacing w:before="0" w:line="240" w:lineRule="auto"/>
+        <w:jc w:val="center"/>
+        <w:rPr>
+          <w:b/>
+          <w:bCs/>
+          <w:sz w:val="32"/>
+          <w:szCs w:val="32"/>
+          <w:u w:val="single"/>
+        </w:rPr>
+      </w:pPr>
+    </w:p>
+    <w:p>
+      <w:pPr>
+        <w:spacing w:before="0" w:line="240" w:lineRule="auto"/>
+        <w:jc w:val="center"/>
+        <w:rPr>
+          <w:b/>
+          <w:bCs/>
+          <w:sz w:val="32"/>
+          <w:szCs w:val="32"/>
+          <w:u w:val="single"/>
+        </w:rPr>
+      </w:pPr>
       <w:r>
         <w:rPr>
           <w:b/>
@@ -21194,6 +22374,7 @@
           <w:szCs w:val="32"/>
           <w:u w:val="single"/>
         </w:rPr>
+        <w:lastRenderedPageBreak/>
         <w:t xml:space="preserve">TS Ghanam – TS </w:t>
       </w:r>
       <w:r>
@@ -21348,7 +22529,6 @@
                 <w:sz w:val="32"/>
                 <w:szCs w:val="32"/>
               </w:rPr>
-              <w:lastRenderedPageBreak/>
               <w:t>Section, Paragraph</w:t>
             </w:r>
           </w:p>
@@ -21592,7 +22772,7 @@
 </file>
 
 <file path=word/endnotes.xml><?xml version="1.0" encoding="utf-8"?>
-<w:endnotes xmlns:wpc="http://schemas.microsoft.com/office/word/2010/wordprocessingCanvas" xmlns:cx="http://schemas.microsoft.com/office/drawing/2014/chartex" xmlns:cx1="http://schemas.microsoft.com/office/drawing/2015/9/8/chartex" xmlns:cx2="http://schemas.microsoft.com/office/drawing/2015/10/21/chartex" xmlns:cx3="http://schemas.microsoft.com/office/drawing/2016/5/9/chartex" xmlns:cx4="http://schemas.microsoft.com/office/drawing/2016/5/10/chartex" xmlns:cx5="http://schemas.microsoft.com/office/drawing/2016/5/11/chartex" xmlns:cx6="http://schemas.microsoft.com/office/drawing/2016/5/12/chartex" xmlns:cx7="http://schemas.microsoft.com/office/drawing/2016/5/13/chartex" xmlns:cx8="http://schemas.microsoft.com/office/drawing/2016/5/14/chartex" xmlns:mc="http://schemas.openxmlformats.org/markup-compatibility/2006" xmlns:aink="http://schemas.microsoft.com/office/drawing/2016/ink" xmlns:am3d="http://schemas.microsoft.com/office/drawing/2017/model3d" xmlns:o="urn:schemas-microsoft-com:office:office" xmlns:oel="http://schemas.microsoft.com/office/2019/extlst" xmlns:r="http://schemas.openxmlformats.org/officeDocument/2006/relationships" xmlns:m="http://schemas.openxmlformats.org/officeDocument/2006/math" xmlns:v="urn:schemas-microsoft-com:vml" xmlns:wp14="http://schemas.microsoft.com/office/word/2010/wordprocessingDrawing" xmlns:wp="http://schemas.openxmlformats.org/drawingml/2006/wordprocessingDrawing" xmlns:w10="urn:schemas-microsoft-com:office:word" xmlns:w="http://schemas.openxmlformats.org/wordprocessingml/2006/main" xmlns:w14="http://schemas.microsoft.com/office/word/2010/wordml" xmlns:w15="http://schemas.microsoft.com/office/word/2012/wordml" xmlns:w16cex="http://schemas.microsoft.com/office/word/2018/wordml/cex" xmlns:w16cid="http://schemas.microsoft.com/office/word/2016/wordml/cid" xmlns:w16="http://schemas.microsoft.com/office/word/2018/wordml" xmlns:w16du="http://schemas.microsoft.com/office/word/2023/wordml/word16du" xmlns:w16sdtdh="http://schemas.microsoft.com/office/word/2020/wordml/sdtdatahash" xmlns:w16sdtfl="http://schemas.microsoft.com/office/word/2024/wordml/sdtformatlock" xmlns:w16se="http://schemas.microsoft.com/office/word/2015/wordml/symex" xmlns:wpg="http://schemas.microsoft.com/office/word/2010/wordprocessingGroup" xmlns:wpi="http://schemas.microsoft.com/office/word/2010/wordprocessingInk" xmlns:wne="http://schemas.microsoft.com/office/word/2006/wordml" xmlns:wps="http://schemas.microsoft.com/office/word/2010/wordprocessingShape" mc:Ignorable="w14 w15 w16se w16cid w16 w16cex w16sdtdh w16sdtfl w16du wp14">
+<w:endnotes xmlns:wpc="http://schemas.microsoft.com/office/word/2010/wordprocessingCanvas" xmlns:cx="http://schemas.microsoft.com/office/drawing/2014/chartex" xmlns:cx1="http://schemas.microsoft.com/office/drawing/2015/9/8/chartex" xmlns:cx2="http://schemas.microsoft.com/office/drawing/2015/10/21/chartex" xmlns:cx3="http://schemas.microsoft.com/office/drawing/2016/5/9/chartex" xmlns:cx4="http://schemas.microsoft.com/office/drawing/2016/5/10/chartex" xmlns:cx5="http://schemas.microsoft.com/office/drawing/2016/5/11/chartex" xmlns:cx6="http://schemas.microsoft.com/office/drawing/2016/5/12/chartex" xmlns:cx7="http://schemas.microsoft.com/office/drawing/2016/5/13/chartex" xmlns:cx8="http://schemas.microsoft.com/office/drawing/2016/5/14/chartex" xmlns:mc="http://schemas.openxmlformats.org/markup-compatibility/2006" xmlns:aink="http://schemas.microsoft.com/office/drawing/2016/ink" xmlns:am3d="http://schemas.microsoft.com/office/drawing/2017/model3d" xmlns:o="urn:schemas-microsoft-com:office:office" xmlns:oel="http://schemas.microsoft.com/office/2019/extlst" xmlns:r="http://schemas.openxmlformats.org/officeDocument/2006/relationships" xmlns:m="http://schemas.openxmlformats.org/officeDocument/2006/math" xmlns:v="urn:schemas-microsoft-com:vml" xmlns:wp14="http://schemas.microsoft.com/office/word/2010/wordprocessingDrawing" xmlns:wp="http://schemas.openxmlformats.org/drawingml/2006/wordprocessingDrawing" xmlns:w10="urn:schemas-microsoft-com:office:word" xmlns:w="http://schemas.openxmlformats.org/wordprocessingml/2006/main" xmlns:w14="http://schemas.microsoft.com/office/word/2010/wordml" xmlns:w15="http://schemas.microsoft.com/office/word/2012/wordml" xmlns:w16cei="http://schemas.microsoft.com/office/word/2026/wordml/cei" xmlns:w16cex="http://schemas.microsoft.com/office/word/2018/wordml/cex" xmlns:w16cid="http://schemas.microsoft.com/office/word/2016/wordml/cid" xmlns:w16="http://schemas.microsoft.com/office/word/2018/wordml" xmlns:w16du="http://schemas.microsoft.com/office/word/2023/wordml/word16du" xmlns:w16sdtdh="http://schemas.microsoft.com/office/word/2020/wordml/sdtdatahash" xmlns:w16sdtfl="http://schemas.microsoft.com/office/word/2024/wordml/sdtformatlock" xmlns:w16se="http://schemas.microsoft.com/office/word/2015/wordml/symex" xmlns:wpg="http://schemas.microsoft.com/office/word/2010/wordprocessingGroup" xmlns:wpi="http://schemas.microsoft.com/office/word/2010/wordprocessingInk" xmlns:wne="http://schemas.microsoft.com/office/word/2006/wordml" xmlns:wps="http://schemas.microsoft.com/office/word/2010/wordprocessingShape" mc:Ignorable="w14 w15 w16se w16cid w16 w16cex w16sdtdh w16sdtfl w16du wp14">
   <w:endnote w:type="separator" w:id="-1">
     <w:p>
       <w:pPr>
@@ -21617,7 +22797,7 @@
 </file>
 
 <file path=word/footer1.xml><?xml version="1.0" encoding="utf-8"?>
-<w:ftr xmlns:wpc="http://schemas.microsoft.com/office/word/2010/wordprocessingCanvas" xmlns:cx="http://schemas.microsoft.com/office/drawing/2014/chartex" xmlns:cx1="http://schemas.microsoft.com/office/drawing/2015/9/8/chartex" xmlns:cx2="http://schemas.microsoft.com/office/drawing/2015/10/21/chartex" xmlns:cx3="http://schemas.microsoft.com/office/drawing/2016/5/9/chartex" xmlns:cx4="http://schemas.microsoft.com/office/drawing/2016/5/10/chartex" xmlns:cx5="http://schemas.microsoft.com/office/drawing/2016/5/11/chartex" xmlns:cx6="http://schemas.microsoft.com/office/drawing/2016/5/12/chartex" xmlns:cx7="http://schemas.microsoft.com/office/drawing/2016/5/13/chartex" xmlns:cx8="http://schemas.microsoft.com/office/drawing/2016/5/14/chartex" xmlns:mc="http://schemas.openxmlformats.org/markup-compatibility/2006" xmlns:aink="http://schemas.microsoft.com/office/drawing/2016/ink" xmlns:am3d="http://schemas.microsoft.com/office/drawing/2017/model3d" xmlns:o="urn:schemas-microsoft-com:office:office" xmlns:oel="http://schemas.microsoft.com/office/2019/extlst" xmlns:r="http://schemas.openxmlformats.org/officeDocument/2006/relationships" xmlns:m="http://schemas.openxmlformats.org/officeDocument/2006/math" xmlns:v="urn:schemas-microsoft-com:vml" xmlns:wp14="http://schemas.microsoft.com/office/word/2010/wordprocessingDrawing" xmlns:wp="http://schemas.openxmlformats.org/drawingml/2006/wordprocessingDrawing" xmlns:w10="urn:schemas-microsoft-com:office:word" xmlns:w="http://schemas.openxmlformats.org/wordprocessingml/2006/main" xmlns:w14="http://schemas.microsoft.com/office/word/2010/wordml" xmlns:w15="http://schemas.microsoft.com/office/word/2012/wordml" xmlns:w16cex="http://schemas.microsoft.com/office/word/2018/wordml/cex" xmlns:w16cid="http://schemas.microsoft.com/office/word/2016/wordml/cid" xmlns:w16="http://schemas.microsoft.com/office/word/2018/wordml" xmlns:w16du="http://schemas.microsoft.com/office/word/2023/wordml/word16du" xmlns:w16sdtdh="http://schemas.microsoft.com/office/word/2020/wordml/sdtdatahash" xmlns:w16sdtfl="http://schemas.microsoft.com/office/word/2024/wordml/sdtformatlock" xmlns:w16se="http://schemas.microsoft.com/office/word/2015/wordml/symex" xmlns:wpg="http://schemas.microsoft.com/office/word/2010/wordprocessingGroup" xmlns:wpi="http://schemas.microsoft.com/office/word/2010/wordprocessingInk" xmlns:wne="http://schemas.microsoft.com/office/word/2006/wordml" xmlns:wps="http://schemas.microsoft.com/office/word/2010/wordprocessingShape" mc:Ignorable="w14 w15 w16se w16cid w16 w16cex w16sdtdh w16sdtfl w16du wp14">
+<w:ftr xmlns:wpc="http://schemas.microsoft.com/office/word/2010/wordprocessingCanvas" xmlns:cx="http://schemas.microsoft.com/office/drawing/2014/chartex" xmlns:cx1="http://schemas.microsoft.com/office/drawing/2015/9/8/chartex" xmlns:cx2="http://schemas.microsoft.com/office/drawing/2015/10/21/chartex" xmlns:cx3="http://schemas.microsoft.com/office/drawing/2016/5/9/chartex" xmlns:cx4="http://schemas.microsoft.com/office/drawing/2016/5/10/chartex" xmlns:cx5="http://schemas.microsoft.com/office/drawing/2016/5/11/chartex" xmlns:cx6="http://schemas.microsoft.com/office/drawing/2016/5/12/chartex" xmlns:cx7="http://schemas.microsoft.com/office/drawing/2016/5/13/chartex" xmlns:cx8="http://schemas.microsoft.com/office/drawing/2016/5/14/chartex" xmlns:mc="http://schemas.openxmlformats.org/markup-compatibility/2006" xmlns:aink="http://schemas.microsoft.com/office/drawing/2016/ink" xmlns:am3d="http://schemas.microsoft.com/office/drawing/2017/model3d" xmlns:o="urn:schemas-microsoft-com:office:office" xmlns:oel="http://schemas.microsoft.com/office/2019/extlst" xmlns:r="http://schemas.openxmlformats.org/officeDocument/2006/relationships" xmlns:m="http://schemas.openxmlformats.org/officeDocument/2006/math" xmlns:v="urn:schemas-microsoft-com:vml" xmlns:wp14="http://schemas.microsoft.com/office/word/2010/wordprocessingDrawing" xmlns:wp="http://schemas.openxmlformats.org/drawingml/2006/wordprocessingDrawing" xmlns:w10="urn:schemas-microsoft-com:office:word" xmlns:w="http://schemas.openxmlformats.org/wordprocessingml/2006/main" xmlns:w14="http://schemas.microsoft.com/office/word/2010/wordml" xmlns:w15="http://schemas.microsoft.com/office/word/2012/wordml" xmlns:w16cei="http://schemas.microsoft.com/office/word/2026/wordml/cei" xmlns:w16cex="http://schemas.microsoft.com/office/word/2018/wordml/cex" xmlns:w16cid="http://schemas.microsoft.com/office/word/2016/wordml/cid" xmlns:w16="http://schemas.microsoft.com/office/word/2018/wordml" xmlns:w16du="http://schemas.microsoft.com/office/word/2023/wordml/word16du" xmlns:w16sdtdh="http://schemas.microsoft.com/office/word/2020/wordml/sdtdatahash" xmlns:w16sdtfl="http://schemas.microsoft.com/office/word/2024/wordml/sdtformatlock" xmlns:w16se="http://schemas.microsoft.com/office/word/2015/wordml/symex" xmlns:wpg="http://schemas.microsoft.com/office/word/2010/wordprocessingGroup" xmlns:wpi="http://schemas.microsoft.com/office/word/2010/wordprocessingInk" xmlns:wne="http://schemas.microsoft.com/office/word/2006/wordml" xmlns:wps="http://schemas.microsoft.com/office/word/2010/wordprocessingShape" mc:Ignorable="w14 w15 w16se w16cid w16 w16cex w16sdtdh w16sdtfl w16du wp14">
   <w:p>
     <w:pPr>
       <w:pBdr>
@@ -21802,7 +22982,7 @@
 </file>
 
 <file path=word/footer2.xml><?xml version="1.0" encoding="utf-8"?>
-<w:ftr xmlns:wpc="http://schemas.microsoft.com/office/word/2010/wordprocessingCanvas" xmlns:cx="http://schemas.microsoft.com/office/drawing/2014/chartex" xmlns:cx1="http://schemas.microsoft.com/office/drawing/2015/9/8/chartex" xmlns:cx2="http://schemas.microsoft.com/office/drawing/2015/10/21/chartex" xmlns:cx3="http://schemas.microsoft.com/office/drawing/2016/5/9/chartex" xmlns:cx4="http://schemas.microsoft.com/office/drawing/2016/5/10/chartex" xmlns:cx5="http://schemas.microsoft.com/office/drawing/2016/5/11/chartex" xmlns:cx6="http://schemas.microsoft.com/office/drawing/2016/5/12/chartex" xmlns:cx7="http://schemas.microsoft.com/office/drawing/2016/5/13/chartex" xmlns:cx8="http://schemas.microsoft.com/office/drawing/2016/5/14/chartex" xmlns:mc="http://schemas.openxmlformats.org/markup-compatibility/2006" xmlns:aink="http://schemas.microsoft.com/office/drawing/2016/ink" xmlns:am3d="http://schemas.microsoft.com/office/drawing/2017/model3d" xmlns:o="urn:schemas-microsoft-com:office:office" xmlns:oel="http://schemas.microsoft.com/office/2019/extlst" xmlns:r="http://schemas.openxmlformats.org/officeDocument/2006/relationships" xmlns:m="http://schemas.openxmlformats.org/officeDocument/2006/math" xmlns:v="urn:schemas-microsoft-com:vml" xmlns:wp14="http://schemas.microsoft.com/office/word/2010/wordprocessingDrawing" xmlns:wp="http://schemas.openxmlformats.org/drawingml/2006/wordprocessingDrawing" xmlns:w10="urn:schemas-microsoft-com:office:word" xmlns:w="http://schemas.openxmlformats.org/wordprocessingml/2006/main" xmlns:w14="http://schemas.microsoft.com/office/word/2010/wordml" xmlns:w15="http://schemas.microsoft.com/office/word/2012/wordml" xmlns:w16cex="http://schemas.microsoft.com/office/word/2018/wordml/cex" xmlns:w16cid="http://schemas.microsoft.com/office/word/2016/wordml/cid" xmlns:w16="http://schemas.microsoft.com/office/word/2018/wordml" xmlns:w16du="http://schemas.microsoft.com/office/word/2023/wordml/word16du" xmlns:w16sdtdh="http://schemas.microsoft.com/office/word/2020/wordml/sdtdatahash" xmlns:w16sdtfl="http://schemas.microsoft.com/office/word/2024/wordml/sdtformatlock" xmlns:w16se="http://schemas.microsoft.com/office/word/2015/wordml/symex" xmlns:wpg="http://schemas.microsoft.com/office/word/2010/wordprocessingGroup" xmlns:wpi="http://schemas.microsoft.com/office/word/2010/wordprocessingInk" xmlns:wne="http://schemas.microsoft.com/office/word/2006/wordml" xmlns:wps="http://schemas.microsoft.com/office/word/2010/wordprocessingShape" mc:Ignorable="w14 w15 w16se w16cid w16 w16cex w16sdtdh w16sdtfl w16du wp14">
+<w:ftr xmlns:wpc="http://schemas.microsoft.com/office/word/2010/wordprocessingCanvas" xmlns:cx="http://schemas.microsoft.com/office/drawing/2014/chartex" xmlns:cx1="http://schemas.microsoft.com/office/drawing/2015/9/8/chartex" xmlns:cx2="http://schemas.microsoft.com/office/drawing/2015/10/21/chartex" xmlns:cx3="http://schemas.microsoft.com/office/drawing/2016/5/9/chartex" xmlns:cx4="http://schemas.microsoft.com/office/drawing/2016/5/10/chartex" xmlns:cx5="http://schemas.microsoft.com/office/drawing/2016/5/11/chartex" xmlns:cx6="http://schemas.microsoft.com/office/drawing/2016/5/12/chartex" xmlns:cx7="http://schemas.microsoft.com/office/drawing/2016/5/13/chartex" xmlns:cx8="http://schemas.microsoft.com/office/drawing/2016/5/14/chartex" xmlns:mc="http://schemas.openxmlformats.org/markup-compatibility/2006" xmlns:aink="http://schemas.microsoft.com/office/drawing/2016/ink" xmlns:am3d="http://schemas.microsoft.com/office/drawing/2017/model3d" xmlns:o="urn:schemas-microsoft-com:office:office" xmlns:oel="http://schemas.microsoft.com/office/2019/extlst" xmlns:r="http://schemas.openxmlformats.org/officeDocument/2006/relationships" xmlns:m="http://schemas.openxmlformats.org/officeDocument/2006/math" xmlns:v="urn:schemas-microsoft-com:vml" xmlns:wp14="http://schemas.microsoft.com/office/word/2010/wordprocessingDrawing" xmlns:wp="http://schemas.openxmlformats.org/drawingml/2006/wordprocessingDrawing" xmlns:w10="urn:schemas-microsoft-com:office:word" xmlns:w="http://schemas.openxmlformats.org/wordprocessingml/2006/main" xmlns:w14="http://schemas.microsoft.com/office/word/2010/wordml" xmlns:w15="http://schemas.microsoft.com/office/word/2012/wordml" xmlns:w16cei="http://schemas.microsoft.com/office/word/2026/wordml/cei" xmlns:w16cex="http://schemas.microsoft.com/office/word/2018/wordml/cex" xmlns:w16cid="http://schemas.microsoft.com/office/word/2016/wordml/cid" xmlns:w16="http://schemas.microsoft.com/office/word/2018/wordml" xmlns:w16du="http://schemas.microsoft.com/office/word/2023/wordml/word16du" xmlns:w16sdtdh="http://schemas.microsoft.com/office/word/2020/wordml/sdtdatahash" xmlns:w16sdtfl="http://schemas.microsoft.com/office/word/2024/wordml/sdtformatlock" xmlns:w16se="http://schemas.microsoft.com/office/word/2015/wordml/symex" xmlns:wpg="http://schemas.microsoft.com/office/word/2010/wordprocessingGroup" xmlns:wpi="http://schemas.microsoft.com/office/word/2010/wordprocessingInk" xmlns:wne="http://schemas.microsoft.com/office/word/2006/wordml" xmlns:wps="http://schemas.microsoft.com/office/word/2010/wordprocessingShape" mc:Ignorable="w14 w15 w16se w16cid w16 w16cex w16sdtdh w16sdtfl w16du wp14">
   <w:p>
     <w:pPr>
       <w:pBdr>
@@ -22008,7 +23188,7 @@
 </file>
 
 <file path=word/footer3.xml><?xml version="1.0" encoding="utf-8"?>
-<w:ftr xmlns:wpc="http://schemas.microsoft.com/office/word/2010/wordprocessingCanvas" xmlns:cx="http://schemas.microsoft.com/office/drawing/2014/chartex" xmlns:cx1="http://schemas.microsoft.com/office/drawing/2015/9/8/chartex" xmlns:cx2="http://schemas.microsoft.com/office/drawing/2015/10/21/chartex" xmlns:cx3="http://schemas.microsoft.com/office/drawing/2016/5/9/chartex" xmlns:cx4="http://schemas.microsoft.com/office/drawing/2016/5/10/chartex" xmlns:cx5="http://schemas.microsoft.com/office/drawing/2016/5/11/chartex" xmlns:cx6="http://schemas.microsoft.com/office/drawing/2016/5/12/chartex" xmlns:cx7="http://schemas.microsoft.com/office/drawing/2016/5/13/chartex" xmlns:cx8="http://schemas.microsoft.com/office/drawing/2016/5/14/chartex" xmlns:mc="http://schemas.openxmlformats.org/markup-compatibility/2006" xmlns:aink="http://schemas.microsoft.com/office/drawing/2016/ink" xmlns:am3d="http://schemas.microsoft.com/office/drawing/2017/model3d" xmlns:o="urn:schemas-microsoft-com:office:office" xmlns:oel="http://schemas.microsoft.com/office/2019/extlst" xmlns:r="http://schemas.openxmlformats.org/officeDocument/2006/relationships" xmlns:m="http://schemas.openxmlformats.org/officeDocument/2006/math" xmlns:v="urn:schemas-microsoft-com:vml" xmlns:wp14="http://schemas.microsoft.com/office/word/2010/wordprocessingDrawing" xmlns:wp="http://schemas.openxmlformats.org/drawingml/2006/wordprocessingDrawing" xmlns:w10="urn:schemas-microsoft-com:office:word" xmlns:w="http://schemas.openxmlformats.org/wordprocessingml/2006/main" xmlns:w14="http://schemas.microsoft.com/office/word/2010/wordml" xmlns:w15="http://schemas.microsoft.com/office/word/2012/wordml" xmlns:w16cex="http://schemas.microsoft.com/office/word/2018/wordml/cex" xmlns:w16cid="http://schemas.microsoft.com/office/word/2016/wordml/cid" xmlns:w16="http://schemas.microsoft.com/office/word/2018/wordml" xmlns:w16du="http://schemas.microsoft.com/office/word/2023/wordml/word16du" xmlns:w16sdtdh="http://schemas.microsoft.com/office/word/2020/wordml/sdtdatahash" xmlns:w16sdtfl="http://schemas.microsoft.com/office/word/2024/wordml/sdtformatlock" xmlns:w16se="http://schemas.microsoft.com/office/word/2015/wordml/symex" xmlns:wpg="http://schemas.microsoft.com/office/word/2010/wordprocessingGroup" xmlns:wpi="http://schemas.microsoft.com/office/word/2010/wordprocessingInk" xmlns:wne="http://schemas.microsoft.com/office/word/2006/wordml" xmlns:wps="http://schemas.microsoft.com/office/word/2010/wordprocessingShape" mc:Ignorable="w14 w15 w16se w16cid w16 w16cex w16sdtdh w16sdtfl w16du wp14">
+<w:ftr xmlns:wpc="http://schemas.microsoft.com/office/word/2010/wordprocessingCanvas" xmlns:cx="http://schemas.microsoft.com/office/drawing/2014/chartex" xmlns:cx1="http://schemas.microsoft.com/office/drawing/2015/9/8/chartex" xmlns:cx2="http://schemas.microsoft.com/office/drawing/2015/10/21/chartex" xmlns:cx3="http://schemas.microsoft.com/office/drawing/2016/5/9/chartex" xmlns:cx4="http://schemas.microsoft.com/office/drawing/2016/5/10/chartex" xmlns:cx5="http://schemas.microsoft.com/office/drawing/2016/5/11/chartex" xmlns:cx6="http://schemas.microsoft.com/office/drawing/2016/5/12/chartex" xmlns:cx7="http://schemas.microsoft.com/office/drawing/2016/5/13/chartex" xmlns:cx8="http://schemas.microsoft.com/office/drawing/2016/5/14/chartex" xmlns:mc="http://schemas.openxmlformats.org/markup-compatibility/2006" xmlns:aink="http://schemas.microsoft.com/office/drawing/2016/ink" xmlns:am3d="http://schemas.microsoft.com/office/drawing/2017/model3d" xmlns:o="urn:schemas-microsoft-com:office:office" xmlns:oel="http://schemas.microsoft.com/office/2019/extlst" xmlns:r="http://schemas.openxmlformats.org/officeDocument/2006/relationships" xmlns:m="http://schemas.openxmlformats.org/officeDocument/2006/math" xmlns:v="urn:schemas-microsoft-com:vml" xmlns:wp14="http://schemas.microsoft.com/office/word/2010/wordprocessingDrawing" xmlns:wp="http://schemas.openxmlformats.org/drawingml/2006/wordprocessingDrawing" xmlns:w10="urn:schemas-microsoft-com:office:word" xmlns:w="http://schemas.openxmlformats.org/wordprocessingml/2006/main" xmlns:w14="http://schemas.microsoft.com/office/word/2010/wordml" xmlns:w15="http://schemas.microsoft.com/office/word/2012/wordml" xmlns:w16cei="http://schemas.microsoft.com/office/word/2026/wordml/cei" xmlns:w16cex="http://schemas.microsoft.com/office/word/2018/wordml/cex" xmlns:w16cid="http://schemas.microsoft.com/office/word/2016/wordml/cid" xmlns:w16="http://schemas.microsoft.com/office/word/2018/wordml" xmlns:w16du="http://schemas.microsoft.com/office/word/2023/wordml/word16du" xmlns:w16sdtdh="http://schemas.microsoft.com/office/word/2020/wordml/sdtdatahash" xmlns:w16sdtfl="http://schemas.microsoft.com/office/word/2024/wordml/sdtformatlock" xmlns:w16se="http://schemas.microsoft.com/office/word/2015/wordml/symex" xmlns:wpg="http://schemas.microsoft.com/office/word/2010/wordprocessingGroup" xmlns:wpi="http://schemas.microsoft.com/office/word/2010/wordprocessingInk" xmlns:wne="http://schemas.microsoft.com/office/word/2006/wordml" xmlns:wps="http://schemas.microsoft.com/office/word/2010/wordprocessingShape" mc:Ignorable="w14 w15 w16se w16cid w16 w16cex w16sdtdh w16sdtfl w16du wp14">
   <w:p>
     <w:pPr>
       <w:pStyle w:val="Footer"/>
@@ -22018,7 +23198,7 @@
 </file>
 
 <file path=word/footnotes.xml><?xml version="1.0" encoding="utf-8"?>
-<w:footnotes xmlns:wpc="http://schemas.microsoft.com/office/word/2010/wordprocessingCanvas" xmlns:cx="http://schemas.microsoft.com/office/drawing/2014/chartex" xmlns:cx1="http://schemas.microsoft.com/office/drawing/2015/9/8/chartex" xmlns:cx2="http://schemas.microsoft.com/office/drawing/2015/10/21/chartex" xmlns:cx3="http://schemas.microsoft.com/office/drawing/2016/5/9/chartex" xmlns:cx4="http://schemas.microsoft.com/office/drawing/2016/5/10/chartex" xmlns:cx5="http://schemas.microsoft.com/office/drawing/2016/5/11/chartex" xmlns:cx6="http://schemas.microsoft.com/office/drawing/2016/5/12/chartex" xmlns:cx7="http://schemas.microsoft.com/office/drawing/2016/5/13/chartex" xmlns:cx8="http://schemas.microsoft.com/office/drawing/2016/5/14/chartex" xmlns:mc="http://schemas.openxmlformats.org/markup-compatibility/2006" xmlns:aink="http://schemas.microsoft.com/office/drawing/2016/ink" xmlns:am3d="http://schemas.microsoft.com/office/drawing/2017/model3d" xmlns:o="urn:schemas-microsoft-com:office:office" xmlns:oel="http://schemas.microsoft.com/office/2019/extlst" xmlns:r="http://schemas.openxmlformats.org/officeDocument/2006/relationships" xmlns:m="http://schemas.openxmlformats.org/officeDocument/2006/math" xmlns:v="urn:schemas-microsoft-com:vml" xmlns:wp14="http://schemas.microsoft.com/office/word/2010/wordprocessingDrawing" xmlns:wp="http://schemas.openxmlformats.org/drawingml/2006/wordprocessingDrawing" xmlns:w10="urn:schemas-microsoft-com:office:word" xmlns:w="http://schemas.openxmlformats.org/wordprocessingml/2006/main" xmlns:w14="http://schemas.microsoft.com/office/word/2010/wordml" xmlns:w15="http://schemas.microsoft.com/office/word/2012/wordml" xmlns:w16cex="http://schemas.microsoft.com/office/word/2018/wordml/cex" xmlns:w16cid="http://schemas.microsoft.com/office/word/2016/wordml/cid" xmlns:w16="http://schemas.microsoft.com/office/word/2018/wordml" xmlns:w16du="http://schemas.microsoft.com/office/word/2023/wordml/word16du" xmlns:w16sdtdh="http://schemas.microsoft.com/office/word/2020/wordml/sdtdatahash" xmlns:w16sdtfl="http://schemas.microsoft.com/office/word/2024/wordml/sdtformatlock" xmlns:w16se="http://schemas.microsoft.com/office/word/2015/wordml/symex" xmlns:wpg="http://schemas.microsoft.com/office/word/2010/wordprocessingGroup" xmlns:wpi="http://schemas.microsoft.com/office/word/2010/wordprocessingInk" xmlns:wne="http://schemas.microsoft.com/office/word/2006/wordml" xmlns:wps="http://schemas.microsoft.com/office/word/2010/wordprocessingShape" mc:Ignorable="w14 w15 w16se w16cid w16 w16cex w16sdtdh w16sdtfl w16du wp14">
+<w:footnotes xmlns:wpc="http://schemas.microsoft.com/office/word/2010/wordprocessingCanvas" xmlns:cx="http://schemas.microsoft.com/office/drawing/2014/chartex" xmlns:cx1="http://schemas.microsoft.com/office/drawing/2015/9/8/chartex" xmlns:cx2="http://schemas.microsoft.com/office/drawing/2015/10/21/chartex" xmlns:cx3="http://schemas.microsoft.com/office/drawing/2016/5/9/chartex" xmlns:cx4="http://schemas.microsoft.com/office/drawing/2016/5/10/chartex" xmlns:cx5="http://schemas.microsoft.com/office/drawing/2016/5/11/chartex" xmlns:cx6="http://schemas.microsoft.com/office/drawing/2016/5/12/chartex" xmlns:cx7="http://schemas.microsoft.com/office/drawing/2016/5/13/chartex" xmlns:cx8="http://schemas.microsoft.com/office/drawing/2016/5/14/chartex" xmlns:mc="http://schemas.openxmlformats.org/markup-compatibility/2006" xmlns:aink="http://schemas.microsoft.com/office/drawing/2016/ink" xmlns:am3d="http://schemas.microsoft.com/office/drawing/2017/model3d" xmlns:o="urn:schemas-microsoft-com:office:office" xmlns:oel="http://schemas.microsoft.com/office/2019/extlst" xmlns:r="http://schemas.openxmlformats.org/officeDocument/2006/relationships" xmlns:m="http://schemas.openxmlformats.org/officeDocument/2006/math" xmlns:v="urn:schemas-microsoft-com:vml" xmlns:wp14="http://schemas.microsoft.com/office/word/2010/wordprocessingDrawing" xmlns:wp="http://schemas.openxmlformats.org/drawingml/2006/wordprocessingDrawing" xmlns:w10="urn:schemas-microsoft-com:office:word" xmlns:w="http://schemas.openxmlformats.org/wordprocessingml/2006/main" xmlns:w14="http://schemas.microsoft.com/office/word/2010/wordml" xmlns:w15="http://schemas.microsoft.com/office/word/2012/wordml" xmlns:w16cei="http://schemas.microsoft.com/office/word/2026/wordml/cei" xmlns:w16cex="http://schemas.microsoft.com/office/word/2018/wordml/cex" xmlns:w16cid="http://schemas.microsoft.com/office/word/2016/wordml/cid" xmlns:w16="http://schemas.microsoft.com/office/word/2018/wordml" xmlns:w16du="http://schemas.microsoft.com/office/word/2023/wordml/word16du" xmlns:w16sdtdh="http://schemas.microsoft.com/office/word/2020/wordml/sdtdatahash" xmlns:w16sdtfl="http://schemas.microsoft.com/office/word/2024/wordml/sdtformatlock" xmlns:w16se="http://schemas.microsoft.com/office/word/2015/wordml/symex" xmlns:wpg="http://schemas.microsoft.com/office/word/2010/wordprocessingGroup" xmlns:wpi="http://schemas.microsoft.com/office/word/2010/wordprocessingInk" xmlns:wne="http://schemas.microsoft.com/office/word/2006/wordml" xmlns:wps="http://schemas.microsoft.com/office/word/2010/wordprocessingShape" mc:Ignorable="w14 w15 w16se w16cid w16 w16cex w16sdtdh w16sdtfl w16du wp14">
   <w:footnote w:type="separator" w:id="-1">
     <w:p>
       <w:pPr>
@@ -22043,7 +23223,7 @@
 </file>
 
 <file path=word/header1.xml><?xml version="1.0" encoding="utf-8"?>
-<w:hdr xmlns:wpc="http://schemas.microsoft.com/office/word/2010/wordprocessingCanvas" xmlns:cx="http://schemas.microsoft.com/office/drawing/2014/chartex" xmlns:cx1="http://schemas.microsoft.com/office/drawing/2015/9/8/chartex" xmlns:cx2="http://schemas.microsoft.com/office/drawing/2015/10/21/chartex" xmlns:cx3="http://schemas.microsoft.com/office/drawing/2016/5/9/chartex" xmlns:cx4="http://schemas.microsoft.com/office/drawing/2016/5/10/chartex" xmlns:cx5="http://schemas.microsoft.com/office/drawing/2016/5/11/chartex" xmlns:cx6="http://schemas.microsoft.com/office/drawing/2016/5/12/chartex" xmlns:cx7="http://schemas.microsoft.com/office/drawing/2016/5/13/chartex" xmlns:cx8="http://schemas.microsoft.com/office/drawing/2016/5/14/chartex" xmlns:mc="http://schemas.openxmlformats.org/markup-compatibility/2006" xmlns:aink="http://schemas.microsoft.com/office/drawing/2016/ink" xmlns:am3d="http://schemas.microsoft.com/office/drawing/2017/model3d" xmlns:o="urn:schemas-microsoft-com:office:office" xmlns:oel="http://schemas.microsoft.com/office/2019/extlst" xmlns:r="http://schemas.openxmlformats.org/officeDocument/2006/relationships" xmlns:m="http://schemas.openxmlformats.org/officeDocument/2006/math" xmlns:v="urn:schemas-microsoft-com:vml" xmlns:wp14="http://schemas.microsoft.com/office/word/2010/wordprocessingDrawing" xmlns:wp="http://schemas.openxmlformats.org/drawingml/2006/wordprocessingDrawing" xmlns:w10="urn:schemas-microsoft-com:office:word" xmlns:w="http://schemas.openxmlformats.org/wordprocessingml/2006/main" xmlns:w14="http://schemas.microsoft.com/office/word/2010/wordml" xmlns:w15="http://schemas.microsoft.com/office/word/2012/wordml" xmlns:w16cex="http://schemas.microsoft.com/office/word/2018/wordml/cex" xmlns:w16cid="http://schemas.microsoft.com/office/word/2016/wordml/cid" xmlns:w16="http://schemas.microsoft.com/office/word/2018/wordml" xmlns:w16du="http://schemas.microsoft.com/office/word/2023/wordml/word16du" xmlns:w16sdtdh="http://schemas.microsoft.com/office/word/2020/wordml/sdtdatahash" xmlns:w16sdtfl="http://schemas.microsoft.com/office/word/2024/wordml/sdtformatlock" xmlns:w16se="http://schemas.microsoft.com/office/word/2015/wordml/symex" xmlns:wpg="http://schemas.microsoft.com/office/word/2010/wordprocessingGroup" xmlns:wpi="http://schemas.microsoft.com/office/word/2010/wordprocessingInk" xmlns:wne="http://schemas.microsoft.com/office/word/2006/wordml" xmlns:wps="http://schemas.microsoft.com/office/word/2010/wordprocessingShape" mc:Ignorable="w14 w15 w16se w16cid w16 w16cex w16sdtdh w16sdtfl w16du wp14">
+<w:hdr xmlns:wpc="http://schemas.microsoft.com/office/word/2010/wordprocessingCanvas" xmlns:cx="http://schemas.microsoft.com/office/drawing/2014/chartex" xmlns:cx1="http://schemas.microsoft.com/office/drawing/2015/9/8/chartex" xmlns:cx2="http://schemas.microsoft.com/office/drawing/2015/10/21/chartex" xmlns:cx3="http://schemas.microsoft.com/office/drawing/2016/5/9/chartex" xmlns:cx4="http://schemas.microsoft.com/office/drawing/2016/5/10/chartex" xmlns:cx5="http://schemas.microsoft.com/office/drawing/2016/5/11/chartex" xmlns:cx6="http://schemas.microsoft.com/office/drawing/2016/5/12/chartex" xmlns:cx7="http://schemas.microsoft.com/office/drawing/2016/5/13/chartex" xmlns:cx8="http://schemas.microsoft.com/office/drawing/2016/5/14/chartex" xmlns:mc="http://schemas.openxmlformats.org/markup-compatibility/2006" xmlns:aink="http://schemas.microsoft.com/office/drawing/2016/ink" xmlns:am3d="http://schemas.microsoft.com/office/drawing/2017/model3d" xmlns:o="urn:schemas-microsoft-com:office:office" xmlns:oel="http://schemas.microsoft.com/office/2019/extlst" xmlns:r="http://schemas.openxmlformats.org/officeDocument/2006/relationships" xmlns:m="http://schemas.openxmlformats.org/officeDocument/2006/math" xmlns:v="urn:schemas-microsoft-com:vml" xmlns:wp14="http://schemas.microsoft.com/office/word/2010/wordprocessingDrawing" xmlns:wp="http://schemas.openxmlformats.org/drawingml/2006/wordprocessingDrawing" xmlns:w10="urn:schemas-microsoft-com:office:word" xmlns:w="http://schemas.openxmlformats.org/wordprocessingml/2006/main" xmlns:w14="http://schemas.microsoft.com/office/word/2010/wordml" xmlns:w15="http://schemas.microsoft.com/office/word/2012/wordml" xmlns:w16cei="http://schemas.microsoft.com/office/word/2026/wordml/cei" xmlns:w16cex="http://schemas.microsoft.com/office/word/2018/wordml/cex" xmlns:w16cid="http://schemas.microsoft.com/office/word/2016/wordml/cid" xmlns:w16="http://schemas.microsoft.com/office/word/2018/wordml" xmlns:w16du="http://schemas.microsoft.com/office/word/2023/wordml/word16du" xmlns:w16sdtdh="http://schemas.microsoft.com/office/word/2020/wordml/sdtdatahash" xmlns:w16sdtfl="http://schemas.microsoft.com/office/word/2024/wordml/sdtformatlock" xmlns:w16se="http://schemas.microsoft.com/office/word/2015/wordml/symex" xmlns:wpg="http://schemas.microsoft.com/office/word/2010/wordprocessingGroup" xmlns:wpi="http://schemas.microsoft.com/office/word/2010/wordprocessingInk" xmlns:wne="http://schemas.microsoft.com/office/word/2006/wordml" xmlns:wps="http://schemas.microsoft.com/office/word/2010/wordprocessingShape" mc:Ignorable="w14 w15 w16se w16cid w16 w16cex w16sdtdh w16sdtfl w16du wp14">
   <w:p>
     <w:pPr>
       <w:pStyle w:val="Header"/>
@@ -22064,7 +23244,7 @@
 </file>
 
 <file path=word/header2.xml><?xml version="1.0" encoding="utf-8"?>
-<w:hdr xmlns:wpc="http://schemas.microsoft.com/office/word/2010/wordprocessingCanvas" xmlns:cx="http://schemas.microsoft.com/office/drawing/2014/chartex" xmlns:cx1="http://schemas.microsoft.com/office/drawing/2015/9/8/chartex" xmlns:cx2="http://schemas.microsoft.com/office/drawing/2015/10/21/chartex" xmlns:cx3="http://schemas.microsoft.com/office/drawing/2016/5/9/chartex" xmlns:cx4="http://schemas.microsoft.com/office/drawing/2016/5/10/chartex" xmlns:cx5="http://schemas.microsoft.com/office/drawing/2016/5/11/chartex" xmlns:cx6="http://schemas.microsoft.com/office/drawing/2016/5/12/chartex" xmlns:cx7="http://schemas.microsoft.com/office/drawing/2016/5/13/chartex" xmlns:cx8="http://schemas.microsoft.com/office/drawing/2016/5/14/chartex" xmlns:mc="http://schemas.openxmlformats.org/markup-compatibility/2006" xmlns:aink="http://schemas.microsoft.com/office/drawing/2016/ink" xmlns:am3d="http://schemas.microsoft.com/office/drawing/2017/model3d" xmlns:o="urn:schemas-microsoft-com:office:office" xmlns:oel="http://schemas.microsoft.com/office/2019/extlst" xmlns:r="http://schemas.openxmlformats.org/officeDocument/2006/relationships" xmlns:m="http://schemas.openxmlformats.org/officeDocument/2006/math" xmlns:v="urn:schemas-microsoft-com:vml" xmlns:wp14="http://schemas.microsoft.com/office/word/2010/wordprocessingDrawing" xmlns:wp="http://schemas.openxmlformats.org/drawingml/2006/wordprocessingDrawing" xmlns:w10="urn:schemas-microsoft-com:office:word" xmlns:w="http://schemas.openxmlformats.org/wordprocessingml/2006/main" xmlns:w14="http://schemas.microsoft.com/office/word/2010/wordml" xmlns:w15="http://schemas.microsoft.com/office/word/2012/wordml" xmlns:w16cex="http://schemas.microsoft.com/office/word/2018/wordml/cex" xmlns:w16cid="http://schemas.microsoft.com/office/word/2016/wordml/cid" xmlns:w16="http://schemas.microsoft.com/office/word/2018/wordml" xmlns:w16du="http://schemas.microsoft.com/office/word/2023/wordml/word16du" xmlns:w16sdtdh="http://schemas.microsoft.com/office/word/2020/wordml/sdtdatahash" xmlns:w16sdtfl="http://schemas.microsoft.com/office/word/2024/wordml/sdtformatlock" xmlns:w16se="http://schemas.microsoft.com/office/word/2015/wordml/symex" xmlns:wpg="http://schemas.microsoft.com/office/word/2010/wordprocessingGroup" xmlns:wpi="http://schemas.microsoft.com/office/word/2010/wordprocessingInk" xmlns:wne="http://schemas.microsoft.com/office/word/2006/wordml" xmlns:wps="http://schemas.microsoft.com/office/word/2010/wordprocessingShape" mc:Ignorable="w14 w15 w16se w16cid w16 w16cex w16sdtdh w16sdtfl w16du wp14">
+<w:hdr xmlns:wpc="http://schemas.microsoft.com/office/word/2010/wordprocessingCanvas" xmlns:cx="http://schemas.microsoft.com/office/drawing/2014/chartex" xmlns:cx1="http://schemas.microsoft.com/office/drawing/2015/9/8/chartex" xmlns:cx2="http://schemas.microsoft.com/office/drawing/2015/10/21/chartex" xmlns:cx3="http://schemas.microsoft.com/office/drawing/2016/5/9/chartex" xmlns:cx4="http://schemas.microsoft.com/office/drawing/2016/5/10/chartex" xmlns:cx5="http://schemas.microsoft.com/office/drawing/2016/5/11/chartex" xmlns:cx6="http://schemas.microsoft.com/office/drawing/2016/5/12/chartex" xmlns:cx7="http://schemas.microsoft.com/office/drawing/2016/5/13/chartex" xmlns:cx8="http://schemas.microsoft.com/office/drawing/2016/5/14/chartex" xmlns:mc="http://schemas.openxmlformats.org/markup-compatibility/2006" xmlns:aink="http://schemas.microsoft.com/office/drawing/2016/ink" xmlns:am3d="http://schemas.microsoft.com/office/drawing/2017/model3d" xmlns:o="urn:schemas-microsoft-com:office:office" xmlns:oel="http://schemas.microsoft.com/office/2019/extlst" xmlns:r="http://schemas.openxmlformats.org/officeDocument/2006/relationships" xmlns:m="http://schemas.openxmlformats.org/officeDocument/2006/math" xmlns:v="urn:schemas-microsoft-com:vml" xmlns:wp14="http://schemas.microsoft.com/office/word/2010/wordprocessingDrawing" xmlns:wp="http://schemas.openxmlformats.org/drawingml/2006/wordprocessingDrawing" xmlns:w10="urn:schemas-microsoft-com:office:word" xmlns:w="http://schemas.openxmlformats.org/wordprocessingml/2006/main" xmlns:w14="http://schemas.microsoft.com/office/word/2010/wordml" xmlns:w15="http://schemas.microsoft.com/office/word/2012/wordml" xmlns:w16cei="http://schemas.microsoft.com/office/word/2026/wordml/cei" xmlns:w16cex="http://schemas.microsoft.com/office/word/2018/wordml/cex" xmlns:w16cid="http://schemas.microsoft.com/office/word/2016/wordml/cid" xmlns:w16="http://schemas.microsoft.com/office/word/2018/wordml" xmlns:w16du="http://schemas.microsoft.com/office/word/2023/wordml/word16du" xmlns:w16sdtdh="http://schemas.microsoft.com/office/word/2020/wordml/sdtdatahash" xmlns:w16sdtfl="http://schemas.microsoft.com/office/word/2024/wordml/sdtformatlock" xmlns:w16se="http://schemas.microsoft.com/office/word/2015/wordml/symex" xmlns:wpg="http://schemas.microsoft.com/office/word/2010/wordprocessingGroup" xmlns:wpi="http://schemas.microsoft.com/office/word/2010/wordprocessingInk" xmlns:wne="http://schemas.microsoft.com/office/word/2006/wordml" xmlns:wps="http://schemas.microsoft.com/office/word/2010/wordprocessingShape" mc:Ignorable="w14 w15 w16se w16cid w16 w16cex w16sdtdh w16sdtfl w16du wp14">
   <w:p>
     <w:pPr>
       <w:pStyle w:val="Header"/>
@@ -22077,7 +23257,7 @@
 </file>
 
 <file path=word/header3.xml><?xml version="1.0" encoding="utf-8"?>
-<w:hdr xmlns:wpc="http://schemas.microsoft.com/office/word/2010/wordprocessingCanvas" xmlns:cx="http://schemas.microsoft.com/office/drawing/2014/chartex" xmlns:cx1="http://schemas.microsoft.com/office/drawing/2015/9/8/chartex" xmlns:cx2="http://schemas.microsoft.com/office/drawing/2015/10/21/chartex" xmlns:cx3="http://schemas.microsoft.com/office/drawing/2016/5/9/chartex" xmlns:cx4="http://schemas.microsoft.com/office/drawing/2016/5/10/chartex" xmlns:cx5="http://schemas.microsoft.com/office/drawing/2016/5/11/chartex" xmlns:cx6="http://schemas.microsoft.com/office/drawing/2016/5/12/chartex" xmlns:cx7="http://schemas.microsoft.com/office/drawing/2016/5/13/chartex" xmlns:cx8="http://schemas.microsoft.com/office/drawing/2016/5/14/chartex" xmlns:mc="http://schemas.openxmlformats.org/markup-compatibility/2006" xmlns:aink="http://schemas.microsoft.com/office/drawing/2016/ink" xmlns:am3d="http://schemas.microsoft.com/office/drawing/2017/model3d" xmlns:o="urn:schemas-microsoft-com:office:office" xmlns:oel="http://schemas.microsoft.com/office/2019/extlst" xmlns:r="http://schemas.openxmlformats.org/officeDocument/2006/relationships" xmlns:m="http://schemas.openxmlformats.org/officeDocument/2006/math" xmlns:v="urn:schemas-microsoft-com:vml" xmlns:wp14="http://schemas.microsoft.com/office/word/2010/wordprocessingDrawing" xmlns:wp="http://schemas.openxmlformats.org/drawingml/2006/wordprocessingDrawing" xmlns:w10="urn:schemas-microsoft-com:office:word" xmlns:w="http://schemas.openxmlformats.org/wordprocessingml/2006/main" xmlns:w14="http://schemas.microsoft.com/office/word/2010/wordml" xmlns:w15="http://schemas.microsoft.com/office/word/2012/wordml" xmlns:w16cex="http://schemas.microsoft.com/office/word/2018/wordml/cex" xmlns:w16cid="http://schemas.microsoft.com/office/word/2016/wordml/cid" xmlns:w16="http://schemas.microsoft.com/office/word/2018/wordml" xmlns:w16du="http://schemas.microsoft.com/office/word/2023/wordml/word16du" xmlns:w16sdtdh="http://schemas.microsoft.com/office/word/2020/wordml/sdtdatahash" xmlns:w16sdtfl="http://schemas.microsoft.com/office/word/2024/wordml/sdtformatlock" xmlns:w16se="http://schemas.microsoft.com/office/word/2015/wordml/symex" xmlns:wpg="http://schemas.microsoft.com/office/word/2010/wordprocessingGroup" xmlns:wpi="http://schemas.microsoft.com/office/word/2010/wordprocessingInk" xmlns:wne="http://schemas.microsoft.com/office/word/2006/wordml" xmlns:wps="http://schemas.microsoft.com/office/word/2010/wordprocessingShape" mc:Ignorable="w14 w15 w16se w16cid w16 w16cex w16sdtdh w16sdtfl w16du wp14">
+<w:hdr xmlns:wpc="http://schemas.microsoft.com/office/word/2010/wordprocessingCanvas" xmlns:cx="http://schemas.microsoft.com/office/drawing/2014/chartex" xmlns:cx1="http://schemas.microsoft.com/office/drawing/2015/9/8/chartex" xmlns:cx2="http://schemas.microsoft.com/office/drawing/2015/10/21/chartex" xmlns:cx3="http://schemas.microsoft.com/office/drawing/2016/5/9/chartex" xmlns:cx4="http://schemas.microsoft.com/office/drawing/2016/5/10/chartex" xmlns:cx5="http://schemas.microsoft.com/office/drawing/2016/5/11/chartex" xmlns:cx6="http://schemas.microsoft.com/office/drawing/2016/5/12/chartex" xmlns:cx7="http://schemas.microsoft.com/office/drawing/2016/5/13/chartex" xmlns:cx8="http://schemas.microsoft.com/office/drawing/2016/5/14/chartex" xmlns:mc="http://schemas.openxmlformats.org/markup-compatibility/2006" xmlns:aink="http://schemas.microsoft.com/office/drawing/2016/ink" xmlns:am3d="http://schemas.microsoft.com/office/drawing/2017/model3d" xmlns:o="urn:schemas-microsoft-com:office:office" xmlns:oel="http://schemas.microsoft.com/office/2019/extlst" xmlns:r="http://schemas.openxmlformats.org/officeDocument/2006/relationships" xmlns:m="http://schemas.openxmlformats.org/officeDocument/2006/math" xmlns:v="urn:schemas-microsoft-com:vml" xmlns:wp14="http://schemas.microsoft.com/office/word/2010/wordprocessingDrawing" xmlns:wp="http://schemas.openxmlformats.org/drawingml/2006/wordprocessingDrawing" xmlns:w10="urn:schemas-microsoft-com:office:word" xmlns:w="http://schemas.openxmlformats.org/wordprocessingml/2006/main" xmlns:w14="http://schemas.microsoft.com/office/word/2010/wordml" xmlns:w15="http://schemas.microsoft.com/office/word/2012/wordml" xmlns:w16cei="http://schemas.microsoft.com/office/word/2026/wordml/cei" xmlns:w16cex="http://schemas.microsoft.com/office/word/2018/wordml/cex" xmlns:w16cid="http://schemas.microsoft.com/office/word/2016/wordml/cid" xmlns:w16="http://schemas.microsoft.com/office/word/2018/wordml" xmlns:w16du="http://schemas.microsoft.com/office/word/2023/wordml/word16du" xmlns:w16sdtdh="http://schemas.microsoft.com/office/word/2020/wordml/sdtdatahash" xmlns:w16sdtfl="http://schemas.microsoft.com/office/word/2024/wordml/sdtformatlock" xmlns:w16se="http://schemas.microsoft.com/office/word/2015/wordml/symex" xmlns:wpg="http://schemas.microsoft.com/office/word/2010/wordprocessingGroup" xmlns:wpi="http://schemas.microsoft.com/office/word/2010/wordprocessingInk" xmlns:wne="http://schemas.microsoft.com/office/word/2006/wordml" xmlns:wps="http://schemas.microsoft.com/office/word/2010/wordprocessingShape" mc:Ignorable="w14 w15 w16se w16cid w16 w16cex w16sdtdh w16sdtfl w16du wp14">
   <w:p>
     <w:pPr>
       <w:pStyle w:val="Header"/>

</xml_diff>

<commit_message>
nmv 01 08 2026
</commit_message>
<xml_diff>
--- a/TS Jatai Ghanam Project/TS 2.3/TS 2.3 Ghanam Malayalam Corrections.docx
+++ b/TS Jatai Ghanam Project/TS 2.3/TS 2.3 Ghanam Malayalam Corrections.docx
@@ -42,9 +42,8 @@
           <w:szCs w:val="32"/>
           <w:u w:val="single"/>
         </w:rPr>
-        <w:t xml:space="preserve"> – TS 2.3 Malayalam Corrections – Observed </w:t>
+        <w:t xml:space="preserve"> – TS 2.3 Malayalam Corrections – Observed till </w:t>
       </w:r>
-      <w:proofErr w:type="gramStart"/>
       <w:r>
         <w:rPr>
           <w:b/>
@@ -53,20 +52,8 @@
           <w:szCs w:val="32"/>
           <w:u w:val="single"/>
         </w:rPr>
-        <w:t xml:space="preserve">till </w:t>
+        <w:t>31st July 2026</w:t>
       </w:r>
-      <w:r>
-        <w:rPr>
-          <w:b/>
-          <w:bCs/>
-          <w:sz w:val="32"/>
-          <w:szCs w:val="32"/>
-          <w:highlight w:val="red"/>
-          <w:u w:val="single"/>
-        </w:rPr>
-        <w:t>?????</w:t>
-      </w:r>
-      <w:proofErr w:type="gramEnd"/>
     </w:p>
     <w:p>
       <w:pPr>
@@ -297,19 +284,8 @@
                 <w:sz w:val="32"/>
                 <w:szCs w:val="40"/>
               </w:rPr>
-              <w:t>)</w:t>
-            </w:r>
-            <w:proofErr w:type="gramStart"/>
-            <w:r>
-              <w:rPr>
-                <w:rFonts w:ascii="BRH Malayalam Extra" w:hAnsi="BRH Malayalam Extra" w:cs="BRH Malayalam Extra"/>
-                <w:color w:val="000000"/>
-                <w:sz w:val="32"/>
-                <w:szCs w:val="40"/>
-              </w:rPr>
-              <w:t>-  P</w:t>
-            </w:r>
-            <w:proofErr w:type="gramEnd"/>
+              <w:t>)-  P</w:t>
+            </w:r>
             <w:r>
               <w:rPr>
                 <w:rFonts w:ascii="BRH Malayalam Extra" w:hAnsi="BRH Malayalam Extra" w:cs="BRH Malayalam Extra"/>
@@ -695,27 +671,7 @@
                 <w:sz w:val="32"/>
                 <w:szCs w:val="40"/>
               </w:rPr>
-              <w:t>)</w:t>
-            </w:r>
-            <w:proofErr w:type="gramStart"/>
-            <w:r>
-              <w:rPr>
-                <w:rFonts w:ascii="BRH Malayalam Extra" w:hAnsi="BRH Malayalam Extra" w:cs="BRH Malayalam Extra"/>
-                <w:color w:val="000000"/>
-                <w:sz w:val="32"/>
-                <w:szCs w:val="40"/>
-              </w:rPr>
-              <w:t>-  e</w:t>
-            </w:r>
-            <w:proofErr w:type="gramEnd"/>
-            <w:r>
-              <w:rPr>
-                <w:rFonts w:ascii="BRH Malayalam Extra" w:hAnsi="BRH Malayalam Extra" w:cs="BRH Malayalam Extra"/>
-                <w:color w:val="000000"/>
-                <w:sz w:val="32"/>
-                <w:szCs w:val="40"/>
-              </w:rPr>
-              <w:t>¡d—J | G</w:t>
+              <w:t>)-  e¡d—J | G</w:t>
             </w:r>
             <w:r>
               <w:rPr>
@@ -1122,19 +1078,8 @@
                 <w:sz w:val="32"/>
                 <w:szCs w:val="40"/>
               </w:rPr>
-              <w:t>)</w:t>
-            </w:r>
-            <w:proofErr w:type="gramStart"/>
-            <w:r>
-              <w:rPr>
-                <w:rFonts w:ascii="BRH Malayalam Extra" w:hAnsi="BRH Malayalam Extra" w:cs="BRH Malayalam Extra"/>
-                <w:color w:val="000000"/>
-                <w:sz w:val="32"/>
-                <w:szCs w:val="40"/>
-              </w:rPr>
-              <w:t>-  G</w:t>
-            </w:r>
-            <w:proofErr w:type="gramEnd"/>
+              <w:t>)-  G</w:t>
+            </w:r>
             <w:r>
               <w:rPr>
                 <w:rFonts w:ascii="BRH Malayalam Extra" w:hAnsi="BRH Malayalam Extra" w:cs="BRH Malayalam Extra"/>
@@ -1448,19 +1393,8 @@
                 <w:sz w:val="32"/>
                 <w:szCs w:val="40"/>
               </w:rPr>
-              <w:t>)</w:t>
-            </w:r>
-            <w:proofErr w:type="gramStart"/>
-            <w:r>
-              <w:rPr>
-                <w:rFonts w:ascii="BRH Malayalam Extra" w:hAnsi="BRH Malayalam Extra" w:cs="BRH Malayalam Extra"/>
-                <w:color w:val="000000"/>
-                <w:sz w:val="32"/>
-                <w:szCs w:val="40"/>
-              </w:rPr>
-              <w:t>-  G</w:t>
-            </w:r>
-            <w:proofErr w:type="gramEnd"/>
+              <w:t>)-  G</w:t>
+            </w:r>
             <w:r>
               <w:rPr>
                 <w:rFonts w:ascii="BRH Malayalam Extra" w:hAnsi="BRH Malayalam Extra" w:cs="BRH Malayalam Extra"/>
@@ -2752,27 +2686,7 @@
                 <w:sz w:val="32"/>
                 <w:szCs w:val="40"/>
               </w:rPr>
-              <w:t>)</w:t>
-            </w:r>
-            <w:proofErr w:type="gramStart"/>
-            <w:r>
-              <w:rPr>
-                <w:rFonts w:ascii="BRH Malayalam Extra" w:hAnsi="BRH Malayalam Extra" w:cs="BRH Malayalam Extra"/>
-                <w:color w:val="000000"/>
-                <w:sz w:val="32"/>
-                <w:szCs w:val="40"/>
-              </w:rPr>
-              <w:t>-  CZy</w:t>
-            </w:r>
-            <w:proofErr w:type="gramEnd"/>
-            <w:r>
-              <w:rPr>
-                <w:rFonts w:ascii="BRH Malayalam Extra" w:hAnsi="BRH Malayalam Extra" w:cs="BRH Malayalam Extra"/>
-                <w:color w:val="000000"/>
-                <w:sz w:val="32"/>
-                <w:szCs w:val="40"/>
-              </w:rPr>
-              <w:t>— | jx</w:t>
+              <w:t>)-  CZy— | jx</w:t>
             </w:r>
             <w:r>
               <w:rPr>
@@ -2941,164 +2855,6 @@
                 <w:szCs w:val="40"/>
               </w:rPr>
             </w:pPr>
-            <w:r>
-              <w:rPr>
-                <w:rFonts w:cs="BRH Malayalam Extra"/>
-                <w:color w:val="000000"/>
-                <w:szCs w:val="40"/>
-              </w:rPr>
-              <w:t>65</w:t>
-            </w:r>
-            <w:r>
-              <w:rPr>
-                <w:rFonts w:ascii="BRH Malayalam Extra" w:hAnsi="BRH Malayalam Extra" w:cs="BRH Malayalam Extra"/>
-                <w:color w:val="000000"/>
-                <w:sz w:val="32"/>
-                <w:szCs w:val="40"/>
-              </w:rPr>
-              <w:t>)</w:t>
-            </w:r>
-            <w:r>
-              <w:rPr>
-                <w:rFonts w:ascii="BRH Malayalam Extra" w:hAnsi="BRH Malayalam Extra" w:cs="BRH Malayalam Extra"/>
-                <w:color w:val="000000"/>
-                <w:sz w:val="32"/>
-                <w:szCs w:val="40"/>
-              </w:rPr>
-              <w:tab/>
-            </w:r>
-            <w:r>
-              <w:rPr>
-                <w:rFonts w:cs="BRH Malayalam Extra"/>
-                <w:color w:val="000000"/>
-                <w:szCs w:val="40"/>
-              </w:rPr>
-              <w:t>2</w:t>
-            </w:r>
-            <w:r>
-              <w:rPr>
-                <w:rFonts w:ascii="BRH Malayalam Extra" w:hAnsi="BRH Malayalam Extra" w:cs="BRH Malayalam Extra"/>
-                <w:color w:val="000000"/>
-                <w:sz w:val="32"/>
-                <w:szCs w:val="40"/>
-              </w:rPr>
-              <w:t>.</w:t>
-            </w:r>
-            <w:r>
-              <w:rPr>
-                <w:rFonts w:cs="BRH Malayalam Extra"/>
-                <w:color w:val="000000"/>
-                <w:szCs w:val="40"/>
-              </w:rPr>
-              <w:t>3</w:t>
-            </w:r>
-            <w:r>
-              <w:rPr>
-                <w:rFonts w:ascii="BRH Malayalam Extra" w:hAnsi="BRH Malayalam Extra" w:cs="BRH Malayalam Extra"/>
-                <w:color w:val="000000"/>
-                <w:sz w:val="32"/>
-                <w:szCs w:val="40"/>
-              </w:rPr>
-              <w:t>.</w:t>
-            </w:r>
-            <w:r>
-              <w:rPr>
-                <w:rFonts w:cs="BRH Malayalam Extra"/>
-                <w:color w:val="000000"/>
-                <w:szCs w:val="40"/>
-              </w:rPr>
-              <w:t>5</w:t>
-            </w:r>
-            <w:r>
-              <w:rPr>
-                <w:rFonts w:ascii="BRH Malayalam Extra" w:hAnsi="BRH Malayalam Extra" w:cs="BRH Malayalam Extra"/>
-                <w:color w:val="000000"/>
-                <w:sz w:val="32"/>
-                <w:szCs w:val="40"/>
-              </w:rPr>
-              <w:t>.</w:t>
-            </w:r>
-            <w:r>
-              <w:rPr>
-                <w:rFonts w:cs="BRH Malayalam Extra"/>
-                <w:color w:val="000000"/>
-                <w:szCs w:val="40"/>
-              </w:rPr>
-              <w:t>3</w:t>
-            </w:r>
-            <w:r>
-              <w:rPr>
-                <w:rFonts w:ascii="BRH Malayalam Extra" w:hAnsi="BRH Malayalam Extra" w:cs="BRH Malayalam Extra"/>
-                <w:color w:val="000000"/>
-                <w:sz w:val="32"/>
-                <w:szCs w:val="40"/>
-              </w:rPr>
-              <w:t>(</w:t>
-            </w:r>
-            <w:r>
-              <w:rPr>
-                <w:rFonts w:cs="BRH Malayalam Extra"/>
-                <w:color w:val="000000"/>
-                <w:szCs w:val="40"/>
-              </w:rPr>
-              <w:t>58</w:t>
-            </w:r>
-            <w:r>
-              <w:rPr>
-                <w:rFonts w:ascii="BRH Malayalam Extra" w:hAnsi="BRH Malayalam Extra" w:cs="BRH Malayalam Extra"/>
-                <w:color w:val="000000"/>
-                <w:sz w:val="32"/>
-                <w:szCs w:val="40"/>
-              </w:rPr>
-              <w:t>)</w:t>
-            </w:r>
-            <w:proofErr w:type="gramStart"/>
-            <w:r>
-              <w:rPr>
-                <w:rFonts w:ascii="BRH Malayalam Extra" w:hAnsi="BRH Malayalam Extra" w:cs="BRH Malayalam Extra"/>
-                <w:color w:val="000000"/>
-                <w:sz w:val="32"/>
-                <w:szCs w:val="40"/>
-              </w:rPr>
-              <w:t>-  jx</w:t>
-            </w:r>
-            <w:proofErr w:type="gramEnd"/>
-            <w:r>
-              <w:rPr>
-                <w:rFonts w:ascii="BRH Malayalam Extra" w:hAnsi="BRH Malayalam Extra" w:cs="BRH Malayalam Extra"/>
-                <w:color w:val="000000"/>
-                <w:sz w:val="26"/>
-                <w:szCs w:val="40"/>
-              </w:rPr>
-              <w:t>–</w:t>
-            </w:r>
-            <w:r>
-              <w:rPr>
-                <w:rFonts w:ascii="BRH Malayalam Extra" w:hAnsi="BRH Malayalam Extra" w:cs="BRH Malayalam Extra"/>
-                <w:color w:val="000000"/>
-                <w:sz w:val="32"/>
-                <w:szCs w:val="40"/>
-              </w:rPr>
-              <w:t>Rõx˜ | B | G</w:t>
-            </w:r>
-            <w:r>
-              <w:rPr>
-                <w:rFonts w:ascii="BRH Malayalam Extra" w:hAnsi="BRH Malayalam Extra" w:cs="BRH Malayalam Extra"/>
-                <w:color w:val="000000"/>
-                <w:sz w:val="26"/>
-                <w:szCs w:val="40"/>
-              </w:rPr>
-              <w:t>–</w:t>
-            </w:r>
-            <w:r>
-              <w:rPr>
-                <w:rFonts w:ascii="BRH Malayalam Extra" w:hAnsi="BRH Malayalam Extra" w:cs="BRH Malayalam Extra"/>
-                <w:color w:val="000000"/>
-                <w:sz w:val="32"/>
-                <w:szCs w:val="40"/>
-              </w:rPr>
-              <w:t xml:space="preserve">p | </w:t>
-            </w:r>
           </w:p>
           <w:p>
             <w:pPr>
@@ -3116,12 +2872,174 @@
             </w:pPr>
             <w:r>
               <w:rPr>
-                <w:rFonts w:ascii="BRH Malayalam Extra" w:hAnsi="BRH Malayalam Extra" w:cs="BRH Malayalam Extra"/>
-                <w:color w:val="000000"/>
-                <w:sz w:val="32"/>
+                <w:rFonts w:cs="BRH Malayalam Extra"/>
+                <w:color w:val="000000"/>
                 <w:szCs w:val="40"/>
               </w:rPr>
               <w:lastRenderedPageBreak/>
+              <w:t>65</w:t>
+            </w:r>
+            <w:r>
+              <w:rPr>
+                <w:rFonts w:ascii="BRH Malayalam Extra" w:hAnsi="BRH Malayalam Extra" w:cs="BRH Malayalam Extra"/>
+                <w:color w:val="000000"/>
+                <w:sz w:val="32"/>
+                <w:szCs w:val="40"/>
+              </w:rPr>
+              <w:t>)</w:t>
+            </w:r>
+            <w:r>
+              <w:rPr>
+                <w:rFonts w:ascii="BRH Malayalam Extra" w:hAnsi="BRH Malayalam Extra" w:cs="BRH Malayalam Extra"/>
+                <w:color w:val="000000"/>
+                <w:sz w:val="32"/>
+                <w:szCs w:val="40"/>
+              </w:rPr>
+              <w:tab/>
+            </w:r>
+            <w:r>
+              <w:rPr>
+                <w:rFonts w:cs="BRH Malayalam Extra"/>
+                <w:color w:val="000000"/>
+                <w:szCs w:val="40"/>
+              </w:rPr>
+              <w:t>2</w:t>
+            </w:r>
+            <w:r>
+              <w:rPr>
+                <w:rFonts w:ascii="BRH Malayalam Extra" w:hAnsi="BRH Malayalam Extra" w:cs="BRH Malayalam Extra"/>
+                <w:color w:val="000000"/>
+                <w:sz w:val="32"/>
+                <w:szCs w:val="40"/>
+              </w:rPr>
+              <w:t>.</w:t>
+            </w:r>
+            <w:r>
+              <w:rPr>
+                <w:rFonts w:cs="BRH Malayalam Extra"/>
+                <w:color w:val="000000"/>
+                <w:szCs w:val="40"/>
+              </w:rPr>
+              <w:t>3</w:t>
+            </w:r>
+            <w:r>
+              <w:rPr>
+                <w:rFonts w:ascii="BRH Malayalam Extra" w:hAnsi="BRH Malayalam Extra" w:cs="BRH Malayalam Extra"/>
+                <w:color w:val="000000"/>
+                <w:sz w:val="32"/>
+                <w:szCs w:val="40"/>
+              </w:rPr>
+              <w:t>.</w:t>
+            </w:r>
+            <w:r>
+              <w:rPr>
+                <w:rFonts w:cs="BRH Malayalam Extra"/>
+                <w:color w:val="000000"/>
+                <w:szCs w:val="40"/>
+              </w:rPr>
+              <w:t>5</w:t>
+            </w:r>
+            <w:r>
+              <w:rPr>
+                <w:rFonts w:ascii="BRH Malayalam Extra" w:hAnsi="BRH Malayalam Extra" w:cs="BRH Malayalam Extra"/>
+                <w:color w:val="000000"/>
+                <w:sz w:val="32"/>
+                <w:szCs w:val="40"/>
+              </w:rPr>
+              <w:t>.</w:t>
+            </w:r>
+            <w:r>
+              <w:rPr>
+                <w:rFonts w:cs="BRH Malayalam Extra"/>
+                <w:color w:val="000000"/>
+                <w:szCs w:val="40"/>
+              </w:rPr>
+              <w:t>3</w:t>
+            </w:r>
+            <w:r>
+              <w:rPr>
+                <w:rFonts w:ascii="BRH Malayalam Extra" w:hAnsi="BRH Malayalam Extra" w:cs="BRH Malayalam Extra"/>
+                <w:color w:val="000000"/>
+                <w:sz w:val="32"/>
+                <w:szCs w:val="40"/>
+              </w:rPr>
+              <w:t>(</w:t>
+            </w:r>
+            <w:r>
+              <w:rPr>
+                <w:rFonts w:cs="BRH Malayalam Extra"/>
+                <w:color w:val="000000"/>
+                <w:szCs w:val="40"/>
+              </w:rPr>
+              <w:t>58</w:t>
+            </w:r>
+            <w:r>
+              <w:rPr>
+                <w:rFonts w:ascii="BRH Malayalam Extra" w:hAnsi="BRH Malayalam Extra" w:cs="BRH Malayalam Extra"/>
+                <w:color w:val="000000"/>
+                <w:sz w:val="32"/>
+                <w:szCs w:val="40"/>
+              </w:rPr>
+              <w:t>)-  jx</w:t>
+            </w:r>
+            <w:r>
+              <w:rPr>
+                <w:rFonts w:ascii="BRH Malayalam Extra" w:hAnsi="BRH Malayalam Extra" w:cs="BRH Malayalam Extra"/>
+                <w:color w:val="000000"/>
+                <w:sz w:val="26"/>
+                <w:szCs w:val="40"/>
+              </w:rPr>
+              <w:t>–</w:t>
+            </w:r>
+            <w:r>
+              <w:rPr>
+                <w:rFonts w:ascii="BRH Malayalam Extra" w:hAnsi="BRH Malayalam Extra" w:cs="BRH Malayalam Extra"/>
+                <w:color w:val="000000"/>
+                <w:sz w:val="32"/>
+                <w:szCs w:val="40"/>
+              </w:rPr>
+              <w:t>Rõx˜ | B | G</w:t>
+            </w:r>
+            <w:r>
+              <w:rPr>
+                <w:rFonts w:ascii="BRH Malayalam Extra" w:hAnsi="BRH Malayalam Extra" w:cs="BRH Malayalam Extra"/>
+                <w:color w:val="000000"/>
+                <w:sz w:val="26"/>
+                <w:szCs w:val="40"/>
+              </w:rPr>
+              <w:t>–</w:t>
+            </w:r>
+            <w:r>
+              <w:rPr>
+                <w:rFonts w:ascii="BRH Malayalam Extra" w:hAnsi="BRH Malayalam Extra" w:cs="BRH Malayalam Extra"/>
+                <w:color w:val="000000"/>
+                <w:sz w:val="32"/>
+                <w:szCs w:val="40"/>
+              </w:rPr>
+              <w:t xml:space="preserve">p | </w:t>
+            </w:r>
+          </w:p>
+          <w:p>
+            <w:pPr>
+              <w:widowControl w:val="0"/>
+              <w:autoSpaceDE w:val="0"/>
+              <w:autoSpaceDN w:val="0"/>
+              <w:adjustRightInd w:val="0"/>
+              <w:spacing w:before="0" w:line="240" w:lineRule="auto"/>
+              <w:rPr>
+                <w:rFonts w:ascii="BRH Malayalam Extra" w:hAnsi="BRH Malayalam Extra" w:cs="BRH Malayalam Extra"/>
+                <w:color w:val="000000"/>
+                <w:sz w:val="32"/>
+                <w:szCs w:val="40"/>
+              </w:rPr>
+            </w:pPr>
+            <w:r>
+              <w:rPr>
+                <w:rFonts w:ascii="BRH Malayalam Extra" w:hAnsi="BRH Malayalam Extra" w:cs="BRH Malayalam Extra"/>
+                <w:color w:val="000000"/>
+                <w:sz w:val="32"/>
+                <w:szCs w:val="40"/>
+              </w:rPr>
               <w:t>jx</w:t>
             </w:r>
             <w:r>
@@ -3407,27 +3325,7 @@
                 <w:sz w:val="32"/>
                 <w:szCs w:val="40"/>
               </w:rPr>
-              <w:t>)</w:t>
-            </w:r>
-            <w:proofErr w:type="gramStart"/>
-            <w:r>
-              <w:rPr>
-                <w:rFonts w:ascii="BRH Malayalam Extra" w:hAnsi="BRH Malayalam Extra" w:cs="BRH Malayalam Extra"/>
-                <w:color w:val="000000"/>
-                <w:sz w:val="32"/>
-                <w:szCs w:val="40"/>
-              </w:rPr>
-              <w:t>-  CZy</w:t>
-            </w:r>
-            <w:proofErr w:type="gramEnd"/>
-            <w:r>
-              <w:rPr>
-                <w:rFonts w:ascii="BRH Malayalam Extra" w:hAnsi="BRH Malayalam Extra" w:cs="BRH Malayalam Extra"/>
-                <w:color w:val="000000"/>
-                <w:sz w:val="32"/>
-                <w:szCs w:val="40"/>
-              </w:rPr>
-              <w:t>— | jx</w:t>
+              <w:t>)-  CZy— | jx</w:t>
             </w:r>
             <w:r>
               <w:rPr>
@@ -3620,164 +3518,6 @@
                 <w:szCs w:val="40"/>
               </w:rPr>
             </w:pPr>
-            <w:r>
-              <w:rPr>
-                <w:rFonts w:cs="BRH Malayalam Extra"/>
-                <w:color w:val="000000"/>
-                <w:szCs w:val="40"/>
-              </w:rPr>
-              <w:t>65</w:t>
-            </w:r>
-            <w:r>
-              <w:rPr>
-                <w:rFonts w:ascii="BRH Malayalam Extra" w:hAnsi="BRH Malayalam Extra" w:cs="BRH Malayalam Extra"/>
-                <w:color w:val="000000"/>
-                <w:sz w:val="32"/>
-                <w:szCs w:val="40"/>
-              </w:rPr>
-              <w:t>)</w:t>
-            </w:r>
-            <w:r>
-              <w:rPr>
-                <w:rFonts w:ascii="BRH Malayalam Extra" w:hAnsi="BRH Malayalam Extra" w:cs="BRH Malayalam Extra"/>
-                <w:color w:val="000000"/>
-                <w:sz w:val="32"/>
-                <w:szCs w:val="40"/>
-              </w:rPr>
-              <w:tab/>
-            </w:r>
-            <w:r>
-              <w:rPr>
-                <w:rFonts w:cs="BRH Malayalam Extra"/>
-                <w:color w:val="000000"/>
-                <w:szCs w:val="40"/>
-              </w:rPr>
-              <w:t>2</w:t>
-            </w:r>
-            <w:r>
-              <w:rPr>
-                <w:rFonts w:ascii="BRH Malayalam Extra" w:hAnsi="BRH Malayalam Extra" w:cs="BRH Malayalam Extra"/>
-                <w:color w:val="000000"/>
-                <w:sz w:val="32"/>
-                <w:szCs w:val="40"/>
-              </w:rPr>
-              <w:t>.</w:t>
-            </w:r>
-            <w:r>
-              <w:rPr>
-                <w:rFonts w:cs="BRH Malayalam Extra"/>
-                <w:color w:val="000000"/>
-                <w:szCs w:val="40"/>
-              </w:rPr>
-              <w:t>3</w:t>
-            </w:r>
-            <w:r>
-              <w:rPr>
-                <w:rFonts w:ascii="BRH Malayalam Extra" w:hAnsi="BRH Malayalam Extra" w:cs="BRH Malayalam Extra"/>
-                <w:color w:val="000000"/>
-                <w:sz w:val="32"/>
-                <w:szCs w:val="40"/>
-              </w:rPr>
-              <w:t>.</w:t>
-            </w:r>
-            <w:r>
-              <w:rPr>
-                <w:rFonts w:cs="BRH Malayalam Extra"/>
-                <w:color w:val="000000"/>
-                <w:szCs w:val="40"/>
-              </w:rPr>
-              <w:t>5</w:t>
-            </w:r>
-            <w:r>
-              <w:rPr>
-                <w:rFonts w:ascii="BRH Malayalam Extra" w:hAnsi="BRH Malayalam Extra" w:cs="BRH Malayalam Extra"/>
-                <w:color w:val="000000"/>
-                <w:sz w:val="32"/>
-                <w:szCs w:val="40"/>
-              </w:rPr>
-              <w:t>.</w:t>
-            </w:r>
-            <w:r>
-              <w:rPr>
-                <w:rFonts w:cs="BRH Malayalam Extra"/>
-                <w:color w:val="000000"/>
-                <w:szCs w:val="40"/>
-              </w:rPr>
-              <w:t>3</w:t>
-            </w:r>
-            <w:r>
-              <w:rPr>
-                <w:rFonts w:ascii="BRH Malayalam Extra" w:hAnsi="BRH Malayalam Extra" w:cs="BRH Malayalam Extra"/>
-                <w:color w:val="000000"/>
-                <w:sz w:val="32"/>
-                <w:szCs w:val="40"/>
-              </w:rPr>
-              <w:t>(</w:t>
-            </w:r>
-            <w:r>
-              <w:rPr>
-                <w:rFonts w:cs="BRH Malayalam Extra"/>
-                <w:color w:val="000000"/>
-                <w:szCs w:val="40"/>
-              </w:rPr>
-              <w:t>58</w:t>
-            </w:r>
-            <w:r>
-              <w:rPr>
-                <w:rFonts w:ascii="BRH Malayalam Extra" w:hAnsi="BRH Malayalam Extra" w:cs="BRH Malayalam Extra"/>
-                <w:color w:val="000000"/>
-                <w:sz w:val="32"/>
-                <w:szCs w:val="40"/>
-              </w:rPr>
-              <w:t>)</w:t>
-            </w:r>
-            <w:proofErr w:type="gramStart"/>
-            <w:r>
-              <w:rPr>
-                <w:rFonts w:ascii="BRH Malayalam Extra" w:hAnsi="BRH Malayalam Extra" w:cs="BRH Malayalam Extra"/>
-                <w:color w:val="000000"/>
-                <w:sz w:val="32"/>
-                <w:szCs w:val="40"/>
-              </w:rPr>
-              <w:t>-  jx</w:t>
-            </w:r>
-            <w:proofErr w:type="gramEnd"/>
-            <w:r>
-              <w:rPr>
-                <w:rFonts w:ascii="BRH Malayalam Extra" w:hAnsi="BRH Malayalam Extra" w:cs="BRH Malayalam Extra"/>
-                <w:color w:val="000000"/>
-                <w:sz w:val="26"/>
-                <w:szCs w:val="40"/>
-              </w:rPr>
-              <w:t>–</w:t>
-            </w:r>
-            <w:r>
-              <w:rPr>
-                <w:rFonts w:ascii="BRH Malayalam Extra" w:hAnsi="BRH Malayalam Extra" w:cs="BRH Malayalam Extra"/>
-                <w:color w:val="000000"/>
-                <w:sz w:val="32"/>
-                <w:szCs w:val="40"/>
-              </w:rPr>
-              <w:t>Rõx˜ | B | G</w:t>
-            </w:r>
-            <w:r>
-              <w:rPr>
-                <w:rFonts w:ascii="BRH Malayalam Extra" w:hAnsi="BRH Malayalam Extra" w:cs="BRH Malayalam Extra"/>
-                <w:color w:val="000000"/>
-                <w:sz w:val="26"/>
-                <w:szCs w:val="40"/>
-              </w:rPr>
-              <w:t>–</w:t>
-            </w:r>
-            <w:r>
-              <w:rPr>
-                <w:rFonts w:ascii="BRH Malayalam Extra" w:hAnsi="BRH Malayalam Extra" w:cs="BRH Malayalam Extra"/>
-                <w:color w:val="000000"/>
-                <w:sz w:val="32"/>
-                <w:szCs w:val="40"/>
-              </w:rPr>
-              <w:t xml:space="preserve">p | </w:t>
-            </w:r>
           </w:p>
           <w:p>
             <w:pPr>
@@ -3795,12 +3535,174 @@
             </w:pPr>
             <w:r>
               <w:rPr>
-                <w:rFonts w:ascii="BRH Malayalam Extra" w:hAnsi="BRH Malayalam Extra" w:cs="BRH Malayalam Extra"/>
-                <w:color w:val="000000"/>
-                <w:sz w:val="32"/>
+                <w:rFonts w:cs="BRH Malayalam Extra"/>
+                <w:color w:val="000000"/>
                 <w:szCs w:val="40"/>
               </w:rPr>
               <w:lastRenderedPageBreak/>
+              <w:t>65</w:t>
+            </w:r>
+            <w:r>
+              <w:rPr>
+                <w:rFonts w:ascii="BRH Malayalam Extra" w:hAnsi="BRH Malayalam Extra" w:cs="BRH Malayalam Extra"/>
+                <w:color w:val="000000"/>
+                <w:sz w:val="32"/>
+                <w:szCs w:val="40"/>
+              </w:rPr>
+              <w:t>)</w:t>
+            </w:r>
+            <w:r>
+              <w:rPr>
+                <w:rFonts w:ascii="BRH Malayalam Extra" w:hAnsi="BRH Malayalam Extra" w:cs="BRH Malayalam Extra"/>
+                <w:color w:val="000000"/>
+                <w:sz w:val="32"/>
+                <w:szCs w:val="40"/>
+              </w:rPr>
+              <w:tab/>
+            </w:r>
+            <w:r>
+              <w:rPr>
+                <w:rFonts w:cs="BRH Malayalam Extra"/>
+                <w:color w:val="000000"/>
+                <w:szCs w:val="40"/>
+              </w:rPr>
+              <w:t>2</w:t>
+            </w:r>
+            <w:r>
+              <w:rPr>
+                <w:rFonts w:ascii="BRH Malayalam Extra" w:hAnsi="BRH Malayalam Extra" w:cs="BRH Malayalam Extra"/>
+                <w:color w:val="000000"/>
+                <w:sz w:val="32"/>
+                <w:szCs w:val="40"/>
+              </w:rPr>
+              <w:t>.</w:t>
+            </w:r>
+            <w:r>
+              <w:rPr>
+                <w:rFonts w:cs="BRH Malayalam Extra"/>
+                <w:color w:val="000000"/>
+                <w:szCs w:val="40"/>
+              </w:rPr>
+              <w:t>3</w:t>
+            </w:r>
+            <w:r>
+              <w:rPr>
+                <w:rFonts w:ascii="BRH Malayalam Extra" w:hAnsi="BRH Malayalam Extra" w:cs="BRH Malayalam Extra"/>
+                <w:color w:val="000000"/>
+                <w:sz w:val="32"/>
+                <w:szCs w:val="40"/>
+              </w:rPr>
+              <w:t>.</w:t>
+            </w:r>
+            <w:r>
+              <w:rPr>
+                <w:rFonts w:cs="BRH Malayalam Extra"/>
+                <w:color w:val="000000"/>
+                <w:szCs w:val="40"/>
+              </w:rPr>
+              <w:t>5</w:t>
+            </w:r>
+            <w:r>
+              <w:rPr>
+                <w:rFonts w:ascii="BRH Malayalam Extra" w:hAnsi="BRH Malayalam Extra" w:cs="BRH Malayalam Extra"/>
+                <w:color w:val="000000"/>
+                <w:sz w:val="32"/>
+                <w:szCs w:val="40"/>
+              </w:rPr>
+              <w:t>.</w:t>
+            </w:r>
+            <w:r>
+              <w:rPr>
+                <w:rFonts w:cs="BRH Malayalam Extra"/>
+                <w:color w:val="000000"/>
+                <w:szCs w:val="40"/>
+              </w:rPr>
+              <w:t>3</w:t>
+            </w:r>
+            <w:r>
+              <w:rPr>
+                <w:rFonts w:ascii="BRH Malayalam Extra" w:hAnsi="BRH Malayalam Extra" w:cs="BRH Malayalam Extra"/>
+                <w:color w:val="000000"/>
+                <w:sz w:val="32"/>
+                <w:szCs w:val="40"/>
+              </w:rPr>
+              <w:t>(</w:t>
+            </w:r>
+            <w:r>
+              <w:rPr>
+                <w:rFonts w:cs="BRH Malayalam Extra"/>
+                <w:color w:val="000000"/>
+                <w:szCs w:val="40"/>
+              </w:rPr>
+              <w:t>58</w:t>
+            </w:r>
+            <w:r>
+              <w:rPr>
+                <w:rFonts w:ascii="BRH Malayalam Extra" w:hAnsi="BRH Malayalam Extra" w:cs="BRH Malayalam Extra"/>
+                <w:color w:val="000000"/>
+                <w:sz w:val="32"/>
+                <w:szCs w:val="40"/>
+              </w:rPr>
+              <w:t>)-  jx</w:t>
+            </w:r>
+            <w:r>
+              <w:rPr>
+                <w:rFonts w:ascii="BRH Malayalam Extra" w:hAnsi="BRH Malayalam Extra" w:cs="BRH Malayalam Extra"/>
+                <w:color w:val="000000"/>
+                <w:sz w:val="26"/>
+                <w:szCs w:val="40"/>
+              </w:rPr>
+              <w:t>–</w:t>
+            </w:r>
+            <w:r>
+              <w:rPr>
+                <w:rFonts w:ascii="BRH Malayalam Extra" w:hAnsi="BRH Malayalam Extra" w:cs="BRH Malayalam Extra"/>
+                <w:color w:val="000000"/>
+                <w:sz w:val="32"/>
+                <w:szCs w:val="40"/>
+              </w:rPr>
+              <w:t>Rõx˜ | B | G</w:t>
+            </w:r>
+            <w:r>
+              <w:rPr>
+                <w:rFonts w:ascii="BRH Malayalam Extra" w:hAnsi="BRH Malayalam Extra" w:cs="BRH Malayalam Extra"/>
+                <w:color w:val="000000"/>
+                <w:sz w:val="26"/>
+                <w:szCs w:val="40"/>
+              </w:rPr>
+              <w:t>–</w:t>
+            </w:r>
+            <w:r>
+              <w:rPr>
+                <w:rFonts w:ascii="BRH Malayalam Extra" w:hAnsi="BRH Malayalam Extra" w:cs="BRH Malayalam Extra"/>
+                <w:color w:val="000000"/>
+                <w:sz w:val="32"/>
+                <w:szCs w:val="40"/>
+              </w:rPr>
+              <w:t xml:space="preserve">p | </w:t>
+            </w:r>
+          </w:p>
+          <w:p>
+            <w:pPr>
+              <w:widowControl w:val="0"/>
+              <w:autoSpaceDE w:val="0"/>
+              <w:autoSpaceDN w:val="0"/>
+              <w:adjustRightInd w:val="0"/>
+              <w:spacing w:before="0" w:line="240" w:lineRule="auto"/>
+              <w:rPr>
+                <w:rFonts w:ascii="BRH Malayalam Extra" w:hAnsi="BRH Malayalam Extra" w:cs="BRH Malayalam Extra"/>
+                <w:color w:val="000000"/>
+                <w:sz w:val="32"/>
+                <w:szCs w:val="40"/>
+              </w:rPr>
+            </w:pPr>
+            <w:r>
+              <w:rPr>
+                <w:rFonts w:ascii="BRH Malayalam Extra" w:hAnsi="BRH Malayalam Extra" w:cs="BRH Malayalam Extra"/>
+                <w:color w:val="000000"/>
+                <w:sz w:val="32"/>
+                <w:szCs w:val="40"/>
+              </w:rPr>
               <w:t>jx</w:t>
             </w:r>
             <w:r>
@@ -3975,6 +3877,7 @@
           <w:szCs w:val="32"/>
           <w:u w:val="single"/>
         </w:rPr>
+        <w:lastRenderedPageBreak/>
         <w:t>===============</w:t>
       </w:r>
     </w:p>
@@ -5432,22 +5335,6 @@
                 <w:lang w:val="it-IT"/>
               </w:rPr>
             </w:pPr>
-          </w:p>
-          <w:p>
-            <w:pPr>
-              <w:widowControl w:val="0"/>
-              <w:autoSpaceDE w:val="0"/>
-              <w:autoSpaceDN w:val="0"/>
-              <w:adjustRightInd w:val="0"/>
-              <w:spacing w:before="0" w:line="240" w:lineRule="auto"/>
-              <w:rPr>
-                <w:rFonts w:ascii="BRH Malayalam Extra" w:hAnsi="BRH Malayalam Extra" w:cs="BRH Malayalam Extra"/>
-                <w:color w:val="000000"/>
-                <w:sz w:val="32"/>
-                <w:szCs w:val="40"/>
-                <w:lang w:val="it-IT"/>
-              </w:rPr>
-            </w:pPr>
             <w:r>
               <w:rPr>
                 <w:rFonts w:cs="BRH Malayalam Extra"/>
@@ -7709,22 +7596,6 @@
               </w:rPr>
               <w:t xml:space="preserve"> h—pZy | </w:t>
             </w:r>
-          </w:p>
-          <w:p>
-            <w:pPr>
-              <w:widowControl w:val="0"/>
-              <w:autoSpaceDE w:val="0"/>
-              <w:autoSpaceDN w:val="0"/>
-              <w:adjustRightInd w:val="0"/>
-              <w:spacing w:before="0" w:line="240" w:lineRule="auto"/>
-              <w:rPr>
-                <w:rFonts w:ascii="BRH Malayalam Extra" w:hAnsi="BRH Malayalam Extra" w:cs="BRH Malayalam Extra"/>
-                <w:color w:val="000000"/>
-                <w:sz w:val="32"/>
-                <w:szCs w:val="40"/>
-                <w:lang w:val="it-IT"/>
-              </w:rPr>
-            </w:pPr>
           </w:p>
           <w:p>
             <w:pPr>
@@ -8953,20 +8824,8 @@
                 <w:szCs w:val="40"/>
                 <w:lang w:val="en-IN"/>
               </w:rPr>
-              <w:t>)</w:t>
-            </w:r>
-            <w:proofErr w:type="gramStart"/>
-            <w:r>
-              <w:rPr>
-                <w:rFonts w:ascii="BRH Malayalam Extra" w:hAnsi="BRH Malayalam Extra" w:cs="BRH Malayalam Extra"/>
-                <w:color w:val="000000"/>
-                <w:sz w:val="32"/>
-                <w:szCs w:val="40"/>
-                <w:lang w:val="en-IN"/>
-              </w:rPr>
-              <w:t>-  A</w:t>
-            </w:r>
-            <w:proofErr w:type="gramEnd"/>
+              <w:t>)-  A</w:t>
+            </w:r>
             <w:r>
               <w:rPr>
                 <w:rFonts w:ascii="BRH Malayalam Extra" w:hAnsi="BRH Malayalam Extra" w:cs="BRH Malayalam Extra"/>
@@ -9387,19 +9246,8 @@
                 <w:szCs w:val="40"/>
                 <w:lang w:val="en-IN"/>
               </w:rPr>
-              <w:t>)</w:t>
-            </w:r>
-            <w:proofErr w:type="gramStart"/>
-            <w:r>
-              <w:rPr>
-                <w:rFonts w:ascii="BRH Malayalam Extra" w:hAnsi="BRH Malayalam Extra" w:cs="BRH Malayalam Extra"/>
-                <w:sz w:val="32"/>
-                <w:szCs w:val="40"/>
-                <w:lang w:val="en-IN"/>
-              </w:rPr>
-              <w:t>-  A</w:t>
-            </w:r>
-            <w:proofErr w:type="gramEnd"/>
+              <w:t>)-  A</w:t>
+            </w:r>
             <w:r>
               <w:rPr>
                 <w:rFonts w:ascii="BRH Malayalam Extra" w:hAnsi="BRH Malayalam Extra" w:cs="BRH Malayalam Extra"/>
@@ -9806,19 +9654,8 @@
                 <w:sz w:val="32"/>
                 <w:szCs w:val="40"/>
               </w:rPr>
-              <w:t>)</w:t>
-            </w:r>
-            <w:proofErr w:type="gramStart"/>
-            <w:r>
-              <w:rPr>
-                <w:rFonts w:ascii="BRH Malayalam Extra" w:hAnsi="BRH Malayalam Extra" w:cs="BRH Malayalam Extra"/>
-                <w:color w:val="000000"/>
-                <w:sz w:val="32"/>
-                <w:szCs w:val="40"/>
-              </w:rPr>
-              <w:t>-  hx</w:t>
-            </w:r>
-            <w:proofErr w:type="gramEnd"/>
+              <w:t>)-  hx</w:t>
+            </w:r>
             <w:r>
               <w:rPr>
                 <w:rFonts w:ascii="BRH Malayalam Extra" w:hAnsi="BRH Malayalam Extra" w:cs="BRH Malayalam Extra"/>
@@ -10304,27 +10141,7 @@
                 <w:sz w:val="32"/>
                 <w:szCs w:val="40"/>
               </w:rPr>
-              <w:t>)</w:t>
-            </w:r>
-            <w:proofErr w:type="gramStart"/>
-            <w:r>
-              <w:rPr>
-                <w:rFonts w:ascii="BRH Malayalam Extra" w:hAnsi="BRH Malayalam Extra" w:cs="BRH Malayalam Extra"/>
-                <w:color w:val="000000"/>
-                <w:sz w:val="32"/>
-                <w:szCs w:val="40"/>
-              </w:rPr>
-              <w:t>-  De</w:t>
-            </w:r>
-            <w:proofErr w:type="gramEnd"/>
-            <w:r>
-              <w:rPr>
-                <w:rFonts w:ascii="BRH Malayalam Extra" w:hAnsi="BRH Malayalam Extra" w:cs="BRH Malayalam Extra"/>
-                <w:color w:val="000000"/>
-                <w:sz w:val="32"/>
-                <w:szCs w:val="40"/>
-              </w:rPr>
-              <w:t xml:space="preserve">— | </w:t>
+              <w:t xml:space="preserve">)-  De— | </w:t>
             </w:r>
             <w:r>
               <w:rPr>
@@ -10721,17 +10538,7 @@
                 <w:sz w:val="32"/>
                 <w:szCs w:val="40"/>
               </w:rPr>
-              <w:t>)</w:t>
-            </w:r>
-            <w:proofErr w:type="gramStart"/>
-            <w:r>
-              <w:rPr>
-                <w:rFonts w:ascii="BRH Malayalam Extra" w:hAnsi="BRH Malayalam Extra" w:cs="BRH Malayalam Extra"/>
-                <w:color w:val="000000"/>
-                <w:sz w:val="32"/>
-                <w:szCs w:val="40"/>
-              </w:rPr>
-              <w:t xml:space="preserve">-  </w:t>
+              <w:t xml:space="preserve">)-  </w:t>
             </w:r>
             <w:r>
               <w:rPr>
@@ -10743,7 +10550,6 @@
               </w:rPr>
               <w:t>c</w:t>
             </w:r>
-            <w:proofErr w:type="gramEnd"/>
             <w:r>
               <w:rPr>
                 <w:rFonts w:ascii="BRH Malayalam Extra" w:hAnsi="BRH Malayalam Extra" w:cs="BRH Malayalam Extra"/>
@@ -11202,19 +11008,8 @@
                 <w:sz w:val="32"/>
                 <w:szCs w:val="40"/>
               </w:rPr>
-              <w:t>)</w:t>
-            </w:r>
-            <w:proofErr w:type="gramStart"/>
-            <w:r>
-              <w:rPr>
-                <w:rFonts w:ascii="BRH Malayalam Extra" w:hAnsi="BRH Malayalam Extra" w:cs="BRH Malayalam Extra"/>
-                <w:color w:val="000000"/>
-                <w:sz w:val="32"/>
-                <w:szCs w:val="40"/>
-              </w:rPr>
-              <w:t>-  hx</w:t>
-            </w:r>
-            <w:proofErr w:type="gramEnd"/>
+              <w:t>)-  hx</w:t>
+            </w:r>
             <w:r>
               <w:rPr>
                 <w:rFonts w:ascii="BRH Malayalam Extra" w:hAnsi="BRH Malayalam Extra" w:cs="BRH Malayalam Extra"/>
@@ -11735,27 +11530,7 @@
                 <w:sz w:val="32"/>
                 <w:szCs w:val="40"/>
               </w:rPr>
-              <w:t>)</w:t>
-            </w:r>
-            <w:proofErr w:type="gramStart"/>
-            <w:r>
-              <w:rPr>
-                <w:rFonts w:ascii="BRH Malayalam Extra" w:hAnsi="BRH Malayalam Extra" w:cs="BRH Malayalam Extra"/>
-                <w:color w:val="000000"/>
-                <w:sz w:val="32"/>
-                <w:szCs w:val="40"/>
-              </w:rPr>
-              <w:t>-  De</w:t>
-            </w:r>
-            <w:proofErr w:type="gramEnd"/>
-            <w:r>
-              <w:rPr>
-                <w:rFonts w:ascii="BRH Malayalam Extra" w:hAnsi="BRH Malayalam Extra" w:cs="BRH Malayalam Extra"/>
-                <w:color w:val="000000"/>
-                <w:sz w:val="32"/>
-                <w:szCs w:val="40"/>
-              </w:rPr>
-              <w:t xml:space="preserve">— | </w:t>
+              <w:t xml:space="preserve">)-  De— | </w:t>
             </w:r>
             <w:r>
               <w:rPr>
@@ -12163,17 +11938,7 @@
                 <w:sz w:val="32"/>
                 <w:szCs w:val="40"/>
               </w:rPr>
-              <w:t>)</w:t>
-            </w:r>
-            <w:proofErr w:type="gramStart"/>
-            <w:r>
-              <w:rPr>
-                <w:rFonts w:ascii="BRH Malayalam Extra" w:hAnsi="BRH Malayalam Extra" w:cs="BRH Malayalam Extra"/>
-                <w:color w:val="000000"/>
-                <w:sz w:val="32"/>
-                <w:szCs w:val="40"/>
-              </w:rPr>
-              <w:t xml:space="preserve">-  </w:t>
+              <w:t xml:space="preserve">)-  </w:t>
             </w:r>
             <w:r>
               <w:rPr>
@@ -12185,7 +11950,6 @@
               </w:rPr>
               <w:t>c</w:t>
             </w:r>
-            <w:proofErr w:type="gramEnd"/>
             <w:r>
               <w:rPr>
                 <w:rFonts w:ascii="BRH Malayalam Extra" w:hAnsi="BRH Malayalam Extra" w:cs="BRH Malayalam Extra"/>
@@ -12681,19 +12445,8 @@
                 <w:sz w:val="32"/>
                 <w:szCs w:val="40"/>
               </w:rPr>
-              <w:t>)</w:t>
-            </w:r>
-            <w:proofErr w:type="gramStart"/>
-            <w:r>
-              <w:rPr>
-                <w:rFonts w:ascii="BRH Malayalam Extra" w:hAnsi="BRH Malayalam Extra" w:cs="BRH Malayalam Extra"/>
-                <w:color w:val="000000"/>
-                <w:sz w:val="32"/>
-                <w:szCs w:val="40"/>
-              </w:rPr>
-              <w:t>-  A</w:t>
-            </w:r>
-            <w:proofErr w:type="gramEnd"/>
+              <w:t>)-  A</w:t>
+            </w:r>
             <w:r>
               <w:rPr>
                 <w:rFonts w:ascii="BRH Malayalam Extra" w:hAnsi="BRH Malayalam Extra" w:cs="BRH Malayalam Extra"/>
@@ -13122,27 +12875,7 @@
                 <w:sz w:val="32"/>
                 <w:szCs w:val="40"/>
               </w:rPr>
-              <w:t>)</w:t>
-            </w:r>
-            <w:proofErr w:type="gramStart"/>
-            <w:r>
-              <w:rPr>
-                <w:rFonts w:ascii="BRH Malayalam Extra" w:hAnsi="BRH Malayalam Extra" w:cs="BRH Malayalam Extra"/>
-                <w:color w:val="000000"/>
-                <w:sz w:val="32"/>
-                <w:szCs w:val="40"/>
-              </w:rPr>
-              <w:t>-  AZy</w:t>
-            </w:r>
-            <w:proofErr w:type="gramEnd"/>
-            <w:r>
-              <w:rPr>
-                <w:rFonts w:ascii="BRH Malayalam Extra" w:hAnsi="BRH Malayalam Extra" w:cs="BRH Malayalam Extra"/>
-                <w:color w:val="000000"/>
-                <w:sz w:val="32"/>
-                <w:szCs w:val="40"/>
-              </w:rPr>
-              <w:t>— | A</w:t>
+              <w:t>)-  AZy— | A</w:t>
             </w:r>
             <w:r>
               <w:rPr>
@@ -13527,19 +13260,8 @@
                 <w:sz w:val="32"/>
                 <w:szCs w:val="40"/>
               </w:rPr>
-              <w:t>)</w:t>
-            </w:r>
-            <w:proofErr w:type="gramStart"/>
-            <w:r>
-              <w:rPr>
-                <w:rFonts w:ascii="BRH Malayalam Extra" w:hAnsi="BRH Malayalam Extra" w:cs="BRH Malayalam Extra"/>
-                <w:color w:val="000000"/>
-                <w:sz w:val="32"/>
-                <w:szCs w:val="40"/>
-              </w:rPr>
-              <w:t>-  A</w:t>
-            </w:r>
-            <w:proofErr w:type="gramEnd"/>
+              <w:t>)-  A</w:t>
+            </w:r>
             <w:r>
               <w:rPr>
                 <w:rFonts w:ascii="BRH Malayalam Extra" w:hAnsi="BRH Malayalam Extra" w:cs="BRH Malayalam Extra"/>
@@ -14109,19 +13831,8 @@
                 <w:sz w:val="32"/>
                 <w:szCs w:val="40"/>
               </w:rPr>
-              <w:t>)</w:t>
-            </w:r>
-            <w:proofErr w:type="gramStart"/>
-            <w:r>
-              <w:rPr>
-                <w:rFonts w:ascii="BRH Malayalam Extra" w:hAnsi="BRH Malayalam Extra" w:cs="BRH Malayalam Extra"/>
-                <w:color w:val="000000"/>
-                <w:sz w:val="32"/>
-                <w:szCs w:val="40"/>
-              </w:rPr>
-              <w:t>-  A</w:t>
-            </w:r>
-            <w:proofErr w:type="gramEnd"/>
+              <w:t>)-  A</w:t>
+            </w:r>
             <w:r>
               <w:rPr>
                 <w:rFonts w:ascii="BRH Malayalam Extra" w:hAnsi="BRH Malayalam Extra" w:cs="BRH Malayalam Extra"/>
@@ -14541,27 +14252,7 @@
                 <w:sz w:val="32"/>
                 <w:szCs w:val="40"/>
               </w:rPr>
-              <w:t>)</w:t>
-            </w:r>
-            <w:proofErr w:type="gramStart"/>
-            <w:r>
-              <w:rPr>
-                <w:rFonts w:ascii="BRH Malayalam Extra" w:hAnsi="BRH Malayalam Extra" w:cs="BRH Malayalam Extra"/>
-                <w:color w:val="000000"/>
-                <w:sz w:val="32"/>
-                <w:szCs w:val="40"/>
-              </w:rPr>
-              <w:t>-  AZy</w:t>
-            </w:r>
-            <w:proofErr w:type="gramEnd"/>
-            <w:r>
-              <w:rPr>
-                <w:rFonts w:ascii="BRH Malayalam Extra" w:hAnsi="BRH Malayalam Extra" w:cs="BRH Malayalam Extra"/>
-                <w:color w:val="000000"/>
-                <w:sz w:val="32"/>
-                <w:szCs w:val="40"/>
-              </w:rPr>
-              <w:t>— | A</w:t>
+              <w:t>)-  AZy— | A</w:t>
             </w:r>
             <w:r>
               <w:rPr>
@@ -14946,19 +14637,8 @@
                 <w:sz w:val="32"/>
                 <w:szCs w:val="40"/>
               </w:rPr>
-              <w:t>)</w:t>
-            </w:r>
-            <w:proofErr w:type="gramStart"/>
-            <w:r>
-              <w:rPr>
-                <w:rFonts w:ascii="BRH Malayalam Extra" w:hAnsi="BRH Malayalam Extra" w:cs="BRH Malayalam Extra"/>
-                <w:color w:val="000000"/>
-                <w:sz w:val="32"/>
-                <w:szCs w:val="40"/>
-              </w:rPr>
-              <w:t>-  A</w:t>
-            </w:r>
-            <w:proofErr w:type="gramEnd"/>
+              <w:t>)-  A</w:t>
+            </w:r>
             <w:r>
               <w:rPr>
                 <w:rFonts w:ascii="BRH Malayalam Extra" w:hAnsi="BRH Malayalam Extra" w:cs="BRH Malayalam Extra"/>
@@ -15525,19 +15205,8 @@
                 <w:sz w:val="32"/>
                 <w:szCs w:val="40"/>
               </w:rPr>
-              <w:t>)</w:t>
-            </w:r>
-            <w:proofErr w:type="gramStart"/>
-            <w:r>
-              <w:rPr>
-                <w:rFonts w:ascii="BRH Malayalam Extra" w:hAnsi="BRH Malayalam Extra" w:cs="BRH Malayalam Extra"/>
-                <w:color w:val="000000"/>
-                <w:sz w:val="32"/>
-                <w:szCs w:val="40"/>
-              </w:rPr>
-              <w:t>-  A</w:t>
-            </w:r>
-            <w:proofErr w:type="gramEnd"/>
+              <w:t>)-  A</w:t>
+            </w:r>
             <w:r>
               <w:rPr>
                 <w:rFonts w:ascii="BRH Malayalam Extra" w:hAnsi="BRH Malayalam Extra" w:cs="BRH Malayalam Extra"/>
@@ -15874,19 +15543,8 @@
                 <w:sz w:val="32"/>
                 <w:szCs w:val="40"/>
               </w:rPr>
-              <w:t>)</w:t>
-            </w:r>
-            <w:proofErr w:type="gramStart"/>
-            <w:r>
-              <w:rPr>
-                <w:rFonts w:ascii="BRH Malayalam Extra" w:hAnsi="BRH Malayalam Extra" w:cs="BRH Malayalam Extra"/>
-                <w:color w:val="000000"/>
-                <w:sz w:val="32"/>
-                <w:szCs w:val="40"/>
-              </w:rPr>
-              <w:t>-  A</w:t>
-            </w:r>
-            <w:proofErr w:type="gramEnd"/>
+              <w:t>)-  A</w:t>
+            </w:r>
             <w:r>
               <w:rPr>
                 <w:rFonts w:ascii="BRH Malayalam Extra" w:hAnsi="BRH Malayalam Extra" w:cs="BRH Malayalam Extra"/>
@@ -16266,29 +15924,7 @@
                 <w:szCs w:val="40"/>
                 <w:lang w:val="en-IN"/>
               </w:rPr>
-              <w:t>)</w:t>
-            </w:r>
-            <w:proofErr w:type="gramStart"/>
-            <w:r>
-              <w:rPr>
-                <w:rFonts w:ascii="BRH Malayalam Extra" w:hAnsi="BRH Malayalam Extra" w:cs="BRH Malayalam Extra"/>
-                <w:color w:val="000000"/>
-                <w:sz w:val="32"/>
-                <w:szCs w:val="40"/>
-                <w:lang w:val="en-IN"/>
-              </w:rPr>
-              <w:t>-  öeZy</w:t>
-            </w:r>
-            <w:proofErr w:type="gramEnd"/>
-            <w:r>
-              <w:rPr>
-                <w:rFonts w:ascii="BRH Malayalam Extra" w:hAnsi="BRH Malayalam Extra" w:cs="BRH Malayalam Extra"/>
-                <w:color w:val="000000"/>
-                <w:sz w:val="32"/>
-                <w:szCs w:val="40"/>
-                <w:lang w:val="en-IN"/>
-              </w:rPr>
-              <w:t>— | s</w:t>
+              <w:t>)-  öeZy— | s</w:t>
             </w:r>
             <w:r>
               <w:rPr>
@@ -16777,19 +16413,8 @@
                 <w:sz w:val="32"/>
                 <w:szCs w:val="40"/>
               </w:rPr>
-              <w:t>)</w:t>
-            </w:r>
-            <w:proofErr w:type="gramStart"/>
-            <w:r>
-              <w:rPr>
-                <w:rFonts w:ascii="BRH Malayalam Extra" w:hAnsi="BRH Malayalam Extra" w:cs="BRH Malayalam Extra"/>
-                <w:color w:val="000000"/>
-                <w:sz w:val="32"/>
-                <w:szCs w:val="40"/>
-              </w:rPr>
-              <w:t>-  s</w:t>
-            </w:r>
-            <w:proofErr w:type="gramEnd"/>
+              <w:t>)-  s</w:t>
+            </w:r>
             <w:r>
               <w:rPr>
                 <w:rFonts w:ascii="BRH Malayalam Extra" w:hAnsi="BRH Malayalam Extra" w:cs="BRH Malayalam Extra"/>
@@ -17245,19 +16870,8 @@
                 <w:sz w:val="32"/>
                 <w:szCs w:val="40"/>
               </w:rPr>
-              <w:t>)</w:t>
-            </w:r>
-            <w:proofErr w:type="gramStart"/>
-            <w:r>
-              <w:rPr>
-                <w:rFonts w:ascii="BRH Malayalam Extra" w:hAnsi="BRH Malayalam Extra" w:cs="BRH Malayalam Extra"/>
-                <w:color w:val="000000"/>
-                <w:sz w:val="32"/>
-                <w:szCs w:val="40"/>
-              </w:rPr>
-              <w:t>-  s</w:t>
-            </w:r>
-            <w:proofErr w:type="gramEnd"/>
+              <w:t>)-  s</w:t>
+            </w:r>
             <w:r>
               <w:rPr>
                 <w:rFonts w:ascii="BRH Malayalam Extra" w:hAnsi="BRH Malayalam Extra" w:cs="BRH Malayalam Extra"/>
@@ -17553,29 +17167,7 @@
                 <w:szCs w:val="40"/>
                 <w:lang w:val="en-IN"/>
               </w:rPr>
-              <w:t>)</w:t>
-            </w:r>
-            <w:proofErr w:type="gramStart"/>
-            <w:r>
-              <w:rPr>
-                <w:rFonts w:ascii="BRH Malayalam Extra" w:hAnsi="BRH Malayalam Extra" w:cs="BRH Malayalam Extra"/>
-                <w:color w:val="000000"/>
-                <w:sz w:val="32"/>
-                <w:szCs w:val="40"/>
-                <w:lang w:val="en-IN"/>
-              </w:rPr>
-              <w:t>-  öeZy</w:t>
-            </w:r>
-            <w:proofErr w:type="gramEnd"/>
-            <w:r>
-              <w:rPr>
-                <w:rFonts w:ascii="BRH Malayalam Extra" w:hAnsi="BRH Malayalam Extra" w:cs="BRH Malayalam Extra"/>
-                <w:color w:val="000000"/>
-                <w:sz w:val="32"/>
-                <w:szCs w:val="40"/>
-                <w:lang w:val="en-IN"/>
-              </w:rPr>
-              <w:t>— | s</w:t>
+              <w:t>)-  öeZy— | s</w:t>
             </w:r>
             <w:r>
               <w:rPr>
@@ -18127,19 +17719,8 @@
                 <w:sz w:val="32"/>
                 <w:szCs w:val="40"/>
               </w:rPr>
-              <w:t>)</w:t>
-            </w:r>
-            <w:proofErr w:type="gramStart"/>
-            <w:r>
-              <w:rPr>
-                <w:rFonts w:ascii="BRH Malayalam Extra" w:hAnsi="BRH Malayalam Extra" w:cs="BRH Malayalam Extra"/>
-                <w:color w:val="000000"/>
-                <w:sz w:val="32"/>
-                <w:szCs w:val="40"/>
-              </w:rPr>
-              <w:t>-  s</w:t>
-            </w:r>
-            <w:proofErr w:type="gramEnd"/>
+              <w:t>)-  s</w:t>
+            </w:r>
             <w:r>
               <w:rPr>
                 <w:rFonts w:ascii="BRH Malayalam Extra" w:hAnsi="BRH Malayalam Extra" w:cs="BRH Malayalam Extra"/>
@@ -18649,19 +18230,8 @@
                 <w:sz w:val="32"/>
                 <w:szCs w:val="40"/>
               </w:rPr>
-              <w:t>)</w:t>
-            </w:r>
-            <w:proofErr w:type="gramStart"/>
-            <w:r>
-              <w:rPr>
-                <w:rFonts w:ascii="BRH Malayalam Extra" w:hAnsi="BRH Malayalam Extra" w:cs="BRH Malayalam Extra"/>
-                <w:color w:val="000000"/>
-                <w:sz w:val="32"/>
-                <w:szCs w:val="40"/>
-              </w:rPr>
-              <w:t>-  s</w:t>
-            </w:r>
-            <w:proofErr w:type="gramEnd"/>
+              <w:t>)-  s</w:t>
+            </w:r>
             <w:r>
               <w:rPr>
                 <w:rFonts w:ascii="BRH Malayalam Extra" w:hAnsi="BRH Malayalam Extra" w:cs="BRH Malayalam Extra"/>
@@ -20137,19 +19707,8 @@
                 <w:sz w:val="32"/>
                 <w:szCs w:val="40"/>
               </w:rPr>
-              <w:t>)</w:t>
-            </w:r>
-            <w:proofErr w:type="gramStart"/>
-            <w:r>
-              <w:rPr>
-                <w:rFonts w:ascii="BRH Malayalam Extra" w:hAnsi="BRH Malayalam Extra" w:cs="BRH Malayalam Extra"/>
-                <w:color w:val="000000"/>
-                <w:sz w:val="32"/>
-                <w:szCs w:val="40"/>
-              </w:rPr>
-              <w:t>-  A</w:t>
-            </w:r>
-            <w:proofErr w:type="gramEnd"/>
+              <w:t>)-  A</w:t>
+            </w:r>
             <w:r>
               <w:rPr>
                 <w:rFonts w:ascii="BRH Malayalam Extra" w:hAnsi="BRH Malayalam Extra" w:cs="BRH Malayalam Extra"/>
@@ -21890,19 +21449,8 @@
                 <w:sz w:val="32"/>
                 <w:szCs w:val="40"/>
               </w:rPr>
-              <w:t>)</w:t>
-            </w:r>
-            <w:proofErr w:type="gramStart"/>
-            <w:r>
-              <w:rPr>
-                <w:rFonts w:ascii="BRH Malayalam Extra" w:hAnsi="BRH Malayalam Extra" w:cs="BRH Malayalam Extra"/>
-                <w:color w:val="000000"/>
-                <w:sz w:val="32"/>
-                <w:szCs w:val="40"/>
-              </w:rPr>
-              <w:t>-  A</w:t>
-            </w:r>
-            <w:proofErr w:type="gramEnd"/>
+              <w:t>)-  A</w:t>
+            </w:r>
             <w:r>
               <w:rPr>
                 <w:rFonts w:ascii="BRH Malayalam Extra" w:hAnsi="BRH Malayalam Extra" w:cs="BRH Malayalam Extra"/>

</xml_diff>